<commit_message>
Clarify Ontology presenter scripts for a smart non-MD audience.
Rewrite read-aloud notes with English-first glosses, section bridges, and deferred T1–T3 labels while keeping the 26-slide deck order.

Co-authored-by: Cursor <cursoragent@cursor.com>
</commit_message>
<xml_diff>
--- a/Studies/The-Ontology-of-Coexistence/Presenters-Companion-Ontology-of-Existence.docx
+++ b/Studies/The-Ontology-of-Coexistence/Presenters-Companion-Ontology-of-Existence.docx
@@ -112,7 +112,16 @@
         <w:t>complete read-aloud script</w:t>
       </w:r>
       <w:r>
-        <w:t xml:space="preserve"> for live or video-conference delivery — speak it as written (or nearly so); it follows the slide’s visual order and is mirrored in the PowerPoint notes pane. “Primary-text background” is for pre-session study, not for reading aloud. “Likely questions” is for Q&amp;A preparation.</w:t>
+        <w:t xml:space="preserve"> for live or video-conference delivery, written for a smart audience with </w:t>
+      </w:r>
+      <w:r>
+        <w:rPr>
+          <w:b/>
+        </w:rPr>
+        <w:t>no prior Madhyasth Darshan or formal-philosophy background</w:t>
+      </w:r>
+      <w:r>
+        <w:t xml:space="preserve"> — English first, source terms second; speak it as written (or nearly so). It is mirrored in the PowerPoint notes pane. “Primary-text background” is for pre-session study, not for reading aloud. “Likely questions” is for Q&amp;A preparation.</w:t>
       </w:r>
     </w:p>
     <w:p>
@@ -188,27 +197,27 @@
     </w:p>
     <w:p>
       <w:r>
-        <w:t>Welcome, and thank you for joining this session.</w:t>
-      </w:r>
-    </w:p>
-    <w:p>
-      <w:r>
-        <w:t>Today we will study the ontology of existence as stated in Madhyasth Darshan, also called Co-existentialism, propounded by Shri A. Nagraj. The name itself carries a thesis: madhyasth means mediative. The darshan holds that reality is regulated and conserved through an inherent, mediative orderliness, not by an external governor.</w:t>
-      </w:r>
-    </w:p>
-    <w:p>
-      <w:r>
-        <w:t>This presentation follows Section 1 of the study The Ontology of Coexistence. It states the darshan’s ontology on its own terms, grounded in the primary texts — Madhyasth Darshan, Manav Karm Darshan, Samadhanatmak Bhautikvad, and Jeevan Vidya.</w:t>
-      </w:r>
-    </w:p>
-    <w:p>
-      <w:r>
-        <w:t>Here is the core claim I want you to hold for the whole session: existence is coexistence. It is the ever-present togetherness of a formless, all-pervasive ground — satta — and countless real, bounded units of nature, each saturated in that ground. You will see the slides use the translation’s word Omnipotence for that ground; in spoken explanation I will often say Omnipresence. Both names point to the same reality.</w:t>
-      </w:r>
-    </w:p>
-    <w:p>
-      <w:r>
-        <w:t>Everything that follows — sentience, values, justice, and humane society — unfolds from this one picture. The study is written from a scientist-technologist standpoint. Our aim is rigorous understanding: testing definitions and internal consistency — not persuasion, and not devotion.</w:t>
+        <w:t>Welcome, and thank you for joining.</w:t>
+      </w:r>
+    </w:p>
+    <w:p>
+      <w:r>
+        <w:t>You do not need any prior familiarity with Madhyasth Darshan, or with formal philosophy, to follow this session. I will use ordinary English first, and introduce source terms only when they help. Our aim is not persuasion or devotion. It is to examine one coherent account of reality — testing its definitions and internal consistency.</w:t>
+      </w:r>
+    </w:p>
+    <w:p>
+      <w:r>
+        <w:t>Madhyasth Darshan — also called Co-existentialism — was propounded by Shri A. Nagraj. The name points to a thesis we will unpack later: order in nature is mediative and inherent, not imposed by an external governor.</w:t>
+      </w:r>
+    </w:p>
+    <w:p>
+      <w:r>
+        <w:t>Here is the one claim to hold for the whole talk: existence is coexistence. Reality is the ever-present togetherness of a formless, all-pervasive ground and countless real, bounded units of nature, each saturated in that ground. Everything else — sentience, values, justice, society — unfolds from this picture.</w:t>
+      </w:r>
+    </w:p>
+    <w:p>
+      <w:r>
+        <w:t>The slides sometimes print Omnipotence for that ground; I will usually say Omnipresence. Same reality; different English labels in the translations.</w:t>
       </w:r>
     </w:p>
     <w:p>
@@ -393,32 +402,27 @@
     </w:p>
     <w:p>
       <w:r>
-        <w:t>Before we enter the details, here is the map of the argument.</w:t>
-      </w:r>
-    </w:p>
-    <w:p>
-      <w:r>
-        <w:t>One claim — existence is coexistence — will be carried through three movements.</w:t>
-      </w:r>
-    </w:p>
-    <w:p>
-      <w:r>
-        <w:t>First: what is real, and how it is ordered. Coexistence is the bond of an all-pervasive ground and countable units. Each definite unit bears form, properties or guna, essential nature or svabhav, and dharma. Their expression becomes evident in mutuality across four orders of nature.</w:t>
-      </w:r>
-    </w:p>
-    <w:p>
-      <w:r>
-        <w:t>Second: how two developmental lines proceed. One line is compositional: particles, atoms, molecules, cells, and bodies form larger configurations. The other is development in an atom, which can reach constitutional completeness as sentient jeevan. Across both lines, every activity is effort, motion, and result together.</w:t>
-      </w:r>
-    </w:p>
-    <w:p>
-      <w:r>
-        <w:t>Third: how sentient living becomes awakened conduct — the human joint form of body and jeevan, the faculties and activities of jeevan, the four harmonies, evaluation, realisation, and participation in humane order.</w:t>
-      </w:r>
-    </w:p>
-    <w:p>
-      <w:r>
-        <w:t>Please keep this distinction early: the body’s compositional line and jeevan’s atomic line meet in animal and human living, but they do not become the same process. That prevents the most common confusion — treating the body as the producer of sentience.</w:t>
+        <w:t>Before the details, here is the map of the argument. One claim — existence is coexistence — moves through three parts.</w:t>
+      </w:r>
+    </w:p>
+    <w:p>
+      <w:r>
+        <w:t>First: what is real, and how it is ordered. There is an all-pervasive ground and countable units. Each unit has a definite form, capacities, a way of participating among others, and an inseparable innateness. These show up in mutual relations across four orders of nature.</w:t>
+      </w:r>
+    </w:p>
+    <w:p>
+      <w:r>
+        <w:t>Second: how development proceeds along two lines that must not be collapsed. One line builds larger configurations — particles, molecules, cells, bodies. The other is development in an atom that can become a complete sentient unit. Across both, activity is effort, motion, and result together — not three separate steps.</w:t>
+      </w:r>
+    </w:p>
+    <w:p>
+      <w:r>
+        <w:t>Third: how sentient living becomes awakened conduct — the human as a joint form of body and sentient unit; evaluation; realisation; and participation in humane order.</w:t>
+      </w:r>
+    </w:p>
+    <w:p>
+      <w:r>
+        <w:t>Please keep one distinction early: the body line and the sentient-unit line meet in animal and human living, but they are not the same process. That blocks the most common confusion — treating the body as the producer of the knower.</w:t>
       </w:r>
     </w:p>
     <w:p>
@@ -503,7 +507,7 @@
     </w:p>
     <w:p>
       <w:r>
-        <w:t>Every serious ontology has to answer a small set of framing questions. Let us name them before we give Madhyasth Darshan’s answers.</w:t>
+        <w:t>Any serious account of reality has to face a small set of questions. Let us name them before we give this tradition’s answers.</w:t>
       </w:r>
     </w:p>
     <w:p>
@@ -513,37 +517,37 @@
     </w:p>
     <w:p>
       <w:r>
-        <w:t>What exists? What are the basic constituents of reality, and what is each of them?</w:t>
-      </w:r>
-    </w:p>
-    <w:p>
-      <w:r>
-        <w:t>Does what exists begin? Did reality originate at some time — or is origination only of configurations?</w:t>
-      </w:r>
-    </w:p>
-    <w:p>
-      <w:r>
-        <w:t>Does the self begin or end with the body? Is the individual self, jeevan, produced by the body and destroyed with it?</w:t>
-      </w:r>
-    </w:p>
-    <w:p>
-      <w:r>
-        <w:t>Is the world finally real? Is the plural world of units an appearance, or real in its own right?</w:t>
-      </w:r>
-    </w:p>
-    <w:p>
-      <w:r>
-        <w:t>And sixth: how can what exists be known? What must be understood — and at what scope — to know each aspect of reality?</w:t>
-      </w:r>
-    </w:p>
-    <w:p>
-      <w:r>
-        <w:t>Traditions diverge sharply on these questions — Advaita Vedanta, Western philosophy, and modern science among them. Madhyasth Darshan does not answer them piecemeal. One picture — coexistence — answers all six at once.</w:t>
-      </w:r>
-    </w:p>
-    <w:p>
-      <w:r>
-        <w:t>Later we will see how knowing widens on the epistemic ladder, where the drive terminates in realisation, and how method and evidence are distinguished. At the end we will return to this same list with the answers filled in.</w:t>
+        <w:t>What exists? What are the basic constituents, and what is each of them?</w:t>
+      </w:r>
+    </w:p>
+    <w:p>
+      <w:r>
+        <w:t>Does what exists begin? Did reality originate at some time — or do only configurations begin and end?</w:t>
+      </w:r>
+    </w:p>
+    <w:p>
+      <w:r>
+        <w:t>Does the self begin or end with the body?</w:t>
+      </w:r>
+    </w:p>
+    <w:p>
+      <w:r>
+        <w:t>Is the plural world finally real, or only an appearance?</w:t>
+      </w:r>
+    </w:p>
+    <w:p>
+      <w:r>
+        <w:t>And sixth: how can what exists be known — what must be understood, and at what scope?</w:t>
+      </w:r>
+    </w:p>
+    <w:p>
+      <w:r>
+        <w:t>Different traditions answer these differently. Madhyasth Darshan does not answer them with six separate doctrines. One picture — coexistence — is meant to answer all six at once.</w:t>
+      </w:r>
+    </w:p>
+    <w:p>
+      <w:r>
+        <w:t>We will return to this list at the end with the answers filled in. Along the way you will also see how knowing widens, where the developmental drive comes to rest, and how different kinds of evidence are kept distinct.</w:t>
       </w:r>
     </w:p>
     <w:p>
@@ -678,27 +682,27 @@
     </w:p>
     <w:p>
       <w:r>
-        <w:t>This conceptual map is the organising view of Section 1.</w:t>
-      </w:r>
-    </w:p>
-    <w:p>
-      <w:r>
-        <w:t>Begin at the top with coexistence: Omnipresence and countless units are inseparable, yet they do not lose their distinction. Then follow the unit side: four aspects, relationships, four orders, and two developmental lines.</w:t>
-      </w:r>
-    </w:p>
-    <w:p>
-      <w:r>
-        <w:t>Notice the fork. The body belongs to compositional progression. Jeevan is the result of development in an atom. The two meet in the animal and human joint form.</w:t>
-      </w:r>
-    </w:p>
-    <w:p>
-      <w:r>
-        <w:t>T1 marks the arrival of sentience. T2 and T3 concern awakening and conduct in jeevan — they are not further material stages.</w:t>
-      </w:r>
-    </w:p>
-    <w:p>
-      <w:r>
-        <w:t>When later slides feel dense, return mentally to this map. Most of what follows is a zoom into one node of this picture.</w:t>
+        <w:t>This map is the organising picture for what follows. You do not need to memorise every node. Use it as a place to return when later slides feel dense.</w:t>
+      </w:r>
+    </w:p>
+    <w:p>
+      <w:r>
+        <w:t>At the top: coexistence — the ground and countless units, inseparable without losing their distinction. Then, on the unit side: four aspects of every unit; relationships; four orders of nature; and two developmental lines.</w:t>
+      </w:r>
+    </w:p>
+    <w:p>
+      <w:r>
+        <w:t>Notice the fork. Bodies belong to compositional building. The sentient unit is the result of a different line — development in an atom. The two meet in animal and human living.</w:t>
+      </w:r>
+    </w:p>
+    <w:p>
+      <w:r>
+        <w:t>Later we will name three milestones on the sentient path: the arrival of sentience, then settlement of inner seeking, then authentic conduct. Those are not further material stages.</w:t>
+      </w:r>
+    </w:p>
+    <w:p>
+      <w:r>
+        <w:t>Most of the deck is a zoom into one region of this map.</w:t>
       </w:r>
     </w:p>
     <w:p>
@@ -774,32 +778,37 @@
     </w:p>
     <w:p>
       <w:r>
-        <w:t>This is the foundation.</w:t>
-      </w:r>
-    </w:p>
-    <w:p>
-      <w:r>
-        <w:t>Existence has two inseparable aspects. The first is Omnipresence — satta. It is formless, all-pervasive, non-transforming, and immeasurable. It is actionless energy. It performs no actions, yet every unit is energised, regulated, and conserved in it. There is no place where it is absent.</w:t>
-      </w:r>
-    </w:p>
-    <w:p>
-      <w:r>
-        <w:t>The second aspect is units of nature. They are formful, active, and countable. Each is bounded from six directions and saturated in Omnipresence. Each bears form, guna, svabhav, and dharma, whose expression is evident in definite mutuality.</w:t>
-      </w:r>
-    </w:p>
-    <w:p>
-      <w:r>
-        <w:t>Do not collapse levels. At the root, nature is analysed as atomic units — a centre with orbiting parts. Compounds and bodies are composite units. Body and jeevan together are a joint form. Families and societies are relational assemblies.</w:t>
-      </w:r>
-    </w:p>
-    <w:p>
-      <w:r>
-        <w:t>These two poles were never separate. Separation of a unit from the saturated whole never happens. The ground is state-complete — without motion, wave, or pressure. Nature saturated in it is state-dynamic. Therefore all change is unit-activity.</w:t>
-      </w:r>
-    </w:p>
-    <w:p>
-      <w:r>
-        <w:t>One caution on names. The texts list many English names for satta — Uniform Energy, Space, Knowledge, Consciousness, Omnipresence, Eternity, God, Absolute Energy. When you hear Knowledge or Consciousness in that list, do not hear a mind that knows. Active sentience belongs to jeevan, the sentient unit — never to the ground.</w:t>
+        <w:t>We now enter the foundations — what this account says exists.</w:t>
+      </w:r>
+    </w:p>
+    <w:p>
+      <w:r>
+        <w:t>Existence has two inseparable aspects.</w:t>
+      </w:r>
+    </w:p>
+    <w:p>
+      <w:r>
+        <w:t>First, the ground — Omnipresence. Formless, all-pervasive, non-transforming, immeasurable. Actionless energy: it performs no actions, yet every unit is energised, regulated, and conserved in it. There is no place where it is absent.</w:t>
+      </w:r>
+    </w:p>
+    <w:p>
+      <w:r>
+        <w:t>Second, units of nature. Formful, active, countable. Each is bounded and saturated in the ground. Each has form, capacities, a way of participating, and an inseparable innateness — we will walk those four shortly.</w:t>
+      </w:r>
+    </w:p>
+    <w:p>
+      <w:r>
+        <w:t>Do not collapse levels. At the root, nature is analysed as atomic units — a centre with orbiting parts. Compounds and bodies are composite units. Body and sentient unit together are a joint form. Families and societies are relational assemblies.</w:t>
+      </w:r>
+    </w:p>
+    <w:p>
+      <w:r>
+        <w:t>These two poles were never separate. Separation of a unit from the saturated whole never happens. The ground does not change. Nature saturated in it is dynamic. Therefore all change is unit-activity.</w:t>
+      </w:r>
+    </w:p>
+    <w:p>
+      <w:r>
+        <w:t>One naming caution. The texts list many English names for the ground — including Knowledge and Consciousness. Those names do not mean a mind that knows. Active knowing belongs to the sentient unit, never to the ground.</w:t>
       </w:r>
     </w:p>
     <w:p>
@@ -974,32 +983,32 @@
     </w:p>
     <w:p>
       <w:r>
-        <w:t>How exactly are ground and units related? Through saturation — samprikt.</w:t>
-      </w:r>
-    </w:p>
-    <w:p>
-      <w:r>
-        <w:t>Every formful unit is soaked, submerged, and surrounded in Omnipresence. From this ever-present bond, Madhyasth Darshan says three endowments are evident on the unit side.</w:t>
-      </w:r>
-    </w:p>
-    <w:p>
-      <w:r>
-        <w:t>First, recognition capability. Complementarity is given in coexistence; it is not created by us. In insentient nature, reflection, recognition, and fulfilment occur definitely through the unit’s capacity, ability, and receptivity. No human observer is required.</w:t>
-      </w:r>
-    </w:p>
-    <w:p>
-      <w:r>
-        <w:t>Second, activeness. The texts say: unit plus energy fullness equals activeness. Inherent energy and basic impulsion make the unit active, appearing as the inseparable triad of effort, motion, and result.</w:t>
-      </w:r>
-    </w:p>
-    <w:p>
-      <w:r>
-        <w:t>Third, inherent regulation — orderliness within the unit’s participation in coexistence: mediative and conserving, not an external statutory command.</w:t>
-      </w:r>
-    </w:p>
-    <w:p>
-      <w:r>
-        <w:t>Please hear the caution on the slide. This is an ontological entailment, not a proposed measurable transfer mechanism. And not every unit progresses to constitutional completeness. Omnipresence does not push units from outside.</w:t>
+        <w:t>How are ground and units related? Through saturation: every formful unit is soaked, submerged, and surrounded in Omnipresence.</w:t>
+      </w:r>
+    </w:p>
+    <w:p>
+      <w:r>
+        <w:t>From that ever-present bond, three endowments show on the unit side.</w:t>
+      </w:r>
+    </w:p>
+    <w:p>
+      <w:r>
+        <w:t>First, recognition capability. Complementarity is given in coexistence; it is not invented by us. Even in non-sentient nature, units respond to one another definitely — no human observer required.</w:t>
+      </w:r>
+    </w:p>
+    <w:p>
+      <w:r>
+        <w:t>Second, activeness. Unit plus energy fullness equals activeness. Inherent energy and basic impulsion appear as effort, motion, and result together.</w:t>
+      </w:r>
+    </w:p>
+    <w:p>
+      <w:r>
+        <w:t>Third, inherent regulation — orderliness from within participation in coexistence; mediative and conserving, not a statute from outside.</w:t>
+      </w:r>
+    </w:p>
+    <w:p>
+      <w:r>
+        <w:t>Please hear the caution: this is a claim about what existence is like, not a proposed laboratory transfer mechanism. And not every unit progresses to sentient completeness. The ground does not push units from outside.</w:t>
       </w:r>
     </w:p>
     <w:p>
@@ -1130,12 +1139,7 @@
     </w:p>
     <w:p>
       <w:r>
-        <w:t>What is every unit? Four inseparable aspects — but not a static checklist pasted onto things.</w:t>
-      </w:r>
-    </w:p>
-    <w:p>
-      <w:r>
-        <w:t>The bearer is definite: a bounded unit with constitution, state, order, and capacities.</w:t>
+        <w:t>What is every unit? Four inseparable aspects — not a static checklist pasted onto things, but how a definite bearer shows up in the world.</w:t>
       </w:r>
     </w:p>
     <w:p>
@@ -1145,27 +1149,27 @@
     </w:p>
     <w:p>
       <w:r>
-        <w:t>Properties — guna — are capacity and relative effect. In the peepal: nutrition, growth, repair, seed production, and degeneration become evident under definite conditions.</w:t>
-      </w:r>
-    </w:p>
-    <w:p>
-      <w:r>
-        <w:t>Essential nature — svabhav — is usefulness in context. For the peepal: vitalising while its living organisation is maintained; devitalising when that organisation breaks down.</w:t>
-      </w:r>
-    </w:p>
-    <w:p>
-      <w:r>
-        <w:t>Dharma is innateness and order-specific fulfilment. The peepal has existence plus growth. Seed-conformance is its mode of conduct, not an extra dharma piled on top.</w:t>
-      </w:r>
-    </w:p>
-    <w:p>
-      <w:r>
-        <w:t>Form is real; what another unit encounters is its definite reflection in mutual facing. In insentient nature these aspects are definite. Mis-evaluation arises only in human living, when jeevan under delusion takes the body to be the self.</w:t>
-      </w:r>
-    </w:p>
-    <w:p>
-      <w:r>
-        <w:t>And notice the persistence note: the tree as a composite form can die and decompose, while its constituent material units persist and enter other compositions. Persistence of existence is not persistence of one configuration.</w:t>
+        <w:t>Properties — capacities and relative effects. In the peepal: nutrition, growth, repair, seed production, degeneration under definite conditions.</w:t>
+      </w:r>
+    </w:p>
+    <w:p>
+      <w:r>
+        <w:t>Essential nature is usefulness in context: vitalising while the living organisation holds; devitalising when it breaks down.</w:t>
+      </w:r>
+    </w:p>
+    <w:p>
+      <w:r>
+        <w:t>Innateness — dharma in this technical sense — is what cannot be separated from the unit, plus order-specific fulfilment. For the peepal: existence plus growth. Seed-conformance is how it conducts itself, not an extra label piled on top.</w:t>
+      </w:r>
+    </w:p>
+    <w:p>
+      <w:r>
+        <w:t>Form is real; what another unit encounters is its definite presentation in mutual facing. In non-sentient nature these aspects are definite. Misreading arises mainly in human living, when the sentient unit mistakes the body for the self.</w:t>
+      </w:r>
+    </w:p>
+    <w:p>
+      <w:r>
+        <w:t>And notice: the tree as a composite can die while its material constituents persist. Persistence of existence is not persistence of one configuration.</w:t>
       </w:r>
     </w:p>
     <w:p>
@@ -1357,27 +1361,27 @@
     </w:p>
     <w:p>
       <w:r>
-        <w:t>Jeevan Vidya states the principle: nothing is isolated.</w:t>
-      </w:r>
-    </w:p>
-    <w:p>
-      <w:r>
-        <w:t>Existence holds relations between units, and it is in those relations that complementarity is actualised as value in mutuality. Expression is definite in the material, bio, and animal orders. At the human order, evaluation may err under body-identification.</w:t>
-      </w:r>
-    </w:p>
-    <w:p>
-      <w:r>
-        <w:t>Two kinds of mutuality matter. A relationship — sambandh — is mutuality whose expectations and fulfilment are definite in the relation’s completeness: parent and child. An association or contact — sampark — is mutuality where expectations are voluntary: neighbours who share a wall.</w:t>
-      </w:r>
-    </w:p>
-    <w:p>
-      <w:r>
-        <w:t>The slide names five value families: object, jeevan, human, relationship, and established or civic. Object values are utility and art. So the six named values are utility, art, jeevan, human, relationship, and established or civic.</w:t>
-      </w:r>
-    </w:p>
-    <w:p>
-      <w:r>
-        <w:t>At the human order the path runs: knowing, then believing, then recognising, then fulfilling. Awakening does not create new faculties. It aligns this chain with coexistence. Established and civic values articulate that fulfilment in society.</w:t>
+        <w:t>Nothing is isolated — that is the principle.</w:t>
+      </w:r>
+    </w:p>
+    <w:p>
+      <w:r>
+        <w:t>Existence holds relations between units, and in those relations complementarity becomes value in mutuality. In material, plant, and animal orders, recognition and fulfilment are definite. At the human order, evaluation can err when the body is mistaken for the self.</w:t>
+      </w:r>
+    </w:p>
+    <w:p>
+      <w:r>
+        <w:t>Two kinds of mutuality matter. A relationship is mutuality whose expectations are definite in the completeness of the bond — parent and child. An association or contact is mutuality where expectations are voluntary — neighbours who share a wall.</w:t>
+      </w:r>
+    </w:p>
+    <w:p>
+      <w:r>
+        <w:t>The slide groups values into families: object values such as utility and art; then values that presuppose sentient living — inner harmonies, human values, relationship values, and civic or established values.</w:t>
+      </w:r>
+    </w:p>
+    <w:p>
+      <w:r>
+        <w:t>At the human order the path runs: knowing, then believing, then recognising, then fulfilling. Awakening does not invent new faculties. It aligns this chain with coexistence.</w:t>
       </w:r>
     </w:p>
     <w:p>
@@ -1458,22 +1462,27 @@
     </w:p>
     <w:p>
       <w:r>
-        <w:t>Units organise into four stable orders of nature: material; bio or pranic; animal; and knowledge — the human order.</w:t>
-      </w:r>
-    </w:p>
-    <w:p>
-      <w:r>
-        <w:t>Read the table downward. Dharma is cumulative. Matter has existence. The bio order adds growth. The animal order adds hope to live. The knowledge order adds happiness. Higher orders include the dharmas of the lower ones.</w:t>
-      </w:r>
-    </w:p>
-    <w:p>
-      <w:r>
-        <w:t>The pivotal boundary is between the pranic and the animal. Material and pranic orders are insentient. Hope to live is where sentience enters. Jeevan is present in animal and human joint forms.</w:t>
-      </w:r>
-    </w:p>
-    <w:p>
-      <w:r>
-        <w:t>In animals, bodily and brain development limits how jeevan’s faculties can be expressed through the body. In humans, the bodily medium supports the full range, but delusion can misdirect evaluation. Neither body produces sentience. Please do not collapse either condition into a story of mind emerging from matter alone.</w:t>
+        <w:t>Units organise into four stable orders: material; bio or living-plant order; animal; and knowledge — the human order.</w:t>
+      </w:r>
+    </w:p>
+    <w:p>
+      <w:r>
+        <w:t>Read the table downward. Innateness is cumulative. Matter has existence. The bio order adds growth. The animal order adds hope to live. The human order adds happiness. Higher orders include the lower ones.</w:t>
+      </w:r>
+    </w:p>
+    <w:p>
+      <w:r>
+        <w:t>The pivotal boundary is between plant life and animal life. Material and bio orders are non-sentient. Hope to live is where sentience enters. The sentient unit is present in animal and human joint forms.</w:t>
+      </w:r>
+    </w:p>
+    <w:p>
+      <w:r>
+        <w:t>In animals, bodily and brain development limits how much of that unit’s range can be expressed. In humans, the bodily medium can support the full range, but confusion can still misdirect evaluation. Neither body produces sentience. Please do not collapse either case into “mind emerging from matter alone.”</w:t>
+      </w:r>
+    </w:p>
+    <w:p>
+      <w:r>
+        <w:t>We have now stated what exists and how it is ordered. Next: how development proceeds.</w:t>
       </w:r>
     </w:p>
     <w:p>
@@ -1617,22 +1626,22 @@
     </w:p>
     <w:p>
       <w:r>
-        <w:t>Compositional progression joins particles, atoms, molecules, cells, and bodies into larger configurations. Development in an atom can reach constitutional completeness as jeevan. These lines meet in living joint forms, but they remain distinct.</w:t>
-      </w:r>
-    </w:p>
-    <w:p>
-      <w:r>
-        <w:t>Across both, activity is one inseparable triad: effort, motion, and result. These are three joint aspects of one activity, not three steps in a sequence. When sodium and chlorine approach one another, the approach is effort and motion together; the stable salt crystal is the result.</w:t>
-      </w:r>
-    </w:p>
-    <w:p>
-      <w:r>
-        <w:t>The texts compress the engine of development this way: saturation itself is forcefulness; forcefulness is basic impulsion; impulsion is activity; activity is effort-motion-result; and that is development and its continuity.</w:t>
-      </w:r>
-    </w:p>
-    <w:p>
-      <w:r>
-        <w:t>Each term has a goal: restfulness of effort, destination of motion, immortality of result. Nature saturated in the ground is oriented for development and awakening until realisation. That bound is called an existential truth. Development pervades nature; awakening occurs in the sentient. Insentient units participate by composing bodies and environments without each individually completing the drive.</w:t>
+        <w:t>Compositional progression joins particles, atoms, molecules, cells, and bodies into larger configurations. Separately, development in an atom can reach constitutional completeness as a sentient unit. These lines meet in living joint forms, but they remain distinct.</w:t>
+      </w:r>
+    </w:p>
+    <w:p>
+      <w:r>
+        <w:t>Across both, activity is one inseparable triad: effort, motion, and result — three aspects of one activity, not three sequential steps. When sodium and chlorine approach, the approach is effort and motion together; the stable salt crystal is the result.</w:t>
+      </w:r>
+    </w:p>
+    <w:p>
+      <w:r>
+        <w:t>The texts compress the engine this way: saturation is forcefulness; forcefulness is basic impulsion; impulsion is activity; activity is effort-motion-result; and that is development.</w:t>
+      </w:r>
+    </w:p>
+    <w:p>
+      <w:r>
+        <w:t>Each term has a goal: restfulness of effort, destination of motion, immortality of result. Nature saturated in the ground is oriented for development and awakening until realisation. Development pervades nature; awakening occurs in the sentient. Non-sentient units participate by composing bodies and environments without each individually completing the drive.</w:t>
       </w:r>
     </w:p>
     <w:p>
@@ -1740,32 +1749,32 @@
     </w:p>
     <w:p>
       <w:r>
-        <w:t>The three transitions are developmental milestones.</w:t>
-      </w:r>
-    </w:p>
-    <w:p>
-      <w:r>
-        <w:t>T1 is constitutional completeness — gathanpurnata: immortality of result. A developing atom becomes sentient jeevan. The plane shifts from physicochemical to delusional — meaning the body is mistaken for the self, not psychiatric illness.</w:t>
-      </w:r>
-    </w:p>
-    <w:p>
-      <w:r>
-        <w:t>T2 is activity completeness — kriyapurnata: restfulness of effort. Internal seeking resolves into direct realisation and absolute resolution. The plane shifts from delusional to deific.</w:t>
-      </w:r>
-    </w:p>
-    <w:p>
-      <w:r>
-        <w:t>T3 is conduct completeness — acharanpurnata: destination of motion. Authentic conduct becomes living proof. The plane shifts from deific to divine.</w:t>
-      </w:r>
-    </w:p>
-    <w:p>
-      <w:r>
-        <w:t>Keep T2 and T3 apart. T2 is internal settlement of effort. T3 is external destination in conduct. And do not confuse T2’s restfulness with the ease of insentient natural-state complementarity.</w:t>
-      </w:r>
-    </w:p>
-    <w:p>
-      <w:r>
-        <w:t>T1 is constitutional completeness of an atom. T2 and T3 are not further material stages; they name completeness of activity and conduct in awakened jeevan. In one line: the saturated realises the ground it is saturated in. That is the completeness drive.</w:t>
+        <w:t>Now we name three milestones — T1, T2, and T3.</w:t>
+      </w:r>
+    </w:p>
+    <w:p>
+      <w:r>
+        <w:t>T1 is constitutional completeness: the immortality of result. A developing atom becomes a sentient unit — jeevan. Status shifts from physicochemical to what the texts call delusional — meaning the body is mistaken for the self. That is a stage label, not a psychiatric diagnosis.</w:t>
+      </w:r>
+    </w:p>
+    <w:p>
+      <w:r>
+        <w:t>T2 is activity completeness: restfulness of effort. Inner seeking settles into direct realisation and resolution. Status shifts toward awakened understanding.</w:t>
+      </w:r>
+    </w:p>
+    <w:p>
+      <w:r>
+        <w:t>T3 is conduct completeness: destination of motion. Understanding becomes authentic conduct — living proof.</w:t>
+      </w:r>
+    </w:p>
+    <w:p>
+      <w:r>
+        <w:t>Keep T2 and T3 apart. T2 is internal settlement. T3 is outer destination in conduct. And do not confuse T2’s restfulness with the ease of non-sentient natural complementarity.</w:t>
+      </w:r>
+    </w:p>
+    <w:p>
+      <w:r>
+        <w:t>T1 is completeness of an atom’s constitution. T2 and T3 are not further material stages; they name completeness of activity and conduct in the awakened sentient unit. In one line: the saturated realises the ground it is saturated in.</w:t>
       </w:r>
     </w:p>
     <w:p>
@@ -1873,32 +1882,17 @@
     </w:p>
     <w:p>
       <w:r>
-        <w:t>This slide is a confusion-preventer. Madhyasth Darshan uses several classifications that overlap without being interchangeable. Each answers a different question.</w:t>
-      </w:r>
-    </w:p>
-    <w:p>
-      <w:r>
-        <w:t>Orders — material, bio, animal, knowledge — classify organisation, svabhav, and dharma. Do not confuse orders with planes.</w:t>
-      </w:r>
-    </w:p>
-    <w:p>
-      <w:r>
-        <w:t>Progressions — physicochemical, delusional, deific, divine — track status across T1, T2, and T3. Do not confuse them with orders or planes.</w:t>
-      </w:r>
-    </w:p>
-    <w:p>
-      <w:r>
-        <w:t>Planes name scope of knowing and experience. They are not simply material stages.</w:t>
-      </w:r>
-    </w:p>
-    <w:p>
-      <w:r>
-        <w:t>Human types — animal, demon, human, divine, transcendental — mark orientation of human living. Do not confuse them with value families.</w:t>
-      </w:r>
-    </w:p>
-    <w:p>
-      <w:r>
-        <w:t>T1 separates the physicochemical from the sentient. T2 and T3 concern awakening and conduct. So if someone asks whether the human order is the same as the divine plane, the answer is no. One human order can span multiple planes.</w:t>
+        <w:t>One short caution, then we move on.</w:t>
+      </w:r>
+    </w:p>
+    <w:p>
+      <w:r>
+        <w:t>This tradition uses several overlapping lists — orders of nature, developmental statuses, scopes of knowing, and types of human orientation. They answer different questions. Do not equate them.</w:t>
+      </w:r>
+    </w:p>
+    <w:p>
+      <w:r>
+        <w:t>In particular: the human order is not the same thing as the highest developmental status. One human order can span more than one status. Sentience arrives at T1; awakening and conduct are T2 and T3.</w:t>
       </w:r>
     </w:p>
     <w:p>
@@ -2010,32 +2004,32 @@
     </w:p>
     <w:p>
       <w:r>
-        <w:t>T1 is the hinge of the ontology: where sentience enters.</w:t>
-      </w:r>
-    </w:p>
-    <w:p>
-      <w:r>
-        <w:t>It is constitutional completeness at the atomic level — not neural complexity, not molecular size, and not mere elevation along the order chain.</w:t>
-      </w:r>
-    </w:p>
-    <w:p>
-      <w:r>
-        <w:t>The texts describe a constitution-oriented developing atom that takes in particles — hungry and overfull atoms completing each other — within a suitable environment. When the required constitution closes, the particle count no longer increases or decreases.</w:t>
-      </w:r>
-    </w:p>
-    <w:p>
-      <w:r>
-        <w:t>Before T1, the evolving atom is still bound by molecular weight and structure; particle count is still changing; it exhibits radiance and projection as an insentient unit. After T1, it is released from molecular and weight bondage and carried by hope. Sentient jeevan shows a finer mode of recognition.</w:t>
-      </w:r>
-    </w:p>
-    <w:p>
-      <w:r>
-        <w:t>T1 is irreversible because the completed constitution no longer decomposes. That completed constitution grounds jeevan’s continuity beyond the body.</w:t>
-      </w:r>
-    </w:p>
-    <w:p>
-      <w:r>
-        <w:t>I want to be plain: this is an ontological account. No accepted empirical procedure currently identifies the threshold. We will return to that honesty when we discuss method and evidence.</w:t>
+        <w:t>T1 is the hinge: where sentience enters.</w:t>
+      </w:r>
+    </w:p>
+    <w:p>
+      <w:r>
+        <w:t>It is constitutional completeness at the atomic level — not neural complexity, not molecular size, and not merely climbing the order chain.</w:t>
+      </w:r>
+    </w:p>
+    <w:p>
+      <w:r>
+        <w:t>The texts describe a developing atom that incorporates particles — complementary “hungry” and “overfull” completions — in a suitable environment. When the required constitution closes, particle count no longer increases or decreases.</w:t>
+      </w:r>
+    </w:p>
+    <w:p>
+      <w:r>
+        <w:t>Before T1: still changing structure and particle count; non-sentient radiance and projection. After T1: released from molecular and weight bondage, carried by hope; a finer mode of recognition as the sentient unit.</w:t>
+      </w:r>
+    </w:p>
+    <w:p>
+      <w:r>
+        <w:t>T1 is irreversible because the completed constitution no longer decomposes. That is the textual basis for continuity of the knower beyond a particular body.</w:t>
+      </w:r>
+    </w:p>
+    <w:p>
+      <w:r>
+        <w:t>I want to be plain: this is an ontological account. No accepted empirical procedure currently identifies the threshold. We will return to that honesty under method and evidence.</w:t>
       </w:r>
     </w:p>
     <w:p>
@@ -2151,22 +2145,27 @@
     </w:p>
     <w:p>
       <w:r>
-        <w:t>Animal and human living is a joint form.</w:t>
-      </w:r>
-    </w:p>
-    <w:p>
-      <w:r>
-        <w:t>Jeevan brings all ten activities. The body supplies the species-specific medium. Animal bodily and brain development limits their expression. The human medium supports the full range, while body-identification can still misdirect evaluation.</w:t>
-      </w:r>
-    </w:p>
-    <w:p>
-      <w:r>
-        <w:t>On one side is the body: a pranic composition — sense organs, brain, and physical expression; decomposable. On the other side is jeevan: the constitutionally complete sentient atom; five faculties and ten activities inherent; continuing when the joint form ends.</w:t>
-      </w:r>
-    </w:p>
-    <w:p>
-      <w:r>
-        <w:t>The body gates expression. Jeevan is seer, doer, and enjoyer through the body. Animal limitation belongs to the medium. Human mis-evaluation belongs to body-delusion. The body does not produce sentience, and those two problems are not the same problem.</w:t>
+        <w:t>We now turn to human living — movement three.</w:t>
+      </w:r>
+    </w:p>
+    <w:p>
+      <w:r>
+        <w:t>Animal and human living is a joint form. The sentient unit brings the full set of faculties and activities. The body supplies the species-specific medium.</w:t>
+      </w:r>
+    </w:p>
+    <w:p>
+      <w:r>
+        <w:t>On one side: the body — living composition, sense organs, brain, physical expression; decomposable. On the other: the sentient unit — constitutionally complete; faculties inherent; continuing when the joint form ends.</w:t>
+      </w:r>
+    </w:p>
+    <w:p>
+      <w:r>
+        <w:t>Animal bodily development limits expression. The human medium can support the full range, while mistaking the body for the self can still misdirect evaluation.</w:t>
+      </w:r>
+    </w:p>
+    <w:p>
+      <w:r>
+        <w:t>The body gates expression. The sentient unit is seer, doer, and enjoyer through the body. Animal limitation belongs to the medium. Human mis-evaluation belongs to that confusion. The body does not produce sentience, and those two problems are not the same problem.</w:t>
       </w:r>
     </w:p>
     <w:p>
@@ -2251,27 +2250,27 @@
     </w:p>
     <w:p>
       <w:r>
-        <w:t>Jeevan is a constitutionally complete sentient atom.</w:t>
-      </w:r>
-    </w:p>
-    <w:p>
-      <w:r>
-        <w:t>Structurally, the nucleus is atma, the core self. The rings around it are buddhi, chitta, vritti, and mun — resolve, desire, thought, and hope.</w:t>
-      </w:r>
-    </w:p>
-    <w:p>
-      <w:r>
-        <w:t>Each faculty works outward in projection and inward in reflection. Hope selects outward and tastes inward. Thought analyses and deliberates. Desire visualises and contemplates. Resolve resolves and receives enlightenment. The core self authenticates and realises.</w:t>
-      </w:r>
-    </w:p>
-    <w:p>
-      <w:r>
-        <w:t>All five faculties and all ten activities belong to jeevan. Presence must be distinguished from expression and from effective organisation. Animal bodies limit expression through the medium. Humans have the bodily medium for the full range, yet under body-delusion only four and a half activities may be effectively organised.</w:t>
-      </w:r>
-    </w:p>
-    <w:p>
-      <w:r>
-        <w:t>Study brings understanding. Practice evidences and stabilises it. Practice does not manufacture faculties that were missing.</w:t>
+        <w:t>The sentient unit — jeevan — is a constitutionally complete atom.</w:t>
+      </w:r>
+    </w:p>
+    <w:p>
+      <w:r>
+        <w:t>Structurally, the centre is the core self. Around it: resolve, desire, thought, and hope — the texts’ buddhi, chitta, vritti, and mun.</w:t>
+      </w:r>
+    </w:p>
+    <w:p>
+      <w:r>
+        <w:t>Each works outward and inward. Hope selects and tastes. Thought analyses and deliberates. Desire visualises and contemplates. Resolve resolves and receives clear understanding. The core self authenticates and realises.</w:t>
+      </w:r>
+    </w:p>
+    <w:p>
+      <w:r>
+        <w:t>All five faculties and ten activities belong to the sentient unit. Presence is not the same as expression or effective organisation. Animal bodies limit expression. Humans have the medium for the full range, yet under body-confusion only part of that range may be effectively organised.</w:t>
+      </w:r>
+    </w:p>
+    <w:p>
+      <w:r>
+        <w:t>Study brings understanding. Practice tests and stabilises it. Practice does not manufacture faculties that were missing.</w:t>
       </w:r>
     </w:p>
     <w:p>
@@ -2392,27 +2391,27 @@
     </w:p>
     <w:p>
       <w:r>
-        <w:t>From Manav Karm Darshan, Chapter 1: the structure of karma.</w:t>
-      </w:r>
-    </w:p>
-    <w:p>
-      <w:r>
-        <w:t>Every karma — every activity done with desire — carries five limbs: doer, cause, objective, result, and effect. Effect names the act’s reach or consequence. The text does not add a separate cosmic reward-and-punishment ledger on this slide.</w:t>
-      </w:r>
-    </w:p>
-    <w:p>
-      <w:r>
-        <w:t>Desire is the aspiration. Karma is the doing — activity together with aspiration. Result is the fruit. Desire, karma, and result must balance for the desire to be truly accomplished.</w:t>
-      </w:r>
-    </w:p>
-    <w:p>
-      <w:r>
-        <w:t>Understanding alone changes nothing. It is the doing that yields the fruit. Book knowledge is only half the work.</w:t>
-      </w:r>
-    </w:p>
-    <w:p>
-      <w:r>
-        <w:t>Hold this beside the earlier triad of effort, motion, and result. Karma is the desire-laden framing of activity in sentient living. Later we will see how desire and doing are reorganised under justice, dharma, and truth.</w:t>
+        <w:t>A brief structural note on intentional activity — what this text calls karma. Please hear it in this technical sense, not as a popular cosmic reward-and-punishment story.</w:t>
+      </w:r>
+    </w:p>
+    <w:p>
+      <w:r>
+        <w:t>Every activity done with desire has five limbs: doer, cause, objective, result, and effect. Effect means the act’s reach or consequence — not a separate ledger of destiny on this slide.</w:t>
+      </w:r>
+    </w:p>
+    <w:p>
+      <w:r>
+        <w:t>Desire is the aspiration. Karma here is the doing — activity together with aspiration. Result is the fruit. Desire, doing, and result must balance for the desire to be truly accomplished.</w:t>
+      </w:r>
+    </w:p>
+    <w:p>
+      <w:r>
+        <w:t>Understanding alone changes nothing. Doing yields the fruit. Book knowledge is half the work.</w:t>
+      </w:r>
+    </w:p>
+    <w:p>
+      <w:r>
+        <w:t>Hold this beside the earlier triad of effort, motion, and result. This is the desire-laden framing of activity in sentient living. Later we will see how desire and doing are reorganised under justice, innateness, and truth.</w:t>
       </w:r>
     </w:p>
     <w:p>
@@ -2493,22 +2492,22 @@
     </w:p>
     <w:p>
       <w:r>
-        <w:t>Happiness, peace, contentment, and bliss are not passing moods, and they are not a fourth sequence after T1, T2, and T3.</w:t>
-      </w:r>
-    </w:p>
-    <w:p>
-      <w:r>
-        <w:t>They name harmonies within jeevan. Happiness is harmony of mun and vritti — hope and thought. Peace is harmony of vritti and chitta — thought and desire. Contentment is harmony of chitta and buddhi — desire and resolve. Bliss is harmony of buddhi and atma — resolve and the core self.</w:t>
-      </w:r>
-    </w:p>
-    <w:p>
-      <w:r>
-        <w:t>Evidenced outwardly, these harmonies support resolution, prosperity, fearlessness, and coexistence in human living.</w:t>
-      </w:r>
-    </w:p>
-    <w:p>
-      <w:r>
-        <w:t>Karm Darshan puts the living cycle this way: reflection feeds projection, and projection feeds deeper reflection — this alone is what living means. Continuous happiness is harmony evidenced in resolved living, not a sensory spike.</w:t>
+        <w:t>Happiness, peace, contentment, and bliss are not passing moods, and they are not a fourth milestone after T1, T2, and T3.</w:t>
+      </w:r>
+    </w:p>
+    <w:p>
+      <w:r>
+        <w:t>They name harmonies within the sentient unit. Happiness: harmony of hope and thought. Peace: thought and desire. Contentment: desire and resolve. Bliss: resolve and the core self.</w:t>
+      </w:r>
+    </w:p>
+    <w:p>
+      <w:r>
+        <w:t>Evidenced outwardly, these support resolution, prosperity, fearlessness, and coexistence in human living.</w:t>
+      </w:r>
+    </w:p>
+    <w:p>
+      <w:r>
+        <w:t>The living cycle is: reflection feeds projection, and projection feeds deeper reflection — that is what living means here. Continuous happiness is harmony evidenced in resolved living, not a sensory spike.</w:t>
       </w:r>
     </w:p>
     <w:p>
@@ -2593,7 +2592,7 @@
     </w:p>
     <w:p>
       <w:r>
-        <w:t>Composition is not the same as development.</w:t>
+        <w:t>Composition is not the same as the developmental line that produces sentience.</w:t>
       </w:r>
     </w:p>
     <w:p>
@@ -2603,12 +2602,12 @@
     </w:p>
     <w:p>
       <w:r>
-        <w:t>In a mixture, components stay side by side and each maintains its own conduct — no new unit is formed. In a compound, definite proportion yields a new bounded unit, and its form, guna, svabhav, and dharma are evidenced in that new unit’s mutuality.</w:t>
-      </w:r>
-    </w:p>
-    <w:p>
-      <w:r>
-        <w:t>Particles to molecules to cells and bodies is composition. Humane assemblies are relational achievements, not a further chemical tier. T1 occurs only when an atom reaches constitutional completeness. Insentient assemblies persist or decline according to whether constituent relationships are fulfilled.</w:t>
+        <w:t>In a mixture, components stay side by side — no new unit. In a compound, definite proportion yields a new bounded unit with its own form and capacities in mutuality.</w:t>
+      </w:r>
+    </w:p>
+    <w:p>
+      <w:r>
+        <w:t>Particles to molecules to cells and bodies is composition. Humane assemblies are relational achievements, not a further chemical tier. Sentience arrives only when an atom reaches constitutional completeness. Non-sentient assemblies persist or decline according to whether constituent relationships are fulfilled.</w:t>
       </w:r>
     </w:p>
     <w:p>
@@ -2684,22 +2683,22 @@
     </w:p>
     <w:p>
       <w:r>
-        <w:t>This slide explains the darshan’s name.</w:t>
-      </w:r>
-    </w:p>
-    <w:p>
-      <w:r>
-        <w:t>Orderliness is self-regulation, inherent in saturated units — not dispensed by a cosmic governor. This mediative — madhyasth — regulation, which regulates and conserves every unit, gives Madhyasth Darshan its name.</w:t>
-      </w:r>
-    </w:p>
-    <w:p>
-      <w:r>
-        <w:t>Conformance has order-specific modes. Material: result or structural conformance. Bio: seed-conformance. Animal: species-conformance, inherited from gestation. Human: learned conformance through understanding.</w:t>
-      </w:r>
-    </w:p>
-    <w:p>
-      <w:r>
-        <w:t>Material, bio, and animal regulation is definite. An animal body’s expressive limits do not introduce mis-evaluation. In human living, jeevan can judge wrongly when delusion mistakes the body for the self. Awakening aligns evaluation and fulfilment with coexistence. That is why justice becomes necessary at the knowledge order.</w:t>
+        <w:t>This slide explains the name Madhyasth.</w:t>
+      </w:r>
+    </w:p>
+    <w:p>
+      <w:r>
+        <w:t>Orderliness is self-regulation inherent in saturated units — not dispensed by a cosmic governor. That mediative regulation, which regulates and conserves every unit, gives the darshan its name.</w:t>
+      </w:r>
+    </w:p>
+    <w:p>
+      <w:r>
+        <w:t>Conformance has order-specific modes. Material: structural or result conformance. Bio: seed-conformance. Animal: species-conformance, inherited from gestation. Human: learned conformance through understanding.</w:t>
+      </w:r>
+    </w:p>
+    <w:p>
+      <w:r>
+        <w:t>Material, bio, and animal regulation is definite. An animal body’s expressive limits do not introduce evaluative error. In human living, the sentient unit can judge wrongly when it mistakes the body for the self. Awakening aligns evaluation with coexistence. That is why justice becomes necessary at the human order.</w:t>
       </w:r>
     </w:p>
     <w:p>
@@ -2785,12 +2784,12 @@
     </w:p>
     <w:p>
       <w:r>
-        <w:t>Karm Darshan names six evaluative perspectives: pleasant, healthy, profit, justice, dharma, and truth. They widen from sensation, body, and gain to relationship, orderliness, and coexistence.</w:t>
-      </w:r>
-    </w:p>
-    <w:p>
-      <w:r>
-        <w:t>Justice has a dual role: it is one of the six, and it is the principle of fulfilled relationship. Dharma here as an evaluative perspective means fitting the wider pattern — discipline in thought, not only in outer conduct. Truth means alignment with the whole, grounded in realisation, not in liking or gain.</w:t>
+        <w:t>Human evaluation widens across six perspectives: pleasant, healthy, profit, justice, innateness or dharma as an evaluative lens, and truth. They move from sensation, body, and gain to relationship, orderliness, and coexistence.</w:t>
+      </w:r>
+    </w:p>
+    <w:p>
+      <w:r>
+        <w:t>Justice is both one of the six and the principle of fulfilled relationship. Dharma here means fitting the wider pattern — discipline in thought, not only outer conduct. Truth means alignment with the whole, grounded in realisation, not in liking or gain.</w:t>
       </w:r>
     </w:p>
     <w:p>
@@ -2800,12 +2799,12 @@
     </w:p>
     <w:p>
       <w:r>
-        <w:t>Pleasure, health, and profit are not condemned. They remain legitimate in their domain. Awakening changes the organising refuge: they are subordinated under justice, dharma, and truth, not abandoned.</w:t>
-      </w:r>
-    </w:p>
-    <w:p>
-      <w:r>
-        <w:t>Keep this distinct from unit-dharma on the earlier slide. Unit-dharma is innateness. The dharma–adharma perspective is an evaluative lens on thought and resolution.</w:t>
+        <w:t>Pleasure, health, and profit are not condemned. They remain legitimate in their domain. Awakening changes the organising refuge: they are subordinated under justice, dharma, and truth — not abandoned.</w:t>
+      </w:r>
+    </w:p>
+    <w:p>
+      <w:r>
+        <w:t>Keep this distinct from unit-innateness earlier. One word, two levels: what a unit cannot be separated from, versus how we evaluate thought and resolution.</w:t>
       </w:r>
     </w:p>
     <w:p>
@@ -2890,22 +2889,22 @@
     </w:p>
     <w:p>
       <w:r>
-        <w:t>Here are two ladders that meet.</w:t>
-      </w:r>
-    </w:p>
-    <w:p>
-      <w:r>
-        <w:t>On the left: what must be understood, as mutual context widens. Form is real structure reflected in mutual facing. Guna is effects evident in definite mutuality. Svabhav is usefulness within state, plane, and order. Dharma is innateness evidenced in whole-order fulfilment. Relationships are shared expectations weighed by justice, dharma, and truth. At the top is coexistence itself — the telos of knowing. This is not a climb away from the unit; it is a widening of the context in which a real unit is understood.</w:t>
-      </w:r>
-    </w:p>
-    <w:p>
-      <w:r>
-        <w:t>On the right: how knowing happens within jeevan. Hope tastes and selects. Thought deliberates and analyses. Desire contemplates and visualises. Resolve receives enlightenment and resolves. The core self realises — and realisation takes place through truth. When each level is acted in alignment, it is felt as happiness, peace, contentment, and bliss.</w:t>
-      </w:r>
-    </w:p>
-    <w:p>
-      <w:r>
-        <w:t>The ladders meet at the top: coexistence known and acted in the core self is felt as bliss. Human error belongs to deluded evaluation, not to indeterminacy in the reality reflected.</w:t>
+        <w:t>We turn now to knowing — how understanding widens, and how it happens in the sentient unit.</w:t>
+      </w:r>
+    </w:p>
+    <w:p>
+      <w:r>
+        <w:t>On the left: what must be understood as mutual context widens. Form is real structure encountered in mutual facing. Capacities show as effects between units. Essential nature needs state, order, and context. Innateness is evidenced in whole-order fulfilment. Relationships are shared expectations weighed by justice, dharma, and truth. At the top is coexistence itself — not another observed detail, but the aim of knowing.</w:t>
+      </w:r>
+    </w:p>
+    <w:p>
+      <w:r>
+        <w:t>On the right: how knowing happens within the sentient unit. Hope tastes and selects. Thought deliberates. Desire contemplates. Resolve clarifies and resolves. The core self realises — through truth. When each level is acted in alignment, it is felt as happiness, peace, contentment, and bliss.</w:t>
+      </w:r>
+    </w:p>
+    <w:p>
+      <w:r>
+        <w:t>The ladders meet at the top: coexistence known and lived is felt as bliss. Human error belongs to confused evaluation, not to fuzziness in the reality reflected.</w:t>
       </w:r>
     </w:p>
     <w:p>
@@ -2999,32 +2998,32 @@
     </w:p>
     <w:p>
       <w:r>
-        <w:t>Madhyasth Darshan uses several modes of warrant. They can support one another, but they do not establish the same thing.</w:t>
-      </w:r>
-    </w:p>
-    <w:p>
-      <w:r>
-        <w:t>Logical exposition can establish internal coherence and entailment. It cannot by itself establish empirical truth.</w:t>
-      </w:r>
-    </w:p>
-    <w:p>
-      <w:r>
-        <w:t>Study and self-examination can establish intelligibility and first-person recognition. They cannot by themselves physically identify jeevan.</w:t>
-      </w:r>
-    </w:p>
-    <w:p>
-      <w:r>
-        <w:t>Experiment, practice, and conduct-evidence can establish effects in work, behaviour, and mutual satisfaction. They cannot by themselves measure T1 or the jeevan–body interface.</w:t>
-      </w:r>
-    </w:p>
-    <w:p>
-      <w:r>
-        <w:t>Realisation is the darshan’s claimed completion of knowing. It does not force agreement from other methods.</w:t>
-      </w:r>
-    </w:p>
-    <w:p>
-      <w:r>
-        <w:t>Publicly measurable physical claims remain answerable to instrument-based scientific inquiry. No accepted measurement procedure currently identifies T1, the jeevan–body interface, or post-body reassociation. Stating that plainly is part of responsible presentation.</w:t>
+        <w:t>Different methods establish different things. They can support one another, but they are not interchangeable.</w:t>
+      </w:r>
+    </w:p>
+    <w:p>
+      <w:r>
+        <w:t>Logical exposition can show internal coherence. It cannot by itself prove empirical fact.</w:t>
+      </w:r>
+    </w:p>
+    <w:p>
+      <w:r>
+        <w:t>Study and self-examination can show intelligibility and first-person recognition. They cannot by themselves physically identify the sentient unit.</w:t>
+      </w:r>
+    </w:p>
+    <w:p>
+      <w:r>
+        <w:t>Practice and conduct-evidence can show effects in work, behaviour, and mutual satisfaction. They cannot by themselves measure T1 or the unit–body interface.</w:t>
+      </w:r>
+    </w:p>
+    <w:p>
+      <w:r>
+        <w:t>Realisation is this tradition’s claimed completion of knowing. It does not force agreement from other methods.</w:t>
+      </w:r>
+    </w:p>
+    <w:p>
+      <w:r>
+        <w:t>Publicly measurable physical claims remain answerable to instrument-based science. No accepted measurement currently identifies T1, the unit–body interface, or post-body reassociation. Stating that plainly is part of responsible presentation.</w:t>
       </w:r>
     </w:p>
     <w:p>
@@ -3100,27 +3099,27 @@
     </w:p>
     <w:p>
       <w:r>
-        <w:t>Every jeevan bears the same five faculties and ten activities. In human living they answer one question — what makes me happy? — by organising in one of two ways.</w:t>
-      </w:r>
-    </w:p>
-    <w:p>
-      <w:r>
-        <w:t>Under delusion, body-identification leaves sensitivity unguided by cognisance. Selection and evaluation remain organised around pleasure, health, and profit.</w:t>
-      </w:r>
-    </w:p>
-    <w:p>
-      <w:r>
-        <w:t>Under awakening, cognisance regulates sensitivity. Knowing and believing guide recognition and fulfilment toward justice, dharma, truth, and coexistence.</w:t>
-      </w:r>
-    </w:p>
-    <w:p>
-      <w:r>
-        <w:t>No faculty is absent, and sensitivity is not rejected. Delusion lets sensory criteria rule; awakening balances sensitivity with cognisance, so understanding guides conduct.</w:t>
-      </w:r>
-    </w:p>
-    <w:p>
-      <w:r>
-        <w:t>When the same fork is resolved in the individual and sustained across a tradition, it is evidenced as resolution, prosperity, fearlessness, and coexistence.</w:t>
+        <w:t>Every sentient unit bears the same faculties. In human living they answer one practical question — what makes me happy? — by organising in one of two ways.</w:t>
+      </w:r>
+    </w:p>
+    <w:p>
+      <w:r>
+        <w:t>Under confusion, the body is mistaken for the self. Selection and evaluation organise around pleasure, health, and profit.</w:t>
+      </w:r>
+    </w:p>
+    <w:p>
+      <w:r>
+        <w:t>Under awakening, clear knowing regulates sensory life. Knowing and believing guide recognition and fulfilment toward justice, innateness, truth, and coexistence.</w:t>
+      </w:r>
+    </w:p>
+    <w:p>
+      <w:r>
+        <w:t>No faculty is missing, and sensation is not rejected. Confusion lets sensory criteria rule; awakening balances sensation with understanding, so understanding guides conduct.</w:t>
+      </w:r>
+    </w:p>
+    <w:p>
+      <w:r>
+        <w:t>When the same fork is resolved in a person and sustained across a tradition, it shows as resolution, prosperity, fearlessness, and coexistence.</w:t>
       </w:r>
     </w:p>
     <w:p>
@@ -3196,27 +3195,22 @@
     </w:p>
     <w:p>
       <w:r>
-        <w:t>This is where the completeness drive terminates: realisation in coexistence.</w:t>
-      </w:r>
-    </w:p>
-    <w:p>
-      <w:r>
-        <w:t>Realisation coordinates three distinct roles: jeevan remains the knower, existence as coexistence remains the known, and threefold knowledge becomes evident through humane conduct.</w:t>
-      </w:r>
-    </w:p>
-    <w:p>
-      <w:r>
-        <w:t>Realisation is bliss. Truth itself is abundance — coexistence; realisation of abundance itself is bliss; bliss itself is jeevan. And realisation is knowledge itself, because what is realised is the ground the unit was always soaked in.</w:t>
-      </w:r>
-    </w:p>
-    <w:p>
-      <w:r>
-        <w:t>Threefold knowledge comprises the holistic view of coexistence, knowledge of jeevan, and knowledge of humane conduct. Projection makes that understanding evident as authenticity.</w:t>
-      </w:r>
-    </w:p>
-    <w:p>
-      <w:r>
-        <w:t>Jeevan remains the knower and seer. Realisation clarifies its own nature and the coexistence in which it participates; it does not dissolve the individual unit. The known is existence as coexistence: Omnipresence and real units in mutuality. Knowledge, knower, and known become coherent without becoming identical. That guardrail is decisive against reading satta as a universal knowing Self.</w:t>
+        <w:t>This is where the developmental drive comes to rest: realisation in coexistence.</w:t>
+      </w:r>
+    </w:p>
+    <w:p>
+      <w:r>
+        <w:t>The drive settles when relationships across nature are fulfilled and made evident — not because the ground becomes a knower, but because the awakened sentient unit realises and evidences the coexistence in which it has always existed.</w:t>
+      </w:r>
+    </w:p>
+    <w:p>
+      <w:r>
+        <w:t>Realisation is bliss. Truth itself is abundance — coexistence; realisation of abundance is bliss; bliss is the living of the sentient unit. What is realised is the ground the unit was always saturated in.</w:t>
+      </w:r>
+    </w:p>
+    <w:p>
+      <w:r>
+        <w:t>Three roles stay distinct: the sentient unit remains the knower; existence as coexistence remains the known; knowledge becomes evident as authentic conduct. They become coherent without becoming identical. The individual knower is not dissolved into a single universal Self.</w:t>
       </w:r>
     </w:p>
     <w:p>
@@ -3333,27 +3327,27 @@
     </w:p>
     <w:p>
       <w:r>
-        <w:t>The drive toward completeness comes to rest in awakened human beings — effort settled, understanding proven in daily conduct, and sustained through a human tradition.</w:t>
-      </w:r>
-    </w:p>
-    <w:p>
-      <w:r>
-        <w:t>Effort settled in realisation is T2. Understanding proven in daily conduct is T3.</w:t>
-      </w:r>
-    </w:p>
-    <w:p>
-      <w:r>
-        <w:t>The four goals land at four levels: resolution in every person; prosperity in every family; fearlessness — trust — in society; and coexistence with all of nature.</w:t>
-      </w:r>
-    </w:p>
-    <w:p>
-      <w:r>
-        <w:t>Five dimensions of continuity carry the tradition: education and sanskar; justice and preservation; health and restraint; production and work; exchange and storage.</w:t>
-      </w:r>
-    </w:p>
-    <w:p>
-      <w:r>
-        <w:t>This is not an ideal bolted onto matter. On Madhyasth Darshan’s account, the ontology is such that the progression is designed to arrive here. Nature saturated in Omnipresence is bound for development until realisation. An awakened human tradition is what that progression delivers: what is saturated in the ground has come to realise the ground, and nature stands fulfilled and evident in coexistence.</w:t>
+        <w:t>The drive comes to rest in awakened human beings — effort settled, understanding proven in daily conduct, and carried as a tradition.</w:t>
+      </w:r>
+    </w:p>
+    <w:p>
+      <w:r>
+        <w:t>Effort settled in realisation is T2. Understanding proven in conduct is T3.</w:t>
+      </w:r>
+    </w:p>
+    <w:p>
+      <w:r>
+        <w:t>Four goals at four levels: resolution in every person; prosperity in every family; fearlessness — trust — in society; coexistence with all of nature.</w:t>
+      </w:r>
+    </w:p>
+    <w:p>
+      <w:r>
+        <w:t>Five dimensions of continuity carry the tradition: education and formative culture; justice and preservation; health and restraint; production and work; exchange and storage.</w:t>
+      </w:r>
+    </w:p>
+    <w:p>
+      <w:r>
+        <w:t>This is not an ideal bolted onto matter. On this account, the progression is designed to arrive here. Nature saturated in Omnipresence is bound for development until realisation. An awakened human tradition is what that progression delivers.</w:t>
       </w:r>
     </w:p>
     <w:p>
@@ -3438,7 +3432,7 @@
     </w:p>
     <w:p>
       <w:r>
-        <w:t>Let us close the loop and answer the six questions we opened with.</w:t>
+        <w:t>Let us close the loop on the six questions.</w:t>
       </w:r>
     </w:p>
     <w:p>
@@ -3448,7 +3442,7 @@
     </w:p>
     <w:p>
       <w:r>
-        <w:t>What exists? Root atomic units; composite units and bodies; body–jeevan joint forms; and relational human assemblies — all saturated in the ground.</w:t>
+        <w:t>What exists? Root atomic units; composite units and bodies; body–sentient-unit joint forms; and relational human assemblies — all saturated in the ground.</w:t>
       </w:r>
     </w:p>
     <w:p>
@@ -3458,7 +3452,7 @@
     </w:p>
     <w:p>
       <w:r>
-        <w:t>What is the self? Jeevan: a constitutionally complete sentient atom working through the body.</w:t>
+        <w:t>What is the self? The constitutionally complete sentient unit working through the body.</w:t>
       </w:r>
     </w:p>
     <w:p>
@@ -3468,17 +3462,12 @@
     </w:p>
     <w:p>
       <w:r>
-        <w:t>How is it known? Through logical exposition, study and self-examination, practice, realisation, and conduct-evidence. Measurable physical claims still require instrument-based testing. These evidence modes should not be conflated.</w:t>
-      </w:r>
-    </w:p>
-    <w:p>
-      <w:r>
-        <w:t>Fulfilment is resolution and authenticity expressed as humane conduct and participation in orderliness. The ultimate test is pramanikta — lived evidence.</w:t>
-      </w:r>
-    </w:p>
-    <w:p>
-      <w:r>
-        <w:t>If we continue in a companion session, the natural next step is to place this ontology beside Advaita Vedanta, modern philosophy, and modern science — including the open problems the study names for Madhyasth Darshan itself. Thank you.</w:t>
+        <w:t>How is it known? Through logical exposition, study and self-examination, practice, realisation, and conduct-evidence — without conflating those with instrument measurement of T1. The lived test is evidence in humane conduct.</w:t>
+      </w:r>
+    </w:p>
+    <w:p>
+      <w:r>
+        <w:t>If we continue later, the natural next step is comparison with other traditions and with science — including open problems this study names for Madhyasth Darshan itself. Thank you.</w:t>
       </w:r>
     </w:p>
     <w:p>

</xml_diff>

<commit_message>
Clarify ontology order progression in slide deck
</commit_message>
<xml_diff>
--- a/Studies/The-Ontology-of-Coexistence/Presenters-Companion-Ontology-of-Existence.docx
+++ b/Studies/The-Ontology-of-Coexistence/Presenters-Companion-Ontology-of-Existence.docx
@@ -2271,7 +2271,7 @@
     </w:p>
     <w:p>
       <w:r>
-        <w:t>The next slide shows why the composing line, however far it goes, never gets there on its own.</w:t>
+        <w:t>The next slide follows both paths through their convergence in animal and human living.</w:t>
       </w:r>
     </w:p>
     <w:p>
@@ -2367,7 +2367,7 @@
           <w:b/>
           <w:sz w:val="36"/>
         </w:rPr>
-        <w:t>Composition Never Exceeds Its Constituents</w:t>
+        <w:t>Two Paths Meet in the Animal Order</w:t>
       </w:r>
     </w:p>
     <w:p>
@@ -2380,41 +2380,95 @@
     </w:p>
     <w:p>
       <w:r>
-        <w:t>I have now told you twice that the composing line and the atomic line are different. This slide is where I owe you the reason.</w:t>
-      </w:r>
-    </w:p>
-    <w:p>
-      <w:r>
-        <w:t>Start with what is true, and notice it is complementarity doing the work: there is a natural inclination toward coexistence everywhere. That inclination is what leads particles into atoms, atoms into molecules, molecules into cells and bodies. It is real, and it builds a great deal.</w:t>
-      </w:r>
-    </w:p>
-    <w:p>
-      <w:r>
-        <w:t>Now the constraint. Whatever a thing is constituted of, it remains of the order of that constituent — however vast the formation. Three of the texts' own examples. Objects made from soil remain soil, no matter how elaborate the object. A body built from living cells remains of the order of the living cell. And the Earth entire is of the order of the atoms, molecules, and cells composing it.</w:t>
-      </w:r>
-    </w:p>
-    <w:p>
-      <w:r>
-        <w:t xml:space="preserve">So change of composition is recognised as development or decline </w:t>
+        <w:t>The completeness drive unfolds along two parallel paths.</w:t>
+      </w:r>
+    </w:p>
+    <w:p>
+      <w:r>
+        <w:t xml:space="preserve">The first is the compositional path, </w:t>
       </w:r>
       <w:r>
         <w:rPr>
           <w:i/>
         </w:rPr>
-        <w:t>within</w:t>
-      </w:r>
-      <w:r>
-        <w:t xml:space="preserve"> an order. It is never passage beyond the order. Compositional progression can give you an atom, then a molecule, then a cell, then a body of extraordinary complexity — and every one of those is still of the order of what it is made from.</w:t>
-      </w:r>
-    </w:p>
-    <w:p>
-      <w:r>
-        <w:t>That is the argument. Composition supplies bodies and environments, and it never reaches constitutional completeness, because reaching it would mean exceeding the order of your own constituents. Which is exactly why development in the atom has to be kept as a separate line.</w:t>
-      </w:r>
-    </w:p>
-    <w:p>
-      <w:r>
-        <w:t>Two smaller distinctions while we are here. In a mixture, components stay side by side and each keeps its own conduct — no new unit is formed. In a compound, definite proportion yields a genuinely new bounded unit, with its own form and its own capacities in mutuality. A compound is a real new unit; it is still not a step toward sentience.</w:t>
+        <w:t>rachna</w:t>
+      </w:r>
+      <w:r>
+        <w:t>. Atoms and molecules form material-order structures. Under appropriate chemical and environmental conditions, pranic cells and biological formations appear. This is the material-to-biological order change, and both orders remain insentient.</w:t>
+      </w:r>
+    </w:p>
+    <w:p>
+      <w:r>
+        <w:t xml:space="preserve">The second is the atomic path, </w:t>
+      </w:r>
+      <w:r>
+        <w:rPr>
+          <w:i/>
+        </w:rPr>
+        <w:t>gathan</w:t>
+      </w:r>
+      <w:r>
+        <w:t xml:space="preserve">. A developing atom integrates the particle constitution required for completeness. At constitutional completeness, the texts classify that atom as sentient </w:t>
+      </w:r>
+      <w:r>
+        <w:rPr>
+          <w:i/>
+        </w:rPr>
+        <w:t>jeevan</w:t>
+      </w:r>
+      <w:r>
+        <w:t>.</w:t>
+      </w:r>
+    </w:p>
+    <w:p>
+      <w:r>
+        <w:t xml:space="preserve">The two paths meet in the animal order as a joint form: a biological body plus sentient </w:t>
+      </w:r>
+      <w:r>
+        <w:rPr>
+          <w:i/>
+        </w:rPr>
+        <w:t>jeevan</w:t>
+      </w:r>
+      <w:r>
+        <w:t>. One does not manufacture the other; they work together.</w:t>
+      </w:r>
+    </w:p>
+    <w:p>
+      <w:r>
+        <w:t xml:space="preserve">Development then continues along both aspects of the joint form. Bodily lineages develop through species-conforming biological organisation, while </w:t>
+      </w:r>
+      <w:r>
+        <w:rPr>
+          <w:i/>
+        </w:rPr>
+        <w:t>jeevan</w:t>
+      </w:r>
+      <w:r>
+        <w:t>’s expression widens through those bodily media. In the animal order that expression remains limited by the body.</w:t>
+      </w:r>
+    </w:p>
+    <w:p>
+      <w:r>
+        <w:t xml:space="preserve">The human body, in the knowledge order, is described as capable of evidencing all ten activities of </w:t>
+      </w:r>
+      <w:r>
+        <w:rPr>
+          <w:i/>
+        </w:rPr>
+        <w:t>jeevan</w:t>
+      </w:r>
+      <w:r>
+        <w:t xml:space="preserve">. That does not mean the body owns those activities. It means the bodily medium is adequate for their expression. Once that capacity is present, the remaining development is awakening in </w:t>
+      </w:r>
+      <w:r>
+        <w:rPr>
+          <w:i/>
+        </w:rPr>
+        <w:t>jeevan</w:t>
+      </w:r>
+      <w:r>
+        <w:t>, evidenced through understanding and conduct.</w:t>
       </w:r>
     </w:p>
     <w:p>
@@ -2427,17 +2481,44 @@
     </w:p>
     <w:p>
       <w:r>
-        <w:t>“Whatever a basic entity is constituted of, it remains equal to that basic entity.” — SB, p. 260, with the soil example and “Change alone is recognised as development or decline” on the same page. The human body as of the order of the pranic cell: SB, p. 262; restated for formations however vast: SB, p. 264; the Earth entire as of the order of its constituent atoms, molecules, and cells: SB, p. 265.</w:t>
-      </w:r>
-    </w:p>
-    <w:p>
-      <w:r>
-        <w:t>JV, p. 67 (inclination toward coexistence); MVD, p. 42 (mixture &amp; compound); SB, p. 14 (persist or decline). Compositional vs atomic development: study §1.6, §1.10.</w:t>
-      </w:r>
-    </w:p>
-    <w:p>
-      <w:r>
-        <w:t>Note for the presenter: this slide sits before the transitions deliberately. In the earlier running order it came nine slides later, so the deck asserted the two-line fork three times before justifying it.</w:t>
+        <w:t>MVD, p. 13 traces chemical and physical composition into biological cells and bodily formations. MVD, p. 26 distinguishes the constitutional-completeness path from compositional formation and identifies human beings as joint forms of insentient and sentient nature.</w:t>
+      </w:r>
+    </w:p>
+    <w:p>
+      <w:r>
+        <w:t xml:space="preserve">MVD, p. 79 gives the developmental sequence used on the slide. Animal-order bodies are composed of biological cells while the sentient atom advances toward fuller expression. Knowledge-order bodies remain biological compositions, but the human body is capable of evidencing all ten activities of </w:t>
+      </w:r>
+      <w:r>
+        <w:rPr>
+          <w:i/>
+        </w:rPr>
+        <w:t>jeevan</w:t>
+      </w:r>
+      <w:r>
+        <w:t xml:space="preserve">. The activities belong to </w:t>
+      </w:r>
+      <w:r>
+        <w:rPr>
+          <w:i/>
+        </w:rPr>
+        <w:t>jeevan</w:t>
+      </w:r>
+      <w:r>
+        <w:t xml:space="preserve">; bodily organisation supplies the medium of expression. MVD, p. 80 restates the categorical distinction: the body is physicochemical composition, while </w:t>
+      </w:r>
+      <w:r>
+        <w:rPr>
+          <w:i/>
+        </w:rPr>
+        <w:t>jeevan</w:t>
+      </w:r>
+      <w:r>
+        <w:t xml:space="preserve"> is the constitutionally complete sentient atom.</w:t>
+      </w:r>
+    </w:p>
+    <w:p>
+      <w:r>
+        <w:t>SB, p. 55 places constitutional completeness in the atom; SB, pp. 76–77 classify material and biological compositions as insentient and animal and knowledge orders as joint expressions. Study §§1.5–1.6, 1.9.</w:t>
       </w:r>
     </w:p>
     <w:p>
@@ -2451,14 +2532,33 @@
     <w:p>
       <w:r>
         <w:rPr>
-          <w:b/>
+          <w:i/>
         </w:rPr>
-        <w:t>Q: Doesn't this contradict emergence? Complex systems do acquire new properties.</w:t>
-      </w:r>
-    </w:p>
-    <w:p>
-      <w:r>
-        <w:t>MD grants that composition establishes new bounded units with new conduct — a compound is not its ingredients. What it denies is that composing ever moves a thing out of the order of its constituents, and specifically that it produces sentience. Whether that denial can be sustained against emergentist accounts is a live comparison, taken up in §3.3 and §6.2.</w:t>
+      </w:r>
+      <w:r>
+        <w:rPr>
+          <w:i/>
+        </w:rPr>
+        <w:t xml:space="preserve">Q: Does development really continue in both body and </w:t>
+      </w:r>
+      <w:r>
+        <w:t>jeevan</w:t>
+      </w:r>
+      <w:r>
+        <w:rPr>
+          <w:i/>
+        </w:rPr>
+        <w:t xml:space="preserve"> in the animal order?</w:t>
+      </w:r>
+      <w:r>
+        <w:rPr>
+          <w:i/>
+        </w:rPr>
+      </w:r>
+    </w:p>
+    <w:p>
+      <w:r>
+        <w:t>Yes, but in different senses. Bodily development is development of species-conforming biological media and lineages. The sentient side advances toward wider expression through those media. The distinction between composition and awakening remains intact.</w:t>
       </w:r>
     </w:p>
     <w:p>
@@ -2466,12 +2566,21 @@
         <w:rPr>
           <w:b/>
         </w:rPr>
-        <w:t>Q: Can composition produce jeevan?</w:t>
-      </w:r>
-    </w:p>
-    <w:p>
-      <w:r>
-        <w:t>No. Composition builds media and environments; T1 is atomic constitutional completeness, and it is reached in the atom or not at all.</w:t>
+        <w:t>Q: Does the human body possess all ten activities?</w:t>
+      </w:r>
+    </w:p>
+    <w:p>
+      <w:r>
+        <w:t xml:space="preserve">No. MVD says that the human body is capable of evidencing all ten activities. The activities belong to </w:t>
+      </w:r>
+      <w:r>
+        <w:rPr>
+          <w:i/>
+        </w:rPr>
+        <w:t>jeevan</w:t>
+      </w:r>
+      <w:r>
+        <w:t>; the body is their adequate medium of expression.</w:t>
       </w:r>
     </w:p>
     <w:p>
@@ -2479,12 +2588,43 @@
         <w:rPr>
           <w:b/>
         </w:rPr>
-        <w:t>Q: Is society just a bigger compound?</w:t>
-      </w:r>
-    </w:p>
-    <w:p>
-      <w:r>
-        <w:t>No — human families and societies are relational achievements, not a further compositional tier. They persist humanely while relationships are recognised, values fulfilled, and mutual satisfaction achieved. That half of §1.10 returns on slide 26.</w:t>
+        <w:t>Q: Are the two paths fused when they meet?</w:t>
+      </w:r>
+    </w:p>
+    <w:p>
+      <w:r>
+        <w:t xml:space="preserve">No. Animal and human living are joint forms. The biological body remains decomposable, while </w:t>
+      </w:r>
+      <w:r>
+        <w:rPr>
+          <w:i/>
+        </w:rPr>
+        <w:t>jeevan</w:t>
+      </w:r>
+      <w:r>
+        <w:t xml:space="preserve"> is treated as the constitutionally complete sentient unit.</w:t>
+      </w:r>
+    </w:p>
+    <w:p>
+      <w:r>
+        <w:rPr>
+          <w:b/>
+        </w:rPr>
+        <w:t>Q: Why call the animal order the point of meeting?</w:t>
+      </w:r>
+    </w:p>
+    <w:p>
+      <w:r>
+        <w:t xml:space="preserve">Because it is the first order described as requiring a joint expression of a biological body and a sentient unit. The material-to-biological transition occurs on the compositional path; the animal order brings that bodily formation into conjunction with </w:t>
+      </w:r>
+      <w:r>
+        <w:rPr>
+          <w:i/>
+        </w:rPr>
+        <w:t>jeevan</w:t>
+      </w:r>
+      <w:r>
+        <w:t>.</w:t>
       </w:r>
     </w:p>
     <w:p>
@@ -2885,7 +3025,7 @@
           <w:b/>
           <w:sz w:val="36"/>
         </w:rPr>
-        <w:t>T1 — The Irreversible Sentience Threshold</w:t>
+        <w:t>Sentience — The Constitutional Threshold</w:t>
       </w:r>
     </w:p>
     <w:p>
@@ -2898,50 +3038,22 @@
     </w:p>
     <w:p>
       <w:r>
-        <w:t>T1 is the hinge: where sentience enters.</w:t>
-      </w:r>
-    </w:p>
-    <w:p>
-      <w:r>
-        <w:t>It is constitutional completeness at the atomic level — not neural complexity, not molecular size, and not merely climbing the order chain.</w:t>
-      </w:r>
-    </w:p>
-    <w:p>
-      <w:r>
-        <w:t>And complementarity is doing the work here too, which is worth saying out loud because it is the same principle as the composing line, not a different mechanism. The texts describe a developing atom that incorporates particles — “hungry” atoms and “overfull” atoms completing each other — in a suitable environment. Two incompletenesses fulfil one another. When the required constitution closes, particle count no longer increases or decreases.</w:t>
-      </w:r>
-    </w:p>
-    <w:p>
-      <w:r>
-        <w:t>Here is the criterion, and it is sharper than it first looks. In matter, qualitative change does not happen without quantitative change: an atom's kind and capacity track its particle number. Change what it can do and you have changed how many particles it has. Those two kinds of change are tied together — right up to completeness. Completeness is where they come apart. After it, qualitative activity continues while the particle count is fixed. That separation is the criterion.</w:t>
-      </w:r>
-    </w:p>
-    <w:p>
-      <w:r>
-        <w:t>So: before T1, still changing structure and particle count; non-sentient radiance and projection. After T1, released from molecular and weight bondage, carried by hope; qualitative change without quantitative change; a finer mode of recognition as the sentient unit.</w:t>
-      </w:r>
-    </w:p>
-    <w:p>
-      <w:r>
-        <w:t>T1 is irreversible because the completed constitution no longer decomposes. That is also the textual basis for continuity of the knower beyond a particular body — the constitution has closed, so the death of a body is not the end of the sentient unit. JV goes further and describes its subsequent association with another body. I will flag now what I will repeat under method and evidence: these are claims of the primary texts, grounded in constitutional completeness, and no accepted procedure measures any of it.</w:t>
-      </w:r>
-    </w:p>
-    <w:p>
-      <w:r>
-        <w:t>I want to be plain: this is an ontological account. No accepted empirical procedure currently identifies the threshold. We will return to that honesty under method and evidence.</w:t>
-      </w:r>
-    </w:p>
-    <w:p>
-      <w:pPr>
-        <w:pStyle w:val="Heading2"/>
-      </w:pPr>
-      <w:r>
-        <w:t>Primary-text background</w:t>
-      </w:r>
-    </w:p>
-    <w:p>
-      <w:r>
-        <w:t xml:space="preserve">MVD, p. 91 (bondage shift). Closed particle constitution: SB, p. 55. Qualitative change tied to quantitative change in matter, and the separation of the two at completeness: SB, p. 86 — this is the criterion stated in the script. Irreversibility: SB, p. 92. Not neural/molecular size: SB, p. 52. Particle incorporation: MVD, p. 8; SB, pp. 58, 71, 80–81. AVD on hope-bondage and powers/strengths always present in </w:t>
+        <w:t>This is the claimed sentience threshold. The technical transitions slide names it T1; here the audience-facing question is how the texts say sentience enters.</w:t>
+      </w:r>
+    </w:p>
+    <w:p>
+      <w:r>
+        <w:t>According to the primary texts, sentience appears when one developing atom reaches constitutional completeness — not through neural complexity, molecular size, or the material-to-biological order change.</w:t>
+      </w:r>
+    </w:p>
+    <w:p>
+      <w:r>
+        <w:t>The described process begins with particle exchange. Hungry atoms can incorporate particles; overfull or undigested atoms seek to expel them. Under suitable mutuality, a developing atom integrates the full count required by its constitution. When that requirement is satisfied, the constitution closes and particle count no longer increases or decreases.</w:t>
+      </w:r>
+    </w:p>
+    <w:p>
+      <w:r>
+        <w:t xml:space="preserve">The slide shows the before and after. Before sentience, the constitution remains open: particles are absorbed or expelled, molecular and weight bondage continue, and kind, capacity, and qualitative change track particle count. At the sentience threshold, all required particles are integrated. The count becomes fixed, molecular and weight bondage end, and qualitative activity continues. The texts classify that closed unit as sentient </w:t>
       </w:r>
       <w:r>
         <w:rPr>
@@ -2955,6 +3067,38 @@
     </w:p>
     <w:p>
       <w:r>
+        <w:t>That separation of qualitative from quantitative change is the stated criterion. MVD adds the visible signs of release from the molecular group, liberation from molecular- and weight-bondage, and establishment in hope-bondage.</w:t>
+      </w:r>
+    </w:p>
+    <w:p>
+      <w:r>
+        <w:t xml:space="preserve">The transition to sentience is therefore a claim of reclassification at atomic closure: one atom becomes </w:t>
+      </w:r>
+      <w:r>
+        <w:rPr>
+          <w:i/>
+        </w:rPr>
+        <w:t>jeevan</w:t>
+      </w:r>
+      <w:r>
+        <w:t>; a body does not become conscious by becoming more complex. The texts give a process and a criterion, but not an accepted physical measurement of this threshold or a causal explanation of why closure is sentience. We will return to that open bridge under method and evidence.</w:t>
+      </w:r>
+    </w:p>
+    <w:p>
+      <w:pPr>
+        <w:pStyle w:val="Heading2"/>
+      </w:pPr>
+      <w:r>
+        <w:t>Primary-text background</w:t>
+      </w:r>
+    </w:p>
+    <w:p>
+      <w:r>
+        <w:t>MVD, p. 91 (increased contraction-expansion, release from the molecular group, and the bondage shift). Closed particle constitution: SB, p. 55. Particle inclusion and expulsion as the route to completeness: SB, pp. 58, 71; KD 3.3. Qualitative change tied to quantitative change in matter, and the separation of the two at completeness: SB, p. 86 — this is the criterion stated in the script. Irreversibility: SB, p. 92. Not neural/molecular size: SB, p. 52.</w:t>
+      </w:r>
+    </w:p>
+    <w:p>
+      <w:r>
         <w:t xml:space="preserve">Continuity beyond the body and later association with another body: study §1.8, §1.14; JV as cited there. The study keeps this apart from general indestructibility (slide 7): constitutional completeness is MD's </w:t>
       </w:r>
       <w:r>
@@ -3016,7 +3160,20 @@
     </w:p>
     <w:p>
       <w:r>
-        <w:t>Not presently — say so plainly (§6.2.5). Realisation and conduct are warrants within the darshan; public science needs operational criteria that do not yet exist.</w:t>
+        <w:t>Not presently — say so plainly (§6.2.1). Realisation and conduct are warrants within the darshan; public science needs operational criteria that do not yet exist.</w:t>
+      </w:r>
+    </w:p>
+    <w:p>
+      <w:r>
+        <w:rPr>
+          <w:b/>
+        </w:rPr>
+        <w:t>Q: Does the text explain why closure creates sentience?</w:t>
+      </w:r>
+    </w:p>
+    <w:p>
+      <w:r>
+        <w:t>It identifies closure with the sentient status and describes the before/after criteria. It does not derive sentience from a particle configuration in a way that supplies a contemporary causal model. Calling the sentience threshold a textual transition criterion is more accurate than calling it an empirically established mechanism.</w:t>
       </w:r>
     </w:p>
     <w:p>
@@ -4442,7 +4599,7 @@
     </w:p>
     <w:p>
       <w:r>
-        <w:t>Practice and conduct-evidence can show effects in work, behaviour, and mutual satisfaction. They cannot by themselves measure T1 or the unit–body interface.</w:t>
+        <w:t>Practice and conduct-evidence can show effects in work, behaviour, and mutual satisfaction. They cannot by themselves measure the sentience threshold or the unit–body interface.</w:t>
       </w:r>
     </w:p>
     <w:p>
@@ -4452,7 +4609,7 @@
     </w:p>
     <w:p>
       <w:r>
-        <w:t>Publicly measurable physical claims remain answerable to instrument-based science. No accepted measurement currently identifies T1, the unit–body interface, or post-body reassociation — the last of those being the claim I flagged on slide 16, that the sentient unit continues when a body ends and may later associate with another. Stating that plainly is part of responsible presentation.</w:t>
+        <w:t>Publicly measurable physical claims remain answerable to instrument-based science. No accepted measurement currently identifies the sentience threshold, the unit–body interface, or post-body reassociation — the last of those being the claim I flagged on slide 16, that the sentient unit continues when a body ends and may later associate with another. Stating that plainly is part of responsible presentation.</w:t>
       </w:r>
     </w:p>
     <w:p>
@@ -4564,7 +4721,7 @@
     </w:p>
     <w:p>
       <w:r>
-        <w:t>How is it known? Through logical exposition, study and self-examination, practice, realisation, and conduct-evidence — without conflating those with instrument measurement of T1. The lived test is evidence in humane conduct.</w:t>
+        <w:t>How is it known? Through logical exposition, study and self-examination, practice, realisation, and conduct-evidence — without conflating those with instrument measurement of the sentience threshold. The lived test is evidence in humane conduct.</w:t>
       </w:r>
     </w:p>
     <w:p>

</xml_diff>

<commit_message>
Clarify activity and action in ontology study
</commit_message>
<xml_diff>
--- a/Studies/The-Ontology-of-Coexistence/Presenters-Companion-Ontology-of-Existence.docx
+++ b/Studies/The-Ontology-of-Coexistence/Presenters-Companion-Ontology-of-Existence.docx
@@ -1168,7 +1168,7 @@
         <w:rPr>
           <w:b/>
         </w:rPr>
-        <w:t>Q: Does satta cause units to act?</w:t>
+        <w:t>Q: Does satta cause unit-activity?</w:t>
       </w:r>
     </w:p>
     <w:p>
@@ -1191,7 +1191,7 @@
         <w:t>mahakaran</w:t>
       </w:r>
       <w:r>
-        <w:t xml:space="preserve"> — supreme cause in the sustaining sense (MVD, pp. 288–289; SB, pp. 49, 62). The causal work of change is done by units. Slide 7 develops this.</w:t>
+        <w:t xml:space="preserve"> — supreme cause in the sustaining sense (MVD, pp. 288–289; SB, pp. 49, 62). Particular changes occur through unit-activity in mutuality. Slide 7 develops this.</w:t>
       </w:r>
     </w:p>
     <w:p>
@@ -1297,7 +1297,7 @@
     </w:p>
     <w:p>
       <w:r>
-        <w:t>Second point, and this one matters for how you hear the rest of the session. The texts call Omnipresence the supreme cause, and that phrase invites a misreading. It is cause only in the sustaining sense — no activity exists apart from nature saturated in it. It starts no particular change. Composition, decomposition, development, conduct: all of that is the work of units acting on one another. So there is no creator in this account, and no ruler issuing instructions.</w:t>
+        <w:t>Second point, and this one matters for how you hear the rest of the session. The texts call Omnipresence the supreme cause, and that phrase invites a misreading. It is cause only in the sustaining sense — no activity exists apart from nature saturated in it. It starts no particular change. Composition, decomposition, and development occur as unit-activity in mutuality. Karma and humane conduct belong to the human joint form. So there is no creator in this account, and no ruler issuing instructions.</w:t>
       </w:r>
     </w:p>
     <w:p>
@@ -3593,7 +3593,7 @@
         <w:t>jeevan</w:t>
       </w:r>
       <w:r>
-        <w:t xml:space="preserve"> is complete — it has all five faculties. But its bodily medium is limited, so it acts for sensory satisfaction under species-conformance, and it reaches the first harmony and stops. Peace, contentment, and bliss are not failures on its part; they are simply not available through that body.</w:t>
+        <w:t xml:space="preserve"> is complete — it has all five faculties. But its bodily medium is limited, so its activity remains within sensory satisfaction under species-conformance, and it reaches the first harmony and stops. Peace, contentment, and bliss are not failures on its part; they are simply not available through that body.</w:t>
       </w:r>
     </w:p>
     <w:p>
@@ -3797,7 +3797,25 @@
     </w:p>
     <w:p>
       <w:r>
-        <w:t xml:space="preserve">That is why the text bothers with the anatomy of action at all. Every activity done with desire has five limbs: doer, cause, objective, result, and effect. Effect means the act's reach or consequence — not a separate ledger of destiny. Desire is the aspiration; karma is the doing, activity together with aspiration; result is the fruit. And the text's own criterion: desire, doing, and result must </w:t>
+        <w:t xml:space="preserve">That is why the text bothers with the anatomy of action at all. </w:t>
+      </w:r>
+      <w:r>
+        <w:rPr>
+          <w:i/>
+        </w:rPr>
+        <w:t>Kriyā</w:t>
+      </w:r>
+      <w:r>
+        <w:t xml:space="preserve"> names activity throughout nature; it is not thereby </w:t>
+      </w:r>
+      <w:r>
+        <w:rPr>
+          <w:i/>
+        </w:rPr>
+        <w:t>karma</w:t>
+      </w:r>
+      <w:r>
+        <w:t xml:space="preserve">. Human activity joined to aspiration has five limbs: doer, cause, objective, result, and effect. Effect means the act's reach or consequence — not a separate ledger of destiny. Desire is the aspiration; karma is the doing, activity together with aspiration; result is the fruit. And the text's own criterion: desire, doing, and result must </w:t>
       </w:r>
       <w:r>
         <w:rPr>
@@ -3816,7 +3834,7 @@
     </w:p>
     <w:p>
       <w:r>
-        <w:t>Hold this beside the earlier triad of effort, motion, and result. This is the desire-laden framing of the same activity ontology in sentient living. The next slides show how desire and doing get reorganised under justice, innateness, and truth.</w:t>
+        <w:t>Hold this beside the earlier triad of effort, motion, and result. This is the desire-laden human framing of the same activity ontology. The next slides show how desire and doing get reorganised under justice, innateness, and truth.</w:t>
       </w:r>
     </w:p>
     <w:p>
@@ -3834,7 +3852,16 @@
     </w:p>
     <w:p>
       <w:r>
-        <w:t>Five limbs as on the slide. Relate to effort–motion–result (slide 12) without collapsing the vocabularies — karma is the desire-laden human/sentient framing of activity.</w:t>
+        <w:t xml:space="preserve">Five limbs as on the slide. Relate to effort–motion–result (slide 12) without collapsing the vocabularies — </w:t>
+      </w:r>
+      <w:r>
+        <w:rPr>
+          <w:i/>
+        </w:rPr>
+        <w:t>kriyā</w:t>
+      </w:r>
+      <w:r>
+        <w:t xml:space="preserve"> names activity throughout nature, while karma names human activity together with aspiration.</w:t>
       </w:r>
     </w:p>
     <w:p>
@@ -3896,7 +3923,7 @@
     </w:p>
     <w:p>
       <w:r>
-        <w:t>Same underlying activity ontology; karma names activity-with-aspiration and its fruit in the desire register. Keep the five limbs available for Q&amp;A on responsibility and result.</w:t>
+        <w:t>Same underlying activity ontology; karma names human activity-with-aspiration and its fruit in the desire register. Keep the five limbs available for Q&amp;A on responsibility and result.</w:t>
       </w:r>
     </w:p>
     <w:p>

</xml_diff>

<commit_message>
Overhaul Axiology study, translate sampark to contact, and add horizontal rule prohibition to AGENTS.md
</commit_message>
<xml_diff>
--- a/Studies/The-Ontology-of-Coexistence/Presenters-Companion-Ontology-of-Existence.docx
+++ b/Studies/The-Ontology-of-Coexistence/Presenters-Companion-Ontology-of-Existence.docx
@@ -1893,7 +1893,16 @@
     </w:p>
     <w:p>
       <w:r>
-        <w:t>Two kinds of mutuality matter. A relationship is mutuality whose expectations are definite in the completeness of the bond — parent and child. An association or contact is mutuality where expectations are voluntary — neighbours who share a wall.</w:t>
+        <w:t>Two kinds of mutuality matter. A relationship is mutuality whose expectations are definite in the completeness of the bond — parent and child. A contact (</w:t>
+      </w:r>
+      <w:r>
+        <w:rPr>
+          <w:i/>
+        </w:rPr>
+        <w:t>sampark</w:t>
+      </w:r>
+      <w:r>
+        <w:t>) is mutuality where expectations are voluntary — neighbours who share a wall.</w:t>
       </w:r>
     </w:p>
     <w:p>

</xml_diff>

<commit_message>
Revise Ontology of Coexistence to the thirty-value canon and primary-text faculty terms.
Co-authored-by: Cursor <cursoragent@cursor.com>
</commit_message>
<xml_diff>
--- a/Studies/The-Ontology-of-Coexistence/Presenters-Companion-Ontology-of-Existence.docx
+++ b/Studies/The-Ontology-of-Coexistence/Presenters-Companion-Ontology-of-Existence.docx
@@ -35,7 +35,7 @@
         <w:rPr>
           <w:b/>
         </w:rPr>
-        <w:t>27-slide</w:t>
+        <w:t>28-slide</w:t>
       </w:r>
       <w:r>
         <w:t xml:space="preserve"> presentation based on §1 of </w:t>
@@ -1477,16 +1477,7 @@
     </w:p>
     <w:p>
       <w:r>
-        <w:t xml:space="preserve">Complementarity second. Nothing in nature exists in isolation, and each unit is a whole along with its environment. Now the consequence people find surprising: essentiality in every order is what value </w:t>
-      </w:r>
-      <w:r>
-        <w:rPr>
-          <w:i/>
-        </w:rPr>
-        <w:t>is</w:t>
-      </w:r>
-      <w:r>
-        <w:t>, in the broad sense — the usefulness through which a unit is complementary to others. That means value is ontological here. It is not assigned by an observer, and it is not a human invention layered on top of physics.</w:t>
+        <w:t>Complementarity second. Nothing in nature exists in isolation, and each unit is a whole along with its environment. Now the consequence people find surprising: value, in the universal sense, is essentiality and participation in orderliness — the definite conduct through which a unit complements others. Usefulness is that essentiality as it appears in objects; it is not the whole of value. Value is ontological here. It is not assigned by an observer, and it is not a human invention layered on top of physics.</w:t>
       </w:r>
     </w:p>
     <w:p>
@@ -1551,7 +1542,7 @@
     </w:p>
     <w:p>
       <w:r>
-        <w:t>Recognition below the human order is not reflective cognition; the heat, particle-distance, and atomic-combination examples are the study's own (§1.2). Value as the usefulness through which a unit is complementary to others: §1.4.</w:t>
+        <w:t>Recognition below the human order is not reflective cognition; the heat, particle-distance, and atomic-combination examples are the study's own (§1.2). Value as essentiality and participation in orderliness: §1.4.</w:t>
       </w:r>
     </w:p>
     <w:p>
@@ -1694,6 +1685,11 @@
       </w:r>
     </w:p>
     <w:p>
+      <w:r>
+        <w:t>The same unit is known in three complementary aspects, not three worlds. Inherent truth is what the unit is. Positional truth is how it stands among others. Existential truth is that it exists in Omnipresence.</w:t>
+      </w:r>
+    </w:p>
+    <w:p>
       <w:pPr>
         <w:pStyle w:val="Heading2"/>
       </w:pPr>
@@ -1703,7 +1699,7 @@
     </w:p>
     <w:p>
       <w:r>
-        <w:t>Four aspects: MVD, pp. 11, 42, 47, 50–51; SB pp. 55, 71, 86. “Each unit is a whole along with its environment… orderliness with its ness… moves towards ‘development’ in its natural state and ‘decline’ in its excited state.” — SB, pp. 13–14</w:t>
+        <w:t>Four aspects: MVD, pp. 11, 42, 47, 50–51; SB pp. 55, 71, 86. Three complementary truths: YAT; MVD pp. 88, 97; study §1.3. “Each unit is a whole along with its environment… orderliness with its ness… moves towards ‘development’ in its natural state and ‘decline’ in its excited state.” — SB, pp. 13–14</w:t>
       </w:r>
     </w:p>
     <w:p>
@@ -1907,7 +1903,7 @@
     </w:p>
     <w:p>
       <w:r>
-        <w:t xml:space="preserve">The slide names five value families: object, </w:t>
+        <w:t xml:space="preserve">The slide names the thirty values: four </w:t>
       </w:r>
       <w:r>
         <w:rPr>
@@ -1916,7 +1912,7 @@
         <w:t>jeevan</w:t>
       </w:r>
       <w:r>
-        <w:t xml:space="preserve">, human, established, and civic — the last is </w:t>
+        <w:t xml:space="preserve"> values, six human values, nine established values, nine expressed values, and two object values. Established values become evident when human relationships are recognised and fulfilled — trust, respect, affection, care, and so on. Expressed values — </w:t>
       </w:r>
       <w:r>
         <w:rPr>
@@ -1925,62 +1921,44 @@
         <w:t>shishta-mulya</w:t>
       </w:r>
       <w:r>
-        <w:t xml:space="preserve"> in the source. Object values are two, utility and art, so the same list is often counted as six types: utility, art, </w:t>
+        <w:t xml:space="preserve"> — are their corresponding powers in motion. The English translation of MVD renders those as civic values; they are relationship-expression, not a separate family of right-use of body, mind, and wealth.</w:t>
+      </w:r>
+    </w:p>
+    <w:p>
+      <w:r>
+        <w:t>At the human order the path runs: knowing, then believing, then recognising, then fulfilling. Awakening does not invent new faculties. It aligns this chain with coexistence.</w:t>
+      </w:r>
+    </w:p>
+    <w:p>
+      <w:pPr>
+        <w:pStyle w:val="Heading2"/>
+      </w:pPr>
+      <w:r>
+        <w:t>Primary-text background</w:t>
+      </w:r>
+    </w:p>
+    <w:p>
+      <w:r>
+        <w:t>“Every entity of nature recognises another; that is why it fulfils…” — JV, p. 69</w:t>
+      </w:r>
+    </w:p>
+    <w:p>
+      <w:r>
+        <w:t>Relationship / contact definitions: MVD, pp. 61–62. Values and mutuality: SB, pp. 50, 53, 61; MVD, p. 27. Motherly care example: JV, pp. 137–138.</w:t>
+      </w:r>
+    </w:p>
+    <w:p>
+      <w:r>
+        <w:t xml:space="preserve">The thirty-value canon follows the study's §1.4 table and </w:t>
       </w:r>
       <w:r>
         <w:rPr>
           <w:i/>
         </w:rPr>
-        <w:t>jeevan</w:t>
-      </w:r>
-      <w:r>
-        <w:t>, human, established, and civic. Established values are the ones that become evident when human relationships are recognised and fulfilled — trust, respect, affection, care, and so on. Civic values are how all of that is expressed in social participation.</w:t>
-      </w:r>
-    </w:p>
-    <w:p>
-      <w:r>
-        <w:t>At the human order the path runs: knowing, then believing, then recognising, then fulfilling. Awakening does not invent new faculties. It aligns this chain with coexistence.</w:t>
-      </w:r>
-    </w:p>
-    <w:p>
-      <w:pPr>
-        <w:pStyle w:val="Heading2"/>
-      </w:pPr>
-      <w:r>
-        <w:t>Primary-text background</w:t>
-      </w:r>
-    </w:p>
-    <w:p>
-      <w:r>
-        <w:t>“Every entity of nature recognises another; that is why it fulfils…” — JV, p. 69</w:t>
-      </w:r>
-    </w:p>
-    <w:p>
-      <w:r>
-        <w:t>Relationship / contact definitions: MVD, pp. 61–62. Values and mutuality: SB, pp. 50, 53, 61; MVD, p. 27. Motherly care example: JV, pp. 137–138.</w:t>
-      </w:r>
-    </w:p>
-    <w:p>
-      <w:r>
-        <w:t xml:space="preserve">The five families follow the study's §1.4 table: object, </w:t>
-      </w:r>
-      <w:r>
-        <w:rPr>
-          <w:i/>
-        </w:rPr>
-        <w:t>jeevan</w:t>
-      </w:r>
-      <w:r>
-        <w:t>, human, established, civic (</w:t>
-      </w:r>
-      <w:r>
-        <w:rPr>
-          <w:i/>
-        </w:rPr>
-        <w:t>shishta</w:t>
-      </w:r>
-      <w:r>
-        <w:t xml:space="preserve">). The MVD English translation uses </w:t>
+        <w:t>Paribhasha Samhita</w:t>
+      </w:r>
+      <w:r>
+        <w:t xml:space="preserve"> pp. 151, 154, matching Axiology §1.3. The English translation of MVD uses </w:t>
       </w:r>
       <w:r>
         <w:rPr>
@@ -1998,7 +1976,7 @@
         <w:t>shishta-mulya</w:t>
       </w:r>
       <w:r>
-        <w:t xml:space="preserve">; “expression values” is an explanatory rendering, not a separate sixth family, and “relationship values” is a loose label for established values rather than a family of its own. The primary texts distribute these explanations across passages on production, relationship, </w:t>
+        <w:t xml:space="preserve">; this companion treats them as the expressed pair of the established values. The primary texts distribute these explanations across passages on production, relationship, </w:t>
       </w:r>
       <w:r>
         <w:rPr>
@@ -3244,7 +3222,16 @@
     </w:p>
     <w:p>
       <w:r>
-        <w:t>On one side: the body — living composition, sense organs, brain, physical expression; decomposable. On the other: the sentient unit — constitutionally complete; faculties inherent; continuing when the joint form ends.</w:t>
+        <w:t>On one side: the body — living composition, sense organs, the brain (</w:t>
+      </w:r>
+      <w:r>
+        <w:rPr>
+          <w:i/>
+        </w:rPr>
+        <w:t>medhas</w:t>
+      </w:r>
+      <w:r>
+        <w:t>), physical expression; decomposable. The brain receives and translates signals; it is the medium, not the knower. On the other: the sentient unit — constitutionally complete; faculties inherent; continuing when the joint form ends.</w:t>
       </w:r>
     </w:p>
     <w:p>
@@ -3288,7 +3275,16 @@
     </w:p>
     <w:p>
       <w:r>
-        <w:t xml:space="preserve">The brain is a physical interface for expression within the joint form; the knower is always </w:t>
+        <w:t>The brain (</w:t>
+      </w:r>
+      <w:r>
+        <w:rPr>
+          <w:i/>
+        </w:rPr>
+        <w:t>medhas</w:t>
+      </w:r>
+      <w:r>
+        <w:t xml:space="preserve">) is a physical interface for expression within the joint form; the knower is always </w:t>
       </w:r>
       <w:r>
         <w:rPr>
@@ -3350,7 +3346,12 @@
     </w:p>
     <w:p>
       <w:r>
-        <w:t>Each works outward and inward. Hope selects and tastes. Thought analyses and deliberates. Desire visualises and contemplates. Resolve resolves and receives clear understanding. The core self authenticates and realises.</w:t>
+        <w:t>Each works outward and inward. Hope selects and tastes. Thought analyses and deliberates. Desire visualises and contemplates — and directly apprehends. Resolve resolves and comprehends. The core self authenticates and realises.</w:t>
+      </w:r>
+    </w:p>
+    <w:p>
+      <w:r>
+        <w:t>Guidance can descend from the core self through the faculties — higher-conformance — or sensory drive can push inward from the body — lower-conformance. Cognisance regulates sensitivity when the higher direction holds.</w:t>
       </w:r>
     </w:p>
     <w:p>
@@ -3373,7 +3374,7 @@
     </w:p>
     <w:p>
       <w:r>
-        <w:t xml:space="preserve">MVD, p. 78; JV, p. 92; MVD, pp. 13, 126, 278–279, 286–287. </w:t>
+        <w:t xml:space="preserve">MVD, p. 78; JV, p. 92; MVD, pp. 13, 82–83, 126, 207–208, 278–279, 286–287. </w:t>
       </w:r>
       <w:r>
         <w:rPr>
@@ -3382,7 +3383,43 @@
         <w:t>Koshas</w:t>
       </w:r>
       <w:r>
-        <w:t>: MVD, pp. 49–50. Body mistaken for self: SB, pp. 91–92; JV, p. 93.</w:t>
+        <w:t xml:space="preserve">: MVD, pp. 49–50. Body mistaken for self: SB, pp. 91–92; JV, p. 93. The study renders the reflective activity of </w:t>
+      </w:r>
+      <w:r>
+        <w:rPr>
+          <w:i/>
+        </w:rPr>
+        <w:t>buddhi</w:t>
+      </w:r>
+      <w:r>
+        <w:t xml:space="preserve"> as comprehension (</w:t>
+      </w:r>
+      <w:r>
+        <w:rPr>
+          <w:i/>
+        </w:rPr>
+        <w:t>bodh</w:t>
+      </w:r>
+      <w:r>
+        <w:t xml:space="preserve">) and of </w:t>
+      </w:r>
+      <w:r>
+        <w:rPr>
+          <w:i/>
+        </w:rPr>
+        <w:t>chitta</w:t>
+      </w:r>
+      <w:r>
+        <w:t xml:space="preserve"> as direct apprehension (</w:t>
+      </w:r>
+      <w:r>
+        <w:rPr>
+          <w:i/>
+        </w:rPr>
+        <w:t>sakshatkar</w:t>
+      </w:r>
+      <w:r>
+        <w:t>).</w:t>
       </w:r>
     </w:p>
     <w:p>
@@ -4266,7 +4303,7 @@
     </w:p>
     <w:p>
       <w:r>
-        <w:t>On the right: how knowing happens within the sentient unit. Hope tastes and selects. Thought deliberates. Desire contemplates. Resolve clarifies and resolves. The core self realises — through truth. When each level is acted in alignment, it is felt as happiness, peace, contentment, and bliss.</w:t>
+        <w:t>On the right: how knowing happens within the sentient unit. Hope tastes and selects. Thought deliberates. Desire contemplates and directly apprehends. Resolve comprehends and resolves. The core self realises — through truth. When each level is acted in alignment, it is felt as happiness, peace, contentment, and bliss.</w:t>
       </w:r>
     </w:p>
     <w:p>
@@ -4293,7 +4330,7 @@
         <w:t>dharma</w:t>
       </w:r>
       <w:r>
-        <w:t xml:space="preserve">); JV, p. 120 (understanding as enlightenment of existence, </w:t>
+        <w:t xml:space="preserve">); JV, p. 120 (understanding of existence, </w:t>
       </w:r>
       <w:r>
         <w:rPr>

</xml_diff>

<commit_message>
Correct Ontology §1.7 projection activities and record mun's three tasting forms.
Co-authored-by: Cursor <cursoragent@cursor.com>
</commit_message>
<xml_diff>
--- a/Studies/The-Ontology-of-Coexistence/Presenters-Companion-Ontology-of-Existence.docx
+++ b/Studies/The-Ontology-of-Coexistence/Presenters-Companion-Ontology-of-Existence.docx
@@ -3346,7 +3346,7 @@
     </w:p>
     <w:p>
       <w:r>
-        <w:t>Each works outward and inward. Hope selects and tastes. Thought analyses and deliberates. Desire visualises and contemplates — and directly apprehends. Resolve resolves and comprehends. The core self authenticates and realises.</w:t>
+        <w:t>Each works outward and inward. Hope selects and tastes. Thought analyses and deliberates. Desire visualises and contemplates — and directly apprehends. Resolve resolves and comprehends. The core self authenticates and realises. Tasting at hope has three orientations: sensory, value-based, and goal-based. Awakening changes which of these governs what is accepted. Projection of realisation is authenticity, resolve, visualisation, analysis, and selection into living conduct.</w:t>
       </w:r>
     </w:p>
     <w:p>
@@ -3419,7 +3419,7 @@
         <w:t>sakshatkar</w:t>
       </w:r>
       <w:r>
-        <w:t>).</w:t>
+        <w:t>). Tasting forms: PS pp. 40–41; Axiology §1.2.</w:t>
       </w:r>
     </w:p>
     <w:p>

</xml_diff>

<commit_message>
Align ontology teaching deck and presenter notes with imaging account
</commit_message>
<xml_diff>
--- a/Studies/The-Ontology-of-Coexistence/Presenters-Companion-Ontology-of-Existence.docx
+++ b/Studies/The-Ontology-of-Coexistence/Presenters-Companion-Ontology-of-Existence.docx
@@ -35,7 +35,7 @@
         <w:rPr>
           <w:b/>
         </w:rPr>
-        <w:t>28-slide</w:t>
+        <w:t>29-slide</w:t>
       </w:r>
       <w:r>
         <w:t xml:space="preserve"> presentation based on §1 of </w:t>
@@ -92,7 +92,16 @@
         <w:t>Adhyatmvad</w:t>
       </w:r>
       <w:r>
-        <w:t xml:space="preserve"> (AVD) — translations by Rakesh Gupta where applicable; KD section 3 working English as noted in the study.</w:t>
+        <w:t xml:space="preserve"> (AVD), and the Hindi </w:t>
+      </w:r>
+      <w:r>
+        <w:rPr>
+          <w:i/>
+        </w:rPr>
+        <w:t>Paribhasha Samhita</w:t>
+      </w:r>
+      <w:r>
+        <w:t xml:space="preserve"> (PS). Translation and edition conventions follow the study; KD section 3 is working English. PS citations use printed pages, eight below the PDF position, in the third edition (2012), printing dated 14 January 2016. The official source collection and page-level references are linked in the [study bibliography](The-Ontology-of-Coexistence.html#references).</w:t>
       </w:r>
     </w:p>
     <w:p>
@@ -141,16 +150,7 @@
         <w:t>satta</w:t>
       </w:r>
       <w:r>
-        <w:t xml:space="preserve">; the study, this guide, </w:t>
-      </w:r>
-      <w:r>
-        <w:rPr>
-          <w:b/>
-        </w:rPr>
-        <w:t>and now the slides</w:t>
-      </w:r>
-      <w:r>
-        <w:t xml:space="preserve"> use “Omnipresence” in prose and preserve the translation's word inside quotations only. Both names point to the same </w:t>
+        <w:t xml:space="preserve">; the study, this guide, and the slides use “Omnipresence” in prose and preserve the translation's word inside quotations only. Both names point to the same </w:t>
       </w:r>
       <w:r>
         <w:rPr>
@@ -177,7 +177,7 @@
         <w:t>gyan</w:t>
       </w:r>
       <w:r>
-        <w:t xml:space="preserve"> taxonomy is no longer a deck slide; vocabulary discipline lives in the study's Editorial Notes. The epistemic payoff is the epistemic ladder (slide 24) and realisation (slide 25); method and evidence close the “how known” question (slides 27 and 28).</w:t>
+        <w:t xml:space="preserve"> taxonomy is no longer a deck slide; vocabulary discipline lives in the study's Editorial Notes. The epistemic payoff is the epistemic ladder (slide 24) and realisation (slide 25); presentation, communication, expression, and art connect understanding with conduct (slide 26); method and evidence close the “how known” question (slides 28 and 29).</w:t>
       </w:r>
     </w:p>
     <w:p>
@@ -251,7 +251,7 @@
     </w:p>
     <w:p>
       <w:r>
-        <w:t>Coverage claims are scoped to the translated corpus (MVD, SB, JV) plus KD as cited; relationship and value structure and cyclical economics may be fuller in untranslated Hindi works.</w:t>
+        <w:t>Coverage claims are scoped to the translated corpus (MVD, SB, JV), KD as cited, and the selected Hindi PS definitions identified in this guide. Other Hindi works may develop these subjects further.</w:t>
       </w:r>
     </w:p>
     <w:p>
@@ -439,7 +439,7 @@
     </w:p>
     <w:p>
       <w:r>
-        <w:t>Third: how sentient living becomes awakened conduct — the human as a joint form of body and sentient unit, the faculties of that sentient unit, the four harmonies it can reach, and why the higher three are reached only through action actually performed: evaluation, realisation, and participation in humane order.</w:t>
+        <w:t>Third: how sentient living becomes awakened conduct. We examine the human joint form, jeevan's faculties and harmonies, evaluation, realisation, and the expression of understanding through humane conduct.</w:t>
       </w:r>
     </w:p>
     <w:p>
@@ -641,7 +641,7 @@
     </w:p>
     <w:p>
       <w:r>
-        <w:t>In MD's reading, complementarity and value are built into existence; justice, family, and undivided society express how reality is — not conventions imposed on a value-neutral world. Slide 25 shows the ontology terminating in resolution, prosperity, fearlessness, and coexistence.</w:t>
+        <w:t>In MD's reading, complementarity and value are built into existence; justice, family, and undivided society express how reality is — not conventions imposed on a value-neutral world. Slide 27 shows the human goals of resolution, prosperity, fearlessness, and coexistence.</w:t>
       </w:r>
     </w:p>
     <w:p>
@@ -823,7 +823,16 @@
     </w:p>
     <w:p>
       <w:r>
-        <w:t xml:space="preserve">Hold on to two of those words, because the next slide is built on them. </w:t>
+        <w:t xml:space="preserve">Two words make this relation clearer. </w:t>
+      </w:r>
+      <w:r>
+        <w:rPr>
+          <w:i/>
+        </w:rPr>
+        <w:t>Permeating</w:t>
+      </w:r>
+      <w:r>
+        <w:t xml:space="preserve"> concerns the unit: the pervasive reality passes through every unit, which remains saturated in it. </w:t>
       </w:r>
       <w:r>
         <w:rPr>
@@ -832,16 +841,7 @@
         <w:t>Transparent</w:t>
       </w:r>
       <w:r>
-        <w:t xml:space="preserve"> and </w:t>
-      </w:r>
-      <w:r>
-        <w:rPr>
-          <w:i/>
-        </w:rPr>
-        <w:t>permeating</w:t>
-      </w:r>
-      <w:r>
-        <w:t>. The texts say transparence, permeability, and pervasiveness taken together are what show the ground to be one indivisible reality. Permeating is the strong one: the ground does not merely surround a unit from outside, it passes through it. That will matter in about ninety seconds.</w:t>
+        <w:t xml:space="preserve"> concerns mutuality: units become manifest to one another through imaging, which provides a basis of recognition. Transparency, permeability, and pervasiveness together evidence one indivisible reality.</w:t>
       </w:r>
     </w:p>
     <w:p>
@@ -899,6 +899,11 @@
       </w:r>
       <w:r>
         <w:t xml:space="preserve"> as Space: SB, pp. 57, 59, 79. Never-separated: SB, p. 70; JV, p. 18.</w:t>
+      </w:r>
+    </w:p>
+    <w:p>
+      <w:r>
+        <w:t>MVD p. 32 locates permeation in insentient and sentient units and transparency in their mutuality. PS p. 114 connects this with images and recognition. The ground remains actionless; imaging and recognition do not make it a knowing subject.</w:t>
       </w:r>
     </w:p>
     <w:p>
@@ -1042,70 +1047,32 @@
     </w:p>
     <w:p>
       <w:r>
-        <w:t>How are ground and units related? The texts have one word for it: saturation. Every formful unit is soaked, submerged, and surrounded in Omnipresence.</w:t>
-      </w:r>
-    </w:p>
-    <w:p>
-      <w:r>
-        <w:t>Now, why is that true rather than merely asserted? Because the ground is permeating — the word from the last slide. Take a unit and divide it. Divide the fragments. Divide those. However far you go, every fragment is still soaked, still submerged, still surrounded. There is no cut you can make that leaves a piece standing outside the ground.</w:t>
-      </w:r>
-    </w:p>
-    <w:p>
-      <w:r>
-        <w:t>Two things follow immediately, and they are worth stating slowly.</w:t>
-      </w:r>
-    </w:p>
-    <w:p>
-      <w:r>
-        <w:t>One: a unit cannot be annihilated. To annihilate it you would need a fragment separated from what it is saturated in, and no division produces that.</w:t>
-      </w:r>
-    </w:p>
-    <w:p>
-      <w:r>
-        <w:t xml:space="preserve">Two: saturation is a condition, not an event. There is no moment at which units existed on their own and were later joined to the ground. If someone asks you </w:t>
-      </w:r>
-      <w:r>
-        <w:rPr>
-          <w:i/>
-        </w:rPr>
-        <w:t>when</w:t>
-      </w:r>
-      <w:r>
-        <w:t xml:space="preserve"> saturation happened, the answer is that the question does not apply.</w:t>
-      </w:r>
-    </w:p>
-    <w:p>
-      <w:r>
-        <w:t>Here is the part I want you to notice, because it is easy to read past. Soaked, submerged, surrounded are not three words for one relation. Each carries its own entailment, and the three cards on the slide follow them in order.</w:t>
-      </w:r>
-    </w:p>
-    <w:p>
-      <w:r>
-        <w:t xml:space="preserve">Soaked gives forcefulness. Being soaked </w:t>
-      </w:r>
-      <w:r>
-        <w:rPr>
-          <w:i/>
-        </w:rPr>
-        <w:t>is</w:t>
-      </w:r>
-      <w:r>
-        <w:t xml:space="preserve"> forcefulness — the unit is the bearer of definite relative power. On the force side of the same bond, the texts call this basic impulsion.</w:t>
-      </w:r>
-    </w:p>
-    <w:p>
-      <w:r>
-        <w:t>Submerged gives energy-fullness. The ground is on every side of the unit, so the unit is never devoid of the energy evident in its activity. The texts state the relation as a bare identity: unit-ness plus energy-fullness is activeness. And activity is never one thing at a time — always effort, motion, and result together.</w:t>
-      </w:r>
-    </w:p>
-    <w:p>
-      <w:r>
-        <w:t>Surrounded gives regulation. Because the formless reality stands between units, each is held at a definite distance from the others. That is where law and orderliness come from — not from a statute issued from outside. We will come back to this on slide 22.</w:t>
-      </w:r>
-    </w:p>
-    <w:p>
-      <w:r>
-        <w:t>Recognition and participation in orderliness follow from the same bond, and slide 8 takes them up in their own right. And please hear the caution: this is a claim about what existence is like, not a proposed laboratory transfer mechanism. Nor does saturation destine any unit to become sentient.</w:t>
+        <w:t>Saturation names the inseparability of units and Omnipresence. Every formful unit is soaked, submerged, and surrounded in the same pervasive reality.</w:t>
+      </w:r>
+    </w:p>
+    <w:p>
+      <w:r>
+        <w:t>Because that reality is permeating, dividing a unit leaves every fragment saturated in it. There is no fragment outside the ground. This is why the texts connect saturation with non-annihilation, and why saturation names an ever-present condition.</w:t>
+      </w:r>
+    </w:p>
+    <w:p>
+      <w:r>
+        <w:t>The three descriptions have overlapping connections. Soakedness is evidenced as energy-fullness and forcefulness. The unit bears energy and definite relative power. The texts explicitly locate the root of its manifestness, or prakashmanata, in force-endowment while saturated in Omnipresence.</w:t>
+      </w:r>
+    </w:p>
+    <w:p>
+      <w:r>
+        <w:t>Submersion is expressed in activeness and recognition in mutuality. Units are present in the same pervasive reality and are imaged to one another. The formula linking unit-ness and energy-fullness with activeness belongs to this connected account.</w:t>
+      </w:r>
+    </w:p>
+    <w:p>
+      <w:r>
+        <w:t>Surroundedness is evidenced as regulation. Units remain in definite relations and regulate their activities through their own mediative organisation. Slide 22 develops this.</w:t>
+      </w:r>
+    </w:p>
+    <w:p>
+      <w:r>
+        <w:t>These descriptions belong together. The source passages connect them in more than one way, so each card should be read as part of one saturation. Slide 8 develops imaging and recognition. This is the darshan's ontological account; a quantitative physical mechanism would require further evidence.</w:t>
       </w:r>
     </w:p>
     <w:p>
@@ -1156,6 +1123,11 @@
       </w:r>
     </w:p>
     <w:p>
+      <w:r>
+        <w:t>SB p. 57 associates soakedness with forcefulness, submersion with activeness, and surroundedness with regulation. PS p. 114 associates soakedness with energy-endowment, submersion with mutual recognition, and surroundedness with regulation. These overlap rather than establishing exclusive compartments. SB p. 248 grounds manifestness in force-endowment under saturation. PS p. 121 identifies the image as a basis of mutual recognition. See study §§1.1–1.3 and Editorial Notes.</w:t>
+      </w:r>
+    </w:p>
+    <w:p>
       <w:pPr>
         <w:pStyle w:val="Heading2"/>
       </w:pPr>
@@ -1247,12 +1219,12 @@
         <w:rPr>
           <w:b/>
         </w:rPr>
-        <w:t>Q: Why insist the three words differ? Isn't this over-reading a translation?</w:t>
-      </w:r>
-    </w:p>
-    <w:p>
-      <w:r>
-        <w:t>It is the texts' own division: SB p. 57 attaches forcefulness to being soaked, and SB p. 79 attaches regulation specifically to surroundedness. The study sets out the three entailments in §1.2 and flags that MD gives them as ontological entailment, not mechanism.</w:t>
+        <w:t>Q: Does each saturation term have exactly one consequence?</w:t>
+      </w:r>
+    </w:p>
+    <w:p>
+      <w:r>
+        <w:t>The primary descriptions overlap. SB p. 57 connects submersion with activeness, while PS p. 114 connects it with recognition in mutuality. The study preserves both connections and the shared regulation account without assigning one exclusive consequence to each term.</w:t>
       </w:r>
     </w:p>
     <w:p>
@@ -1472,7 +1444,7 @@
     </w:p>
     <w:p>
       <w:r>
-        <w:t>Recognition first. A unit recognises another by responding according to definite constitution, distance, force, and relation. No cognition is involved — please do not hear "recognition" as a mental act. Heat is accepted and redistributed by matter. Particles hold definite distance in an atom. Atoms combine in definite ways and not others. That is recognition in the insentient orders, and the texts name the equipment for it: capacity, ability, receptivity.</w:t>
+        <w:t>Recognition first. Units are imaged to one another in mutual facing. The image, called pratibimb, provides a basis of mutual recognition. This includes insentient units. Their relative powers also exert effects: heat exchange and particle relations illustrate responsiveness. Imaging and influence have distinct roles in the same mutuality. Neither implies that an insentient unit understands as a person does. Human understanding involves the knowing activities of jeevan.</w:t>
       </w:r>
     </w:p>
     <w:p>
@@ -1552,7 +1524,7 @@
     </w:p>
     <w:p>
       <w:r>
-        <w:t>Note for the presenter: this slide was added because the deck previously carried recognition, complementarity, and the drive-to-fulfil-them as scattered clauses — recognition had been reduced to a single line in slide 6's footer. The study's §1.2 reference notes carry the thread heavily even though its prose mentions "complementarity" only a few times; this slide makes the through-line explicit and slides 10, 12, 13, 16, and 21 now name it where it is doing the work.</w:t>
+        <w:t>PS p. 121 defines image and imaging through mutual recognition. SB pp. 248–252 distinguishes imaging from the influences of relative powers. Its account extends from insentient mutuality to animal recognition of essential nature and human exchange of values and evaluation of dharma. These are the source connections behind the revised study §§1.2–1.3.</w:t>
       </w:r>
     </w:p>
     <w:p>
@@ -1599,7 +1571,7 @@
     </w:p>
     <w:p>
       <w:r>
-        <w:t>The texts use it technically: definite responsiveness to another unit according to constitution, distance, force, and relation. It carries no claim of awareness. The study is careful that knowing and believing are additional activities that appear only in sentient nature (§1.2).</w:t>
+        <w:t>The texts give an account of mutual imaging as well as definite responsiveness. PS p. 121 names the image as a basis of recognition, and SB pp. 248–252 distinguishes imaging from influence. Neither attributes human understanding to a particle. Knowing and believing belong to sentient nature (§§1.2–1.3).</w:t>
       </w:r>
     </w:p>
     <w:p>
@@ -1656,12 +1628,12 @@
     </w:p>
     <w:p>
       <w:r>
-        <w:t>Form is real boundary and configuration. Take the peepal tree on the slide: one bounded living form with trunk, branches, leaves, and roots.</w:t>
-      </w:r>
-    </w:p>
-    <w:p>
-      <w:r>
-        <w:t>Properties — capacities and relative effects. In the peepal: nutrition, growth, repair, seed production, degeneration under definite conditions.</w:t>
+        <w:t>Form is the real configuration of the unit: shape, volume, and density. The constituted unit is bimb. Its image in mutual facing is pratibimb, and being imaged is pratibimban. Take the peepal tree: one bounded living form with trunk, branches, leaves, and roots.</w:t>
+      </w:r>
+    </w:p>
+    <w:p>
+      <w:r>
+        <w:t>Properties are relative powers inseparable from their bearer. In the peepal, nutrition, repair, seed production, and degeneration become effective under definite conditions.</w:t>
       </w:r>
     </w:p>
     <w:p>
@@ -1676,7 +1648,7 @@
     </w:p>
     <w:p>
       <w:r>
-        <w:t>Form is real; what another unit encounters is its definite presentation in mutual facing. In non-sentient nature these aspects are definite. Misreading arises mainly in human living, when the sentient unit mistakes the body for the self.</w:t>
+        <w:t>The whole unit is manifest, or prakashman, with all four aspects. Imaging is central to prakash. This is a claim about how units are manifest to one another; completed human understanding also requires knowing their relations and fulfilment. An image alone does not deliver that understanding. Animal recognition of essential nature becomes evident in friendliness and opposition; human living brings the exchange of values and evaluation of dharma.</w:t>
       </w:r>
     </w:p>
     <w:p>
@@ -1734,6 +1706,11 @@
       </w:r>
       <w:r>
         <w:t xml:space="preserve"> are relational in manifestation; bearer and capacities remain real.</w:t>
+      </w:r>
+    </w:p>
+    <w:p>
+      <w:r>
+        <w:t>Imaging and prakash: MVD p. 45. Bimb, pratibimb, and pratibimban: PS pp. 121, 135. Being manifest with all four aspects: PS p. 119. Imaging, influence, animal recognition, and human evaluation: SB pp. 248–252. Bearer/property distinction: SB pp. 256–257. SB p. 179 describes entities as manifest, communicated, and expressed according to state, motion, plane, and order. Slide 26 develops the human definitions. The study’s Editorial Notes retain the contextual heated-body definition of prakash in PS p. 119 alongside MVD’s broader imaging formulation.</w:t>
       </w:r>
     </w:p>
     <w:p>
@@ -3351,7 +3328,7 @@
     </w:p>
     <w:p>
       <w:r>
-        <w:t>Guidance can descend from the core self through the faculties — higher-conformance — or sensory drive can push inward from the body — lower-conformance. Cognisance regulates sensitivity when the higher direction holds.</w:t>
+        <w:t>Here, reflection means pratyavartan, the inward activity of knowing. It differs from pratibimban, the imaging between units introduced on slides 8 and 9. Guidance can descend from the core self through the faculties, while sensory drive can press inward from the body. In awakening, cognisance regulates sensitivity.</w:t>
       </w:r>
     </w:p>
     <w:p>
@@ -3529,7 +3506,7 @@
     </w:p>
     <w:p>
       <w:r>
-        <w:t>Now hold all four in view, because they are what the knowledge order is actually after. This is the answer to “what is a human life for?” in this system — and notice that only the first of the four is reachable by sensory living. Happiness, the harmony of hope and thought, an animal can have. Peace, contentment, and bliss it cannot even see.</w:t>
+        <w:t>These four harmonies belong to the knowledge-order account of awakening. Animal living expresses hope to live through its bodily medium. We should therefore keep animal sensory satisfaction distinct from the human development of these harmonies. Within the human account, bliss is borne at buddhi through harmony with atma. Realisation at atma is named ultimate bliss, or paramanand, whose effect reaches the remaining faculties.</w:t>
       </w:r>
     </w:p>
     <w:p>
@@ -3539,7 +3516,7 @@
     </w:p>
     <w:p>
       <w:r>
-        <w:t>The next two slides ask how a human being actually gets from the first harmony to the other three.</w:t>
+        <w:t>The next two slides examine how understanding comes to guide evaluation, work, and relationships.</w:t>
       </w:r>
     </w:p>
     <w:p>
@@ -3553,6 +3530,11 @@
     <w:p>
       <w:r>
         <w:t>JV, p. 138 (four harmonies). JV, p. 61 (values ladder / five levels). KD §3.12, pp. 110–113 (projection–reflection). SB pairs values with practical routes through justice, orderliness, and realisation. MVD, p. 77 (channelling energies toward awakening).</w:t>
+      </w:r>
+    </w:p>
+    <w:p>
+      <w:r>
+        <w:t>Study §1.8 locates happiness at mun, peace at vritti, contentment at chitta, and bliss at buddhi, each through harmony with the inward faculty. MVD pp. 100–101 distinguishes ultimate bliss at realised atma; MVD pp. 328–346 enumerates the faculty activities. The knowledge-order ladder should not be extended to animals merely from the presence of the same faculties.</w:t>
       </w:r>
     </w:p>
     <w:p>
@@ -3630,7 +3612,21 @@
     </w:p>
     <w:p>
       <w:r>
-        <w:t xml:space="preserve">Take the animal case first, because it sets up the human one. An animal </w:t>
+        <w:t>Take the animal case first. An animal jeevan has all five faculties, but its bodily medium limits their expression. Its dharma is hope to live, expressed through sensory selection under species-conformance. The human medium supports the full range of activity and the possibility of awakening.</w:t>
+      </w:r>
+    </w:p>
+    <w:p>
+      <w:r>
+        <w:t xml:space="preserve">Now the human case. The human body </w:t>
+      </w:r>
+      <w:r>
+        <w:rPr>
+          <w:i/>
+        </w:rPr>
+        <w:t>can</w:t>
+      </w:r>
+      <w:r>
+        <w:t xml:space="preserve"> express all ten activities — that is what the developed nervous system is for. And yet, by default, human </w:t>
       </w:r>
       <w:r>
         <w:rPr>
@@ -3639,29 +3635,6 @@
         <w:t>jeevan</w:t>
       </w:r>
       <w:r>
-        <w:t xml:space="preserve"> is complete — it has all five faculties. But its bodily medium is limited, so its activity remains within sensory satisfaction under species-conformance, and it reaches the first harmony and stops. Peace, contentment, and bliss are not failures on its part; they are simply not available through that body.</w:t>
-      </w:r>
-    </w:p>
-    <w:p>
-      <w:r>
-        <w:t xml:space="preserve">Now the human case. The human body </w:t>
-      </w:r>
-      <w:r>
-        <w:rPr>
-          <w:i/>
-        </w:rPr>
-        <w:t>can</w:t>
-      </w:r>
-      <w:r>
-        <w:t xml:space="preserve"> express all ten activities — that is what the developed nervous system is for. And yet, by default, human </w:t>
-      </w:r>
-      <w:r>
-        <w:rPr>
-          <w:i/>
-        </w:rPr>
-        <w:t>jeevan</w:t>
-      </w:r>
-      <w:r>
         <w:t xml:space="preserve"> goes on evaluating by exactly the same sensory criteria the animal used. The equipment changed; the habit did not. That is the fork this slide names, and it answers one practical question — what makes me happy?</w:t>
       </w:r>
     </w:p>
@@ -3783,7 +3756,7 @@
           <w:b/>
           <w:sz w:val="36"/>
         </w:rPr>
-        <w:t>The Structure of Karma — Why Knowing Is Not Enough</w:t>
+        <w:t>The Structure of Karma</w:t>
       </w:r>
     </w:p>
     <w:p>
@@ -3824,21 +3797,12 @@
         <w:t>knowingly</w:t>
       </w:r>
       <w:r>
-        <w:t xml:space="preserve"> — where the higher harmonies are on offer and nothing delivers them automatically. And here is the part people resist: understanding does not deliver them either. Study is necessary. It is not sufficient. You can recognise the higher faculties, grasp the whole account, hold it clearly — and still not have peace, contentment, or bliss, because those are harmonies of the unit in </w:t>
-      </w:r>
-      <w:r>
-        <w:rPr>
-          <w:i/>
-        </w:rPr>
-        <w:t>activity</w:t>
-      </w:r>
-      <w:r>
-        <w:t>, and there is no activity in knowing about activity.</w:t>
-      </w:r>
-    </w:p>
-    <w:p>
-      <w:r>
-        <w:t>What delivers them is performed action — specifically, action that fulfils relationships. Recognise the higher faculties; study until you understand; then act so that what you owe in each relationship is actually fulfilled. That third step is not optional decoration on the first two. It is where the harmony happens.</w:t>
+        <w:t xml:space="preserve"> — where the higher harmonies are on offer and nothing delivers them automatically. Study introduces the account; understanding must become coherent activity. Knowing is itself an activity of jeevan, and its authenticity is evidenced in work and behaviour. Book knowledge alone does not establish that completed coherence.</w:t>
+      </w:r>
+    </w:p>
+    <w:p>
+      <w:r>
+        <w:t>Understanding is evidenced as relationships are fulfilled. We study, practise, evaluate the result, and bring work and behaviour into alignment with what we understand. The harmony within jeevan and its evidence in living belong together.</w:t>
       </w:r>
     </w:p>
     <w:p>
@@ -3875,7 +3839,7 @@
     </w:p>
     <w:p>
       <w:r>
-        <w:t>So: understanding alone changes nothing. It is the doing that yields the fruit. Book knowledge is half the work — the other half is conduct that fulfils relationships.</w:t>
+        <w:t>The intended result is accomplished through doing. Understanding guides that doing, and its authenticity is evidenced in conduct that fulfils relationships.</w:t>
       </w:r>
     </w:p>
     <w:p>
@@ -4303,12 +4267,12 @@
     </w:p>
     <w:p>
       <w:r>
-        <w:t>On the right: how knowing happens within the sentient unit. Hope tastes and selects. Thought deliberates. Desire contemplates and directly apprehends. Resolve comprehends and resolves. The core self realises — through truth. When each level is acted in alignment, it is felt as happiness, peace, contentment, and bliss.</w:t>
-      </w:r>
-    </w:p>
-    <w:p>
-      <w:r>
-        <w:t>The ladders meet at the top: coexistence known and lived is felt as bliss. Human error belongs to confused evaluation, not to fuzziness in the reality reflected.</w:t>
+        <w:t>On the right: how knowing happens within the sentient unit. Hope tastes and selects. Thought deliberates. Desire contemplates and directly apprehends. Resolve comprehends and resolves. The core self realises through truth. Happiness, peace, contentment, and bliss name harmonies between paired faculties. Realisation at the core is named ultimate bliss.</w:t>
+      </w:r>
+    </w:p>
+    <w:p>
+      <w:r>
+        <w:t>Every unit is already manifest with all four aspects. The left-hand steps describe widening human understanding of that unit; they do not describe successive additions to its image. Inward reflection deepens knowing, and projection makes understanding evident through conduct. Bliss names the harmony of buddhi and atma; coexistence realised at atma is ultimate bliss.</w:t>
       </w:r>
     </w:p>
     <w:p>
@@ -4373,7 +4337,7 @@
     </w:p>
     <w:p>
       <w:r>
-        <w:t>The triad's bases are verbatim JV. The four-aspect widening is a faithful reading of the definitions; present it as the structure of the definitions.</w:t>
+        <w:t>The ladder is an analytical arrangement of the definitions and their contexts, as explained in the study. All four aspects belong to the manifest unit. Imaging supplies a basis of recognition, while human understanding develops through jeevan’s knowing activities; the rungs should not be taught as a source-enumerated sequence of images.</w:t>
       </w:r>
     </w:p>
     <w:p>
@@ -4413,7 +4377,7 @@
     </w:p>
     <w:p>
       <w:r>
-        <w:t>Realisation is bliss. Truth itself is abundance — coexistence; realisation of abundance is bliss; bliss is the living of the sentient unit. What is realised is the ground the unit was always saturated in.</w:t>
+        <w:t>Realisation at atma is named ultimate bliss. Bliss names the harmony of buddhi and atma. What is known is existence as coexistence: nature saturated in Omnipresence. Understanding becomes evident as authenticity in work, behaviour, and participation. The next slide examines how it is presented, communicated, and expressed.</w:t>
       </w:r>
     </w:p>
     <w:p>
@@ -4437,6 +4401,11 @@
     <w:p>
       <w:r>
         <w:t>SB, p. 116 and MVD, p. 126 (threefold knowledge); KD §§3.17–3.18 (knowledge, knower, and known); MVD, pp. 14–15, 286–287. Study §1.13.</w:t>
+      </w:r>
+    </w:p>
+    <w:p>
+      <w:r>
+        <w:t>MVD pp. 100–101 distinguishes ultimate bliss at atma; MVD p. 328 connects realisation-based expression, communication, and exposition with ultimate bliss. Study §§1.8 and 1.13 preserves both this placement and bliss as buddhi–atma harmony.</w:t>
       </w:r>
     </w:p>
     <w:p>
@@ -4515,6 +4484,131 @@
       </w:pPr>
       <w:r>
         <w:t>Slide 26</w:t>
+      </w:r>
+    </w:p>
+    <w:p>
+      <w:r>
+        <w:rPr>
+          <w:b/>
+          <w:sz w:val="36"/>
+        </w:rPr>
+        <w:t>Understanding in Expression</w:t>
+      </w:r>
+    </w:p>
+    <w:p>
+      <w:pPr>
+        <w:pStyle w:val="Heading2"/>
+      </w:pPr>
+      <w:r>
+        <w:t>Delivering the slide</w:t>
+      </w:r>
+    </w:p>
+    <w:p>
+      <w:r>
+        <w:t>How does understanding become available in living? The primary texts use three connected terms: presentation, communication, and expression.</w:t>
+      </w:r>
+    </w:p>
+    <w:p>
+      <w:r>
+        <w:t>Presentation, prakashan, makes actuality evident through an accomplished and meaningful form. Something understood takes a form another can attend to.</w:t>
+      </w:r>
+    </w:p>
+    <w:p>
+      <w:r>
+        <w:t>Communication, sampreshana, indicates completeness. The definition names constitutional completeness, activity completeness, and conduct completeness. Communication serves understanding and enabling another to understand. Words direct attention to the activity of units and its inherent meaning, including their properties, essential nature, and dharma.</w:t>
+      </w:r>
+    </w:p>
+    <w:p>
+      <w:r>
+        <w:t>Expression, abhivyakti, is the mental, verbal, and bodily activity through which our existence is evidenced for all-round resolution, called abhyudaya. Understanding is expressed in speech, work, and humane behaviour.</w:t>
+      </w:r>
+    </w:p>
+    <w:p>
+      <w:r>
+        <w:t>Art, kala, concerns how these activities take an accomplished form. It makes qualities evident and expression meaningful, bringing usefulness together with beauty. In making an object, art value enhances usefulness. In communicating understanding, art serves intelligibility and the purpose of resolution.</w:t>
+      </w:r>
+    </w:p>
+    <w:p>
+      <w:r>
+        <w:t>These activities belong together in the participation of jeevan through the body. They carry understanding into the awakened human tradition on the next slide.</w:t>
+      </w:r>
+    </w:p>
+    <w:p>
+      <w:pPr>
+        <w:pStyle w:val="Heading2"/>
+      </w:pPr>
+      <w:r>
+        <w:t>Primary-text background</w:t>
+      </w:r>
+    </w:p>
+    <w:p>
+      <w:r>
+        <w:t>The general scope is unit expression according to state, motion, developmental plane, and order (SB p. 179), and all units’ expressions as activity saturated in Omnipresence (MVD p. 109). The human definitions are PS p. 119 for prakashan, p. 206 for sampreshana, and p. 22 for abhivyakti. The definition of abhivyakti itself includes prakashan and the participation of hope, thought, desire, resolve, experience, and bodily activity.</w:t>
+      </w:r>
+    </w:p>
+    <w:p>
+      <w:r>
+        <w:t>MVD pp. 109–110 connects form activity, word activity, inherent meaning, and communication as understanding and enabling understanding. MVD p. 328 brings realisation-based expression, communication, and exposition together under ultimate bliss. These connections support a coherent account without assigning each term exclusively to one faculty pair.</w:t>
+      </w:r>
+    </w:p>
+    <w:p>
+      <w:r>
+        <w:t>PS p. 56 defines kala through making qualities evident and expression meaningful, and the joint accomplishment of usefulness and beauty. Its object-value application, kala-mulya, concerns enhancing usefulness; the general definition also concerns communication and conduct. All PS page numbers are printed pages in the edition identified at the start of this companion. Study §1.13 and Editorial Notes give the connected reading and contextual qualifications.</w:t>
+      </w:r>
+    </w:p>
+    <w:p>
+      <w:pPr>
+        <w:pStyle w:val="Heading2"/>
+      </w:pPr>
+      <w:r>
+        <w:t>Likely questions from the audience</w:t>
+      </w:r>
+    </w:p>
+    <w:p>
+      <w:r>
+        <w:rPr>
+          <w:b/>
+        </w:rPr>
+        <w:t>Q: Does each term add a new layer to the unit’s image?</w:t>
+      </w:r>
+    </w:p>
+    <w:p>
+      <w:r>
+        <w:t>The sources do not establish three successive layers or an exhaustive partition of manifestness. The terms overlap, and abhivyakti’s definition includes prakashan. Their human definitions specify meaningful presentation, indication of completeness, and expression for all-round resolution.</w:t>
+      </w:r>
+    </w:p>
+    <w:p>
+      <w:r>
+        <w:rPr>
+          <w:b/>
+        </w:rPr>
+        <w:t>Q: Can we map presentation to vritti–chitta, communication to chitta–buddhi, and expression to buddhi–atma?</w:t>
+      </w:r>
+    </w:p>
+    <w:p>
+      <w:r>
+        <w:t>The reviewed definitions do not establish that exclusive assignment. MVD p. 328 uses all three together for realisation-based ultimate bliss, and abhivyakti involves the full activity of jeevan through the body. The faculty harmonies on slide 19 remain distinct definitions.</w:t>
+      </w:r>
+    </w:p>
+    <w:p>
+      <w:r>
+        <w:rPr>
+          <w:b/>
+        </w:rPr>
+        <w:t>Q: Does kala mean decoration?</w:t>
+      </w:r>
+    </w:p>
+    <w:p>
+      <w:r>
+        <w:t>Its definition joins usefulness and beauty and makes expression meaningful. A clear explanation or accomplished piece of work can evidence it. Object art value is one application of this broader account.</w:t>
+      </w:r>
+    </w:p>
+    <w:p>
+      <w:pPr>
+        <w:pStyle w:val="Heading1"/>
+      </w:pPr>
+      <w:r>
+        <w:t>Slide 27</w:t>
       </w:r>
     </w:p>
     <w:p>
@@ -4630,7 +4724,7 @@
         <w:pStyle w:val="Heading1"/>
       </w:pPr>
       <w:r>
-        <w:t>Slide 27</w:t>
+        <w:t>Slide 28</w:t>
       </w:r>
     </w:p>
     <w:p>
@@ -4742,7 +4836,7 @@
         <w:pStyle w:val="Heading1"/>
       </w:pPr>
       <w:r>
-        <w:t>Slide 28</w:t>
+        <w:t>Slide 29</w:t>
       </w:r>
     </w:p>
     <w:p>

</xml_diff>

<commit_message>
Correct ontology synthesis and align comparative study material
</commit_message>
<xml_diff>
--- a/Studies/The-Ontology-of-Coexistence/Presenters-Companion-Ontology-of-Existence.docx
+++ b/Studies/The-Ontology-of-Coexistence/Presenters-Companion-Ontology-of-Existence.docx
@@ -429,12 +429,12 @@
     </w:p>
     <w:p>
       <w:r>
-        <w:t>First: what is real, and how it is ordered. There is an all-pervasive ground and countable units, and two bonds — each unit to the ground, and each unit to the others. The second of those is complementarity, and it is given rather than made: because there are many bounded things in one ground, each stands in definite relation to the rest. Each unit has a definite form, capacities, a way of participating, and an inseparable innateness, and these show up in mutual relations across four orders of nature. Because no unit can be separated from the ground, existence itself neither begins nor ends.</w:t>
-      </w:r>
-    </w:p>
-    <w:p>
-      <w:r>
-        <w:t>Second: how development proceeds along two lines that must not be collapsed. And the reason it proceeds at all — the drive is to fulfil that complementarity. One line builds larger configurations — particles, molecules, cells, bodies — but never exceeds the order of the things it is built from. The other is development in an atom that can become a complete sentient unit. Across both, activity is effort, motion, and result together — not three separate steps.</w:t>
+        <w:t>First: what is real, and how it is ordered. There is an all-pervasive ground and countable units, and two bonds — each unit to the ground, and each unit to the others. The second of those is complementarity: each unit stands in definite relations to the rest. Every unit has form, capacities, a way of participating, and an inseparable innateness, expressed across four orders of nature. The darshan connects their inseparability from the ground with its claim that existence neither begins nor ends.</w:t>
+      </w:r>
+    </w:p>
+    <w:p>
+      <w:r>
+        <w:t>Second: how development proceeds along two lines. Composition forms molecules, cells and bodies; material constituents can enter pranic organisation and return to the material order through disintegration. This does not by itself produce a sentient unit. Development in an atom reaches constitutional completeness as jeevan. Across both lines, activity includes effort, motion and result together.</w:t>
       </w:r>
     </w:p>
     <w:p>
@@ -889,7 +889,7 @@
     </w:p>
     <w:p>
       <w:r>
-        <w:t xml:space="preserve">Naming tensions: Editorial Notes in the study. Inter-unit distance held in </w:t>
+        <w:t xml:space="preserve">Source-defined names and translation risks: MVD p. 35 and Editorial Notes in the study. Inter-unit distance held in </w:t>
       </w:r>
       <w:r>
         <w:rPr>
@@ -1085,7 +1085,7 @@
     </w:p>
     <w:p>
       <w:r>
-        <w:t>The derivation from permeability, and non-annihilation as its corollary: “Being soaked itself is forcefulness. It becomes clear that units are soaked because Omnipotence is permeating. No matter how many times we divide a unit, each fragment remains submerged, surrounded, and soaked. It also becomes clear that a unit cannot be annihilated.” — SB, p. 57. The three aspects taken together, with permeativeness inferred from soakedness: SB, p. 243.</w:t>
+        <w:t>The source connects permeability with non-annihilation: “Being soaked itself is forcefulness. It becomes clear that units are soaked because Omnipotence is permeating. No matter how many times we divide a unit, each fragment remains submerged, surrounded, and soaked. It also becomes clear that a unit cannot be annihilated.” — SB, p. 57. Division leaves each fragment saturated; whether this establishes every form of persistence is a further philosophical question. The three aspects taken together, with permeativeness inferred from soakedness: SB, p. 243.</w:t>
       </w:r>
     </w:p>
     <w:p>
@@ -1176,7 +1176,7 @@
     </w:p>
     <w:p>
       <w:r>
-        <w:t xml:space="preserve">The texts treat it as ontological endowment. Relative energy — what physics measures — appears in mutuality of units. Do not identify </w:t>
+        <w:t xml:space="preserve">The texts treat it as ontological endowment. Relative energy appears in unit-mutuality and includes named phenomena such as heat, sound, and electricity. Comparing those terms with measured physical quantities requires a further account; </w:t>
       </w:r>
       <w:r>
         <w:rPr>
@@ -1185,7 +1185,7 @@
         <w:t>satta</w:t>
       </w:r>
       <w:r>
-        <w:t>'s uniform energy with a physical field.</w:t>
+        <w:t>'s uniform energy is not thereby identified with a physical field.</w:t>
       </w:r>
     </w:p>
     <w:p>
@@ -1259,7 +1259,7 @@
     </w:p>
     <w:p>
       <w:r>
-        <w:t>If no division of a unit can put any fragment outside the ground, then nothing that exists can be annihilated. And nothing arises from non-being either. So existence does not begin and does not end. What begins and ends is composition — particular arrangements of units.</w:t>
+        <w:t>Division leaves every fragment saturated in the ground. Madhyasth Darshan connects this inseparability with its claim that what exists is not annihilated and does not arise from non-being. Existence is perpetual; particular arrangements of units begin and end. The doctrine is explicit, although inseparability alone does not independently prove every claim of persistence.</w:t>
       </w:r>
     </w:p>
     <w:p>
@@ -1287,7 +1287,7 @@
     </w:p>
     <w:p>
       <w:r>
-        <w:t>Non-annihilation follows from permeability: “Being soaked itself is forcefulness. It becomes clear that units are soaked because Omnipotence is permeating. No matter how many times we divide a unit, each fragment remains submerged, surrounded, and soaked. It also becomes clear that a unit cannot be annihilated.” — SB, p. 57</w:t>
+        <w:t>The primary connection between permeability and non-annihilation: “Being soaked itself is forcefulness. It becomes clear that units are soaked because Omnipotence is permeating. No matter how many times we divide a unit, each fragment remains submerged, surrounded, and soaked. It also becomes clear that a unit cannot be annihilated.” — SB, p. 57</w:t>
       </w:r>
     </w:p>
     <w:p>
@@ -1385,7 +1385,7 @@
     </w:p>
     <w:p>
       <w:r>
-        <w:t>Conservation laws are quantitative statements within physics. MD's claim is ontological: no unit stands outside what it is saturated in. The two are compatible and mutually suggestive, but they are not the same claim, and the study does not treat physics as proving the ontology.</w:t>
+        <w:t>Conservation laws state quantitative relations within physics. MD asserts that what exists does not become non-existent. That stronger ontological claim cannot be derived from conservation laws alone; identifying its units with physical particles would require further argument.</w:t>
       </w:r>
     </w:p>
     <w:p>
@@ -1638,7 +1638,7 @@
     </w:p>
     <w:p>
       <w:r>
-        <w:t>Essential nature is usefulness in context: vitalising while the living organisation holds; devitalising when it breaks down.</w:t>
+        <w:t>Essential nature is usefulness in mutuality. The peepal's effects are vitalising or devitalising according to the affected body and conditions. Its being alive or decomposing does not alone decide which effect it has on another body.</w:t>
       </w:r>
     </w:p>
     <w:p>
@@ -1866,7 +1866,7 @@
     </w:p>
     <w:p>
       <w:r>
-        <w:t>Two kinds of mutuality matter. A relationship is mutuality whose expectations are definite in the completeness of the bond — parent and child. A contact (</w:t>
+        <w:t>Two kinds of mutuality matter. A relationship carries definite expectations towards completeness — parent and child, for example. In a contact (</w:t>
       </w:r>
       <w:r>
         <w:rPr>
@@ -1875,7 +1875,7 @@
         <w:t>sampark</w:t>
       </w:r>
       <w:r>
-        <w:t>) is mutuality where expectations are voluntary — neighbours who share a wall.</w:t>
+        <w:t>), the particular exchange is voluntarily undertaken, as when neighbours agree to share the upkeep of a wall. Both remain answerable to justice and humane conduct.</w:t>
       </w:r>
     </w:p>
     <w:p>
@@ -1926,7 +1926,7 @@
     </w:p>
     <w:p>
       <w:r>
-        <w:t xml:space="preserve">The thirty-value canon follows the study's §1.4 table and </w:t>
+        <w:t xml:space="preserve">The thirty-value enumeration is explicit in </w:t>
       </w:r>
       <w:r>
         <w:rPr>
@@ -1935,7 +1935,16 @@
         <w:t>Paribhasha Samhita</w:t>
       </w:r>
       <w:r>
-        <w:t xml:space="preserve"> pp. 151, 154, matching Axiology §1.3. The English translation of MVD uses </w:t>
+        <w:t xml:space="preserve"> pp. 151, 154; definitions and connections are developed across several passages. </w:t>
+      </w:r>
+      <w:r>
+        <w:rPr>
+          <w:i/>
+        </w:rPr>
+        <w:t>Manav Abhyas Darshan</w:t>
+      </w:r>
+      <w:r>
+        <w:t xml:space="preserve">, native-reader p. 30, gives the principal nine established values and their paired expressions. The English translation of MVD uses </w:t>
       </w:r>
       <w:r>
         <w:rPr>
@@ -1953,16 +1962,7 @@
         <w:t>shishta-mulya</w:t>
       </w:r>
       <w:r>
-        <w:t xml:space="preserve">; this companion treats them as the expressed pair of the established values. The primary texts distribute these explanations across passages on production, relationship, </w:t>
-      </w:r>
-      <w:r>
-        <w:rPr>
-          <w:i/>
-        </w:rPr>
-        <w:t>jeevan</w:t>
-      </w:r>
-      <w:r>
-        <w:t>, and humane conduct rather than giving one closed list in a single place.</w:t>
+        <w:t>; this companion treats them as the expressed pair of the established values. See the study's §1.4 and Axiology §1.3.</w:t>
       </w:r>
     </w:p>
     <w:p>
@@ -2623,7 +2623,7 @@
     </w:p>
     <w:p>
       <w:r>
-        <w:t>T1 is constitutional completeness: the immortality of result. A developing atom becomes a sentient unit — jeevan. Status shifts from physicochemical to what the texts call delusional — meaning the body is mistaken for the self. That is a stage label, not a psychiatric diagnosis.</w:t>
+        <w:t>T1 is constitutional completeness: the immortality of result. A developing atom becomes a sentient unit — jeevan. Its standing changes from physicochemical to sentient before realisation, on what the texts call the delusional plane. In human living, delusion means mistaking the body for the self. In animal living, expression is limited by the bodily medium. The plane name should not turn that limitation into a human error or a psychiatric diagnosis.</w:t>
       </w:r>
     </w:p>
     <w:p>
@@ -2799,19 +2799,10 @@
         <w:rPr>
           <w:b/>
         </w:rPr>
-        <w:t>Progressions</w:t>
-      </w:r>
-      <w:r>
-        <w:t xml:space="preserve"> — existential, way of existence, development, awakening — say how the drive </w:t>
-      </w:r>
-      <w:r>
-        <w:rPr>
-          <w:i/>
-        </w:rPr>
-        <w:t>moves</w:t>
-      </w:r>
-      <w:r>
-        <w:t>. The first names the definite sequence in which the orders become manifest; the second, the conformance by which each order keeps its conduct; the third, physicochemical and atomic development up to T1; the fourth, qualitative development inside a complete sentient unit toward T2 and T3.</w:t>
+        <w:t>Order and development</w:t>
+      </w:r>
+      <w:r>
+        <w:t xml:space="preserve"> are described by four terms: existential progression, way of existence, development progression, and awakening progression. The first names the definite order in which the orders become manifest; the second, the conformance by which each order keeps its conduct; the third, physicochemical and atomic development up to T1; the fourth, qualitative development inside a complete sentient unit toward T2 and T3.</w:t>
       </w:r>
     </w:p>
     <w:p>
@@ -2869,12 +2860,12 @@
     </w:p>
     <w:p>
       <w:r>
-        <w:t>Study §1.6 (the completeness drive), §1.9.1 (four progressions), §1.9.2 (four planes, five human types), and the conceptual map's classification key.</w:t>
-      </w:r>
-    </w:p>
-    <w:p>
-      <w:r>
-        <w:t xml:space="preserve">The four progressions are </w:t>
+        <w:t>Study §1.6 (the completeness drive), §1.9.1 (terms for order and development), §1.9.2 (four planes, five human types), and the conceptual map's classification key.</w:t>
+      </w:r>
+    </w:p>
+    <w:p>
+      <w:r>
+        <w:t xml:space="preserve">The four terms for order and development are </w:t>
       </w:r>
       <w:r>
         <w:rPr>
@@ -3150,7 +3141,7 @@
     </w:p>
     <w:p>
       <w:r>
-        <w:t xml:space="preserve">Close but distinct: panpsychism makes every particle a subject; MD does not. Active sentience belongs only to constitutionally complete atoms; what is pervasive is intelligibility in </w:t>
+        <w:t xml:space="preserve">The views differ. Some forms of panpsychism attribute experience to fundamental physical entities; other versions locate it at a wider scale. MD assigns sentience to constitutionally complete atoms. Its pervasive </w:t>
       </w:r>
       <w:r>
         <w:rPr>
@@ -3159,7 +3150,7 @@
         <w:t>satta</w:t>
       </w:r>
       <w:r>
-        <w:t>, not micro-minds.</w:t>
+        <w:t xml:space="preserve"> is actionless, rather than a collection of minds.</w:t>
       </w:r>
     </w:p>
     <w:p>
@@ -3231,7 +3222,7 @@
     </w:p>
     <w:p>
       <w:r>
-        <w:t>MVD pp. 13, 115, 288–289; SB pp. 91–92; JV pp. 20, 54. “Jeevan continues to exist even after death as it does while driving a body.” — JV, p. 20</w:t>
+        <w:t>MVD pp. 13, 115, 288–289; SB pp. 91–92; JV PDF pp. 20, 55 (printed pp. 19, 54). “Jeevan continues to exist even after death as it does while driving a body.” — JV, PDF p. 20</w:t>
       </w:r>
     </w:p>
     <w:p>
@@ -3318,12 +3309,12 @@
     </w:p>
     <w:p>
       <w:r>
-        <w:t>Structurally, the centre is the core self. Around it: resolve, desire, thought, and hope — the texts’ buddhi, chitta, vritti, and mun.</w:t>
-      </w:r>
-    </w:p>
-    <w:p>
-      <w:r>
-        <w:t>Each works outward and inward. Hope selects and tastes. Thought analyses and deliberates. Desire visualises and contemplates — and directly apprehends. Resolve resolves and comprehends. The core self authenticates and realises. Tasting at hope has three orientations: sensory, value-based, and goal-based. Awakening changes which of these governs what is accepted. Projection of realisation is authenticity, resolve, visualisation, analysis, and selection into living conduct.</w:t>
+        <w:t>Structurally, atma is the centre. Four faculties surround it: buddhi, chitta, vritti, and mun. The texts distinguish these faculties from their characteristic powers: evidence, resoluteness, desire, thought, and hope.</w:t>
+      </w:r>
+    </w:p>
+    <w:p>
+      <w:r>
+        <w:t>Each characteristic power has outward and inward activities. Mun selects and tastes; vritti analyses and deliberates; chitta visualises and contemplates, including direct apprehension; buddhi resolves and comprehends; atma evidences authenticity and realises. Tasting at mun has three orientations: sensory, value-based, and goal-based. Awakening changes which governs what is accepted. Projection expresses understanding through authenticity, resolve, visualisation, analysis, and selection into living conduct.</w:t>
       </w:r>
     </w:p>
     <w:p>
@@ -3351,25 +3342,43 @@
     </w:p>
     <w:p>
       <w:r>
-        <w:t xml:space="preserve">MVD, p. 78; JV, p. 92; MVD, pp. 13, 82–83, 126, 207–208, 278–279, 286–287. </w:t>
+        <w:t>MVD, p. 78; JV, p. 92; MVD, pp. 13, 82–83, 93, 126, 207–208, 278–279, 286–287. Faculties, characteristic powers, and their paired activities: SB p. 63. Atma's characteristic power, evidence (</w:t>
       </w:r>
       <w:r>
         <w:rPr>
           <w:i/>
         </w:rPr>
-        <w:t>Koshas</w:t>
-      </w:r>
-      <w:r>
-        <w:t xml:space="preserve">: MVD, pp. 49–50. Body mistaken for self: SB, pp. 91–92; JV, p. 93. The study renders the reflective activity of </w:t>
+        <w:t>praman</w:t>
+      </w:r>
+      <w:r>
+        <w:t>), is distinguished from authenticity (</w:t>
       </w:r>
       <w:r>
         <w:rPr>
           <w:i/>
         </w:rPr>
-        <w:t>buddhi</w:t>
-      </w:r>
-      <w:r>
-        <w:t xml:space="preserve"> as comprehension (</w:t>
+        <w:t>pramanikta</w:t>
+      </w:r>
+      <w:r>
+        <w:t xml:space="preserve">) as its projection activity. At the activity level, </w:t>
+      </w:r>
+      <w:r>
+        <w:rPr>
+          <w:i/>
+        </w:rPr>
+        <w:t>bal</w:t>
+      </w:r>
+      <w:r>
+        <w:t xml:space="preserve"> names state and </w:t>
+      </w:r>
+      <w:r>
+        <w:rPr>
+          <w:i/>
+        </w:rPr>
+        <w:t>shakti</w:t>
+      </w:r>
+      <w:r>
+        <w:t xml:space="preserve"> motion; KD §3.8, printed p. 84 supplies the orientation, which the AVD English appendix headings reverse. Body mistaken for self: SB, pp. 91–92; JV, p. 93. The study renders </w:t>
       </w:r>
       <w:r>
         <w:rPr>
@@ -3378,16 +3387,7 @@
         <w:t>bodh</w:t>
       </w:r>
       <w:r>
-        <w:t xml:space="preserve">) and of </w:t>
-      </w:r>
-      <w:r>
-        <w:rPr>
-          <w:i/>
-        </w:rPr>
-        <w:t>chitta</w:t>
-      </w:r>
-      <w:r>
-        <w:t xml:space="preserve"> as direct apprehension (</w:t>
+        <w:t xml:space="preserve"> as comprehension and </w:t>
       </w:r>
       <w:r>
         <w:rPr>
@@ -3396,7 +3396,12 @@
         <w:t>sakshatkar</w:t>
       </w:r>
       <w:r>
-        <w:t>). Tasting forms: PS pp. 40–41; Axiology §1.2.</w:t>
+        <w:t xml:space="preserve"> as direct apprehension. Tasting forms: PS pp. 40–41; Axiology §1.2.</w:t>
+      </w:r>
+    </w:p>
+    <w:p>
+      <w:r>
+        <w:t>The koshas in MVD pp. 49–50 describe manifestations across the orders: annamaya/pranamaya already in material nature, manomaya in pranic nature, anandamaya in animal and deluded human living, and vigyanmaya in awakened human living. They are distinct from these five faculties and from the four planes (study §1.5).</w:t>
       </w:r>
     </w:p>
     <w:p>
@@ -3511,6 +3516,11 @@
     </w:p>
     <w:p>
       <w:r>
+        <w:t>Their fulfilment is cumulative: resolution; resolution with prosperity; these with fearlessness; and all three in coexistence. Each fuller fulfilment retains the preceding content. These are principal correspondences within one life, not separate compartments or a promise that acquiring goods automatically produces peace.</w:t>
+      </w:r>
+    </w:p>
+    <w:p>
+      <w:r>
         <w:t>The living cycle is: reflection feeds projection, and projection feeds deeper reflection — that is what living means here. Continuous happiness is harmony evidenced in resolved living, not a sensory spike.</w:t>
       </w:r>
     </w:p>
@@ -3529,7 +3539,7 @@
     </w:p>
     <w:p>
       <w:r>
-        <w:t>JV, p. 138 (four harmonies). JV, p. 61 (values ladder / five levels). KD §3.12, pp. 110–113 (projection–reflection). SB pairs values with practical routes through justice, orderliness, and realisation. MVD, p. 77 (channelling energies toward awakening).</w:t>
+        <w:t>JV, PDF p. 138 (four harmonies), PDF p. 61 (experienced values and their evidence). KD §3.12, printed p. 112 gives cumulative fulfilment; pp. 110–113 develops projection–reflection. SB pairs values with practical routes through justice, orderliness, and realisation. MVD, p. 77 (channelling energies toward awakening).</w:t>
       </w:r>
     </w:p>
     <w:p>
@@ -3660,16 +3670,7 @@
     </w:p>
     <w:p>
       <w:r>
-        <w:t xml:space="preserve">And one thing awakening is </w:t>
-      </w:r>
-      <w:r>
-        <w:rPr>
-          <w:i/>
-        </w:rPr>
-        <w:t>not</w:t>
-      </w:r>
-      <w:r>
-        <w:t>: it is not preferring the right things, and it is not having the right insight. The next slide is about why.</w:t>
+        <w:t>Awakening requires more than preferring the right things or having an insight that does not guide conduct. The next slide explains how understanding becomes effective in living.</w:t>
       </w:r>
     </w:p>
     <w:p>
@@ -3959,16 +3960,7 @@
     </w:p>
     <w:p>
       <w:r>
-        <w:t xml:space="preserve">The system's answer is that isolated good conduct is genuinely valuable but is not conduct completeness, which requires understanding </w:t>
-      </w:r>
-      <w:r>
-        <w:rPr>
-          <w:i/>
-        </w:rPr>
-        <w:t>and</w:t>
-      </w:r>
-      <w:r>
-        <w:t xml:space="preserve"> continuity in a tradition (§1.6.3, §1.15). It would also say that much of what passes for good conduct is organised around profit, health, and pleasant feeling, and that the difference only becomes visible when relationships are actually evaluated.</w:t>
+        <w:t>Good conduct is valuable, but conduct completeness means the individual's continuous expression of realised understanding. MVD pp. 15–16 distinguishes completeness in an individual from completeness in society. A person's humane participation helps establish and transmit an awakened tradition; it does not require an already completed universal society. The claim is assessed through understanding, fulfilled relationships and continuity of conduct (§1.6.3, §1.15).</w:t>
       </w:r>
     </w:p>
     <w:p>
@@ -4022,7 +4014,7 @@
         <w:t>sanskar</w:t>
       </w:r>
       <w:r>
-        <w:t>-conformance — achieved through knowing, believing, recognising, and fulfilling, rather than inherited. That last one is why education and tradition matter so much here: they can reproduce confusion just as easily as they can support awakening.</w:t>
+        <w:t>-conformance — conduct follows acquired acceptances and dispositions. These can express delusion or awakened understanding. That is why education and tradition matter: they can reproduce confusion or support awakening.</w:t>
       </w:r>
     </w:p>
     <w:p>
@@ -4267,7 +4259,7 @@
     </w:p>
     <w:p>
       <w:r>
-        <w:t>On the right: how knowing happens within the sentient unit. Hope tastes and selects. Thought deliberates. Desire contemplates and directly apprehends. Resolve comprehends and resolves. The core self realises through truth. Happiness, peace, contentment, and bliss name harmonies between paired faculties. Realisation at the core is named ultimate bliss.</w:t>
+        <w:t>On the right: how knowing happens within the sentient unit. Mun tastes and selects. Vritti deliberates. Chitta contemplates and directly apprehends. Buddhi comprehends and resolves. Atma realises in truth. Happiness, peace, contentment, and bliss name harmonies between paired faculties. Realisation at atma is named ultimate bliss.</w:t>
       </w:r>
     </w:p>
     <w:p>
@@ -4630,7 +4622,7 @@
     </w:p>
     <w:p>
       <w:r>
-        <w:t>The drive comes to rest in awakened human beings — effort settled, understanding proven in daily conduct, and carried as a tradition.</w:t>
+        <w:t>Conduct completeness is realised understanding expressed continuously by the individual. Humane participation and education transmit it through an awakened tradition. Individual completeness contributes to social completeness; it does not wait for the entire society to be complete.</w:t>
       </w:r>
     </w:p>
     <w:p>
@@ -4645,7 +4637,7 @@
     </w:p>
     <w:p>
       <w:r>
-        <w:t>Five dimensions of continuity carry the tradition: education and formative culture; justice and preservation; health and restraint; production and work; exchange and storage.</w:t>
+        <w:t>Five social systems carry that continuity: education and formative culture; justice and preservation; health and restraint; production and work; exchange and storage. These differ from the four dimensions of a person's living — realisation, thought, behaviour and work.</w:t>
       </w:r>
     </w:p>
     <w:p>
@@ -4655,7 +4647,7 @@
     </w:p>
     <w:p>
       <w:r>
-        <w:t>This is not an ideal bolted onto matter. On this account, the progression is designed to arrive here. Nature saturated in Omnipresence is bound for development until realisation. An awakened human tradition is what that progression delivers.</w:t>
+        <w:t>MD connects this social aim with human dharma as happiness, values fulfilled in relationships, and understanding expressed in conduct. Nature is oriented towards development and realisation; an awakened human tradition requires people to understand, practise, and transmit that understanding. The ontology gives this participation a purpose without making humane institutions automatic.</w:t>
       </w:r>
     </w:p>
     <w:p>
@@ -4668,7 +4660,7 @@
     </w:p>
     <w:p>
       <w:r>
-        <w:t>JV, p. 61; MVD, pp. 13–15; SB, pp. 51, 81, 91. Five dimensions: study §1.15 and governance-related works in the series. SB on operating scale of self-sustaining systems (100–200 families) if useful for Q&amp;A.</w:t>
+        <w:t>JV, PDF p. 61; MVD, pp. 13–16; SB, pp. 51, 81, 91. Individual and social completeness are distinguished in MVD pp. 15–16. Five social systems: study §1.15 and governance-related works in the series. SB on operating scale of self-sustaining systems (100–200 families) if useful for Q&amp;A.</w:t>
       </w:r>
     </w:p>
     <w:p>
@@ -4716,7 +4708,7 @@
     </w:p>
     <w:p>
       <w:r>
-        <w:t>By composition under recognised relationships — the same persist-or-decline rule, expressed institutionally across the five dimensions.</w:t>
+        <w:t>Through coordinated participation in recognised relationships, expressed institutionally across the five social systems. Social continuity requires continued fulfilment; it is not a chemical composition of persons.</w:t>
       </w:r>
     </w:p>
     <w:p>

</xml_diff>

<commit_message>
Improve ontology teaching order and consolidate editorial notes
</commit_message>
<xml_diff>
--- a/Studies/The-Ontology-of-Coexistence/Presenters-Companion-Ontology-of-Existence.docx
+++ b/Studies/The-Ontology-of-Coexistence/Presenters-Companion-Ontology-of-Existence.docx
@@ -462,7 +462,7 @@
     </w:p>
     <w:p>
       <w:r>
-        <w:t>The three-movement framing is a teaching scaffold for §1, not a separate textual division. Compositional vs atomic development: study §1.6; KD 3.2–3.3. Joint form without identity of process: §1.7; MVD pp. 13, 115.</w:t>
+        <w:t>The three-movement framing is a teaching scaffold for §1, not a separate textual division. Compositional vs atomic development: study §1.7; KD 3.2–3.3. Joint form without identity of process: §1.8; MVD pp. 13, 115.</w:t>
       </w:r>
     </w:p>
     <w:p>
@@ -744,7 +744,7 @@
     </w:p>
     <w:p>
       <w:r>
-        <w:t>Companion conceptual map materials under this study folder (SVG/PDF) mirror §1. Primary pointers: MVD, KD, SB, JV as footered on the slide. Two developments and T1–T3: §1.6–§1.6.1; joint form: §1.7; the four classification vocabularies: §1.9.</w:t>
+        <w:t>Companion conceptual map materials under this study folder (SVG/PDF) mirror §1. Primary pointers: MVD, KD, SB, JV as footered on the slide. Two developments and T1–T3: §§1.7, 1.11; joint form: §1.8; the four classification vocabularies: §1.12.</w:t>
       </w:r>
     </w:p>
     <w:p>
@@ -1211,7 +1211,7 @@
     </w:p>
     <w:p>
       <w:r>
-        <w:t>The claim is about what exists, not about the persistence of a particular configuration. Reactions transform arrangements. The study is explicit that this ontological claim is not the same as, and is not proved by, conservation of quantity (§1.14, §6.2).</w:t>
+        <w:t>The claim is about what exists, not about the persistence of a particular configuration. Reactions transform arrangements. The study is explicit that this ontological claim is not the same as, and is not proved by, conservation of quantity (§1.4, §6.2).</w:t>
       </w:r>
     </w:p>
     <w:p>
@@ -1292,12 +1292,12 @@
     </w:p>
     <w:p>
       <w:r>
-        <w:t>Perpetuity of existence, and the world's reality alongside the ground: SB p. 70; JV p. 18. “Brahma is truth, the world is perpetual” — study §1.14, where it is contrasted with the Advaita reading developed in §2.</w:t>
-      </w:r>
-    </w:p>
-    <w:p>
-      <w:r>
-        <w:t xml:space="preserve">Omnipresence as sustaining rather than efficient cause: SB pp. 48–49; study §1.14. Time as duration of unit-activity: study §1.14, with the full treatment of </w:t>
+        <w:t>Perpetuity of existence, and the world's reality alongside the ground: SB p. 70; JV p. 18. “Brahma is truth, the world is perpetual” — study §1.4, where it is contrasted with the Advaita reading developed in §2.</w:t>
+      </w:r>
+    </w:p>
+    <w:p>
+      <w:r>
+        <w:t xml:space="preserve">Omnipresence as sustaining rather than efficient cause: SB pp. 48–49; study §1.4. Time as duration of unit-activity: study §1.4, with the full treatment of </w:t>
       </w:r>
       <w:r>
         <w:rPr>
@@ -1338,7 +1338,7 @@
         <w:t>jeevan</w:t>
       </w:r>
       <w:r>
-        <w:t>'s constitutional completeness (§1.6.1). The second is a further and stronger claim, and is not established by the first.</w:t>
+        <w:t>'s constitutional completeness (§1.7.1). The second is a further and stronger claim, and is not established by the first.</w:t>
       </w:r>
     </w:p>
     <w:p>
@@ -1514,12 +1514,12 @@
     </w:p>
     <w:p>
       <w:r>
-        <w:t>Recognition below the human order is not reflective cognition; the heat, particle-distance, and atomic-combination examples are the study's own (§1.2). Value as essentiality and participation in orderliness: §1.4.</w:t>
-      </w:r>
-    </w:p>
-    <w:p>
-      <w:r>
-        <w:t>The completeness drive is grounded in these endowments: SB pp. 50–51 — this is the citation behind the closing line of the script. Composition as natural inclination toward coexistence: JV p. 67 (§1.10). Integration at T1 through hungry/undigested (overfull) complementarity: MVD p. 8; SB pp. 58, 71; KD 3.3 (§1.6.1). Justice as recognising relationships, fulfilling values, evaluating the fulfilment, and achieving mutual satisfaction: §1.12.1.</w:t>
+        <w:t>Recognition below the human order is not reflective cognition; the heat, particle-distance, and atomic-combination examples are the study's own (§1.2). Value as essentiality and participation in orderliness: §1.13.1.</w:t>
+      </w:r>
+    </w:p>
+    <w:p>
+      <w:r>
+        <w:t>The completeness drive is grounded in these endowments: SB pp. 50–51 — this is the citation behind the closing line of the script. Composition as natural inclination toward coexistence: JV p. 67 (§1.5). Integration at T1 through hungry/undigested (overfull) complementarity: MVD p. 8; SB pp. 58, 71; KD 3.3 (§1.7.1). Justice as recognising relationships, fulfilling values, evaluating the fulfilment, and achieving mutual satisfaction: §1.13.3.</w:t>
       </w:r>
     </w:p>
     <w:p>
@@ -1558,7 +1558,7 @@
     </w:p>
     <w:p>
       <w:r>
-        <w:t>The claim is that essentiality is objective, not that recognition and evaluation are automatic. Cultures differ in what they recognise and how they evaluate; on this account they are not differing about whether a unit is complementary to others, but about whether they have seen it correctly. The study is explicit that human evaluation can fail (§1.4, §1.12).</w:t>
+        <w:t>The claim is that essentiality is objective, not that recognition and evaluation are automatic. Cultures differ in what they recognise and how they evaluate; on this account they are not differing about whether a unit is complementary to others, but about whether they have seen it correctly. The study is explicit that human evaluation can fail (§1.13.1, §1.13.2).</w:t>
       </w:r>
     </w:p>
     <w:p>
@@ -1962,7 +1962,7 @@
         <w:t>shishta-mulya</w:t>
       </w:r>
       <w:r>
-        <w:t>; this companion treats them as the expressed pair of the established values. See the study's §1.4 and Axiology §1.3.</w:t>
+        <w:t>; this companion treats them as the expressed pair of the established values. See the study's §1.13.1 and Axiology §1.3.</w:t>
       </w:r>
     </w:p>
     <w:p>
@@ -2253,7 +2253,7 @@
     </w:p>
     <w:p>
       <w:r>
-        <w:t>SB, p. 62 chain; goals: SB, p. 71; MVD, p. 104. Span: SB, pp. 51, 91. Two developments: study §1.6; KD 3.2–3.3.</w:t>
+        <w:t>SB, p. 62 chain; goals: SB, p. 71; MVD, p. 104. Span: SB, pp. 51, 91. Two developments: study §1.7; KD 3.2–3.3.</w:t>
       </w:r>
     </w:p>
     <w:p>
@@ -2482,7 +2482,7 @@
     </w:p>
     <w:p>
       <w:r>
-        <w:t>SB, p. 55 places constitutional completeness in the atom; SB, pp. 76–77 classify material and biological compositions as insentient and animal and knowledge orders as joint expressions. Study §§1.5–1.6, 1.9.</w:t>
+        <w:t>SB, p. 55 places constitutional completeness in the atom; SB, pp. 76–77 classify material and biological compositions as insentient and animal and knowledge orders as joint expressions. Study §§1.6–1.7, 1.12.</w:t>
       </w:r>
     </w:p>
     <w:p>
@@ -2860,7 +2860,7 @@
     </w:p>
     <w:p>
       <w:r>
-        <w:t>Study §1.6 (the completeness drive), §1.9.1 (terms for order and development), §1.9.2 (four planes, five human types), and the conceptual map's classification key.</w:t>
+        <w:t>Study §§1.7, 1.11 (the completeness drive), §1.12.1 (terms for order and development), §1.12.2 (four planes, five human types), and the conceptual map's classification key.</w:t>
       </w:r>
     </w:p>
     <w:p>
@@ -2901,22 +2901,22 @@
         <w:t>jagriti-kram</w:t>
       </w:r>
       <w:r>
-        <w:t xml:space="preserve"> (awakening progression): MVD, pp. 13–14; study §1.9.1.</w:t>
-      </w:r>
-    </w:p>
-    <w:p>
-      <w:r>
-        <w:t>The four planes are physicochemical, delusional, deific, and divine or complete: study §1.9.2. Order vs plane asymmetry: SB, p. 52 — two orders can share one plane; one order can span three planes.</w:t>
-      </w:r>
-    </w:p>
-    <w:p>
-      <w:r>
-        <w:t>The five human types are animalistic-human, demonic-human, humane or discerning human, deific-human, and divine-human: MVD, p. 160; study §1.9.2.</w:t>
-      </w:r>
-    </w:p>
-    <w:p>
-      <w:r>
-        <w:t>Note for the presenter: an earlier version of this slide had the plane and progression labels swapped, and listed a set of “planes” (substance, life, intellectual, experiential) that appears nowhere in the study — those are the four orders under another naming. It also ended the human-type list with “transcendental,” which is not a term in this corpus. The table now follows §1.9.1–§1.9.2 exactly. If you have delivered the old version, this is the correction to flag.</w:t>
+        <w:t xml:space="preserve"> (awakening progression): MVD, pp. 13–14; study §1.12.1.</w:t>
+      </w:r>
+    </w:p>
+    <w:p>
+      <w:r>
+        <w:t>The four planes are physicochemical, delusional, deific, and divine or complete: study §1.12.2. Order vs plane asymmetry: SB, p. 52 — two orders can share one plane; one order can span three planes.</w:t>
+      </w:r>
+    </w:p>
+    <w:p>
+      <w:r>
+        <w:t>The five human types are animalistic-human, demonic-human, humane or discerning human, deific-human, and divine-human: MVD, p. 160; study §1.12.2.</w:t>
+      </w:r>
+    </w:p>
+    <w:p>
+      <w:r>
+        <w:t>Note for the presenter: an earlier version of this slide had the plane and progression labels swapped, and listed a set of “planes” (substance, life, intellectual, experiential) that appears nowhere in the study — those are the four orders under another naming. It also ended the human-type list with “transcendental,” which is not a term in this corpus. The table now follows §1.12.1–§1.12.2 exactly. If you have delivered the old version, this is the correction to flag.</w:t>
       </w:r>
     </w:p>
     <w:p>
@@ -3054,7 +3054,7 @@
     </w:p>
     <w:p>
       <w:r>
-        <w:t xml:space="preserve">Continuity beyond the body and later association with another body: study §1.8, §1.14; JV as cited there. The study keeps this apart from general indestructibility (slide 7): constitutional completeness is MD's </w:t>
+        <w:t xml:space="preserve">Continuity beyond the body and later association with another body: study §§1.7.1, 1.9; JV as cited there. The study keeps this apart from general indestructibility (slide 7): constitutional completeness is MD's </w:t>
       </w:r>
       <w:r>
         <w:rPr>
@@ -3401,7 +3401,7 @@
     </w:p>
     <w:p>
       <w:r>
-        <w:t>The koshas in MVD pp. 49–50 describe manifestations across the orders: annamaya/pranamaya already in material nature, manomaya in pranic nature, anandamaya in animal and deluded human living, and vigyanmaya in awakened human living. They are distinct from these five faculties and from the four planes (study §1.5).</w:t>
+        <w:t>The koshas in MVD pp. 49–50 describe manifestations across the orders: annamaya/pranamaya already in material nature, manomaya in pranic nature, anandamaya in animal and deluded human living, and vigyanmaya in awakened human living. They are distinct from these five faculties and from the four planes (study §1.6).</w:t>
       </w:r>
     </w:p>
     <w:p>
@@ -3544,7 +3544,7 @@
     </w:p>
     <w:p>
       <w:r>
-        <w:t>Study §1.8 locates happiness at mun, peace at vritti, contentment at chitta, and bliss at buddhi, each through harmony with the inward faculty. MVD pp. 100–101 distinguishes ultimate bliss at realised atma; MVD pp. 328–346 enumerates the faculty activities. The knowledge-order ladder should not be extended to animals merely from the presence of the same faculties.</w:t>
+        <w:t>Study §1.9 locates happiness at mun, peace at vritti, contentment at chitta, and bliss at buddhi, each through harmony with the inward faculty. MVD pp. 100–101 distinguishes ultimate bliss at realised atma; MVD pp. 328–346 enumerates the faculty activities. The knowledge-order ladder should not be extended to animals merely from the presence of the same faculties.</w:t>
       </w:r>
     </w:p>
     <w:p>
@@ -3683,7 +3683,7 @@
     </w:p>
     <w:p>
       <w:r>
-        <w:t>SB, p. 64 (cognisance–sensitivity balance); JV, pp. 73–74, 92–94 (four-and-a-half activities); MVD, pp. 274–275; study §§1.7–1.8, 1.10, 1.12, 1.15.</w:t>
+        <w:t>SB, p. 64 (cognisance–sensitivity balance); JV, pp. 73–74, 92–94 (four-and-a-half activities); MVD, pp. 274–275; study §§1.8–1.9, 1.13, 1.15.</w:t>
       </w:r>
     </w:p>
     <w:p>
@@ -3706,7 +3706,7 @@
         <w:t>mun</w:t>
       </w:r>
       <w:r>
-        <w:t>; the animal body provides for hope-bound, species-conformant expression without providing for the complete evidence of understanding (study §§1.5, 1.7). The four-and-a-half activities organised around bodily sensitivity in deluded human living: study §1.7; JV, pp. 73–74, 92–94.</w:t>
+        <w:t>; the animal body provides for hope-bound, species-conformant expression without providing for the complete evidence of understanding (study §§1.6, 1.8). The four-and-a-half activities organised around bodily sensitivity in deluded human living: study §1.8; JV, pp. 73–74, 92–94.</w:t>
       </w:r>
     </w:p>
     <w:p>
@@ -3886,7 +3886,7 @@
         <w:t>jeevan</w:t>
       </w:r>
       <w:r>
-        <w:t xml:space="preserve"> values (study §1.8), and the study is explicit that they correspond to widening fields of </w:t>
+        <w:t xml:space="preserve"> values (study §1.9), and the study is explicit that they correspond to widening fields of </w:t>
       </w:r>
       <w:r>
         <w:rPr>
@@ -3895,12 +3895,12 @@
         <w:t>evidence</w:t>
       </w:r>
       <w:r>
-        <w:t xml:space="preserve"> — resolution in the person, peace tested in family prosperity, contentment in fearless social participation, bliss in the living and communicating of coexistence. Evidence requires projection, and projection is conduct. Hence KD's insistence that book knowledge is not the completion of the process: “Study, practice, work, behaviour, result, and purpose must become coherent” (study §1.8). Definite fulfilment below the human order: study §§1.4, 1.11 — recognition and fulfilment are definite according to structural, seed, and species conformance.</w:t>
-      </w:r>
-    </w:p>
-    <w:p>
-      <w:r>
-        <w:t>Also relevant: “Living proof requires understanding to become conduct; insight that does not regulate action has not completed the projection–reflection cycle” (study §1.7.1).</w:t>
+        <w:t xml:space="preserve"> — resolution in the person, peace tested in family prosperity, contentment in fearless social participation, bliss in the living and communicating of coexistence. Evidence requires projection, and projection is conduct. Hence KD's insistence that book knowledge is not the completion of the process: “Study, practice, work, behaviour, result, and purpose must become coherent” (study §1.9). Definite fulfilment below the human order: study §§1.13.1, 1.6.1 — recognition and fulfilment are definite according to structural, seed, and species conformance.</w:t>
+      </w:r>
+    </w:p>
+    <w:p>
+      <w:r>
+        <w:t>Also relevant: “Living proof requires understanding to become conduct; insight that does not regulate action has not completed the projection–reflection cycle” (study §1.10).</w:t>
       </w:r>
     </w:p>
     <w:p>
@@ -3947,7 +3947,7 @@
     </w:p>
     <w:p>
       <w:r>
-        <w:t>Because action without truthful understanding reproduces the confusion it came from — the study's phrase is that projection without truthful understanding can reproduce delusion (§1.6.3). The claim is not that study is unnecessary. It is that study is half. Reflection without projection remains unevidenced; projection without reflection goes wrong.</w:t>
+        <w:t>Because action without truthful understanding reproduces the confusion it came from — the study's phrase is that projection without truthful understanding can reproduce delusion (§1.11.2). The claim is not that study is unnecessary. It is that study is half. Reflection without projection remains unevidenced; projection without reflection goes wrong.</w:t>
       </w:r>
     </w:p>
     <w:p>
@@ -3960,7 +3960,7 @@
     </w:p>
     <w:p>
       <w:r>
-        <w:t>Good conduct is valuable, but conduct completeness means the individual's continuous expression of realised understanding. MVD pp. 15–16 distinguishes completeness in an individual from completeness in society. A person's humane participation helps establish and transmit an awakened tradition; it does not require an already completed universal society. The claim is assessed through understanding, fulfilled relationships and continuity of conduct (§1.6.3, §1.15).</w:t>
+        <w:t>Good conduct is valuable, but conduct completeness means the individual's continuous expression of realised understanding. MVD pp. 15–16 distinguishes completeness in an individual from completeness in society. A person's humane participation helps establish and transmit an awakened tradition; it does not require an already completed universal society. The claim is assessed through understanding, fulfilled relationships and continuity of conduct (§1.11.2, §1.15).</w:t>
       </w:r>
     </w:p>
     <w:p>
@@ -4056,7 +4056,7 @@
         <w:t>sanskar</w:t>
       </w:r>
       <w:r>
-        <w:t xml:space="preserve">-conformance in the study's table (§1.11); human bodily composition remains species-conformant, but human conduct is principally </w:t>
+        <w:t xml:space="preserve">-conformance in the study's table (§1.6.1); human bodily composition remains species-conformant, but human conduct is principally </w:t>
       </w:r>
       <w:r>
         <w:rPr>
@@ -4074,7 +4074,7 @@
         <w:t>sanskar</w:t>
       </w:r>
       <w:r>
-        <w:t>-conformant. The three levels of the account — sustaining condition, mediative nucleus, order-specific conformance — are set out in §1.11.</w:t>
+        <w:t>-conformant. The three levels of the account — sustaining condition, mediative nucleus, order-specific conformance — are set out in §1.6.1.</w:t>
       </w:r>
     </w:p>
     <w:p>
@@ -4176,7 +4176,7 @@
     </w:p>
     <w:p>
       <w:r>
-        <w:t xml:space="preserve">KD, pp. 10, 13, 60, 86; study §1.12–§1.12.1. MVD, p. 67 (six perspectives); MVD, p. 137 (justice regulates behaviour, </w:t>
+        <w:t xml:space="preserve">KD, pp. 10, 13, 60, 86; study §§1.13.2–1.13.3. MVD, p. 67 (six perspectives); MVD, p. 137 (justice regulates behaviour, </w:t>
       </w:r>
       <w:r>
         <w:rPr>
@@ -4295,7 +4295,7 @@
         <w:t>jeevan</w:t>
       </w:r>
       <w:r>
-        <w:t>, and humane conduct); MVD, pp. 78, 101, 137; JV, p. 61; study §§1.3–1.4, 1.7–1.13.</w:t>
+        <w:t>, and humane conduct); MVD, pp. 78, 101, 137; JV, p. 61; study §§1.3, 1.8–1.9, 1.13–1.14.</w:t>
       </w:r>
     </w:p>
     <w:p>
@@ -4392,12 +4392,12 @@
     </w:p>
     <w:p>
       <w:r>
-        <w:t>SB, p. 116 and MVD, p. 126 (threefold knowledge); KD §§3.17–3.18 (knowledge, knower, and known); MVD, pp. 14–15, 286–287. Study §1.13.</w:t>
-      </w:r>
-    </w:p>
-    <w:p>
-      <w:r>
-        <w:t>MVD pp. 100–101 distinguishes ultimate bliss at atma; MVD p. 328 connects realisation-based expression, communication, and exposition with ultimate bliss. Study §§1.8 and 1.13 preserves both this placement and bliss as buddhi–atma harmony.</w:t>
+        <w:t>SB, p. 116 and MVD, p. 126 (threefold knowledge); KD §§3.17–3.18 (knowledge, knower, and known); MVD, pp. 14–15, 286–287. Study §1.14.</w:t>
+      </w:r>
+    </w:p>
+    <w:p>
+      <w:r>
+        <w:t>MVD pp. 100–101 distinguishes ultimate bliss at atma; MVD p. 328 connects realisation-based expression, communication, and exposition with ultimate bliss. Study §§1.9 and 1.14 preserves both this placement and bliss as buddhi–atma harmony.</w:t>
       </w:r>
     </w:p>
     <w:p>
@@ -4545,7 +4545,7 @@
     </w:p>
     <w:p>
       <w:r>
-        <w:t>PS p. 56 defines kala through making qualities evident and expression meaningful, and the joint accomplishment of usefulness and beauty. Its object-value application, kala-mulya, concerns enhancing usefulness; the general definition also concerns communication and conduct. All PS page numbers are printed pages in the edition identified at the start of this companion. Study §1.13 and Editorial Notes give the connected reading and contextual qualifications.</w:t>
+        <w:t>PS p. 56 defines kala through making qualities evident and expression meaningful, and the joint accomplishment of usefulness and beauty. Its object-value application, kala-mulya, concerns enhancing usefulness; the general definition also concerns communication and conduct. All PS page numbers are printed pages in the edition identified at the start of this companion. Study §1.14 and Editorial Notes give the connected reading and contextual qualifications.</w:t>
       </w:r>
     </w:p>
     <w:p>
@@ -4665,7 +4665,7 @@
     </w:p>
     <w:p>
       <w:r>
-        <w:t>Human assemblies as achieved rather than chemically definite: study §1.10, final paragraph; MVD, p. 42; SB, p. 14 (persist or decline). This is the counterpart of slide 13 — the compositional half of §1.10 was delivered there, the relational half here.</w:t>
+        <w:t>Human assemblies as achieved rather than chemically definite: study §1.13.3; MVD, p. 42; SB, p. 14 (persist or decline). This is the counterpart of slide 13 — physical composition (§1.5) was delivered there, human assemblies (§1.13.3) here.</w:t>
       </w:r>
     </w:p>
     <w:p>

</xml_diff>

<commit_message>
Clarify light, manifestness and sentient expression in ontology
</commit_message>
<xml_diff>
--- a/Studies/The-Ontology-of-Coexistence/Presenters-Companion-Ontology-of-Existence.docx
+++ b/Studies/The-Ontology-of-Coexistence/Presenters-Companion-Ontology-of-Existence.docx
@@ -250,7 +250,7 @@
     </w:p>
     <w:p>
       <w:r>
-        <w:t>Coverage claims are scoped to the translated corpus (MVD, SB, JV), KD as cited, and the selected Hindi PS definitions identified in this guide. Other Hindi works may develop these subjects further.</w:t>
+        <w:t>Coverage claims are scoped to the translated corpus (MVD, SB, JV, AVD), KD as cited, and the selected Hindi PS definitions identified in this guide. Other Hindi works may develop these subjects further.</w:t>
       </w:r>
     </w:p>
     <w:p>
@@ -808,7 +808,7 @@
     </w:p>
     <w:p>
       <w:r>
-        <w:t>First, the ground — Omnipresence. Formless, all-pervasive, transparent, permeating, non-transforming, immeasurable. Actionless energy: it acts not at all, yet every unit is energised and regulated in it. There is no place where it is absent.</w:t>
+        <w:t>First, the ground — Omnipresence. Formless, all-pervasive, transparent, permeating, non-transforming, immeasurable. Actionless energy: it acts not at all, yet every unit is energised and regulated in it. There is no place where it is absent. The same pervasive reality is also named jyoti, light; realisation in it is described as enduring prakash.</w:t>
       </w:r>
     </w:p>
     <w:p>
@@ -879,7 +879,7 @@
     </w:p>
     <w:p>
       <w:r>
-        <w:t xml:space="preserve">Source-defined names and translation risks: MVD p. 35 and Editorial Notes in the study. Inter-unit distance held in </w:t>
+        <w:t xml:space="preserve">Source-defined names and translation risks: MVD p. 35 and Editorial Notes in the study. PS p. 137 names Brahm as pervasive reality, uniform satta, knowledge and jyoti; p. 80 defines jyoti through realisation in the pervasive as enduring prakash. This is the source basis of the light vocabulary for the ground. These are connected passages, rather than a verbatim definition equating satta and prakash. Inter-unit distance held in </w:t>
       </w:r>
       <w:r>
         <w:rPr>
@@ -1051,7 +1051,7 @@
     </w:p>
     <w:p>
       <w:r>
-        <w:t>These are connected aspects of one saturation. Energy becomes evident in activity, recognition in mutuality, and regulation in definite conduct. The unit is also manifest to others: the texts connect its manifestness with being force-endowed in Omnipresence.</w:t>
+        <w:t>These are connected aspects of one saturation. Energy becomes evident in activity, recognition in mutuality, and regulation in definite conduct. The ground is named jyoti, light; each unit saturated in it is prakashman, manifest. The texts explicitly connect this manifestness with satta permeating the unit and its being endowed with force. Manifestness belongs to all units, including sentient jeevan.</w:t>
       </w:r>
     </w:p>
     <w:p>
@@ -1118,7 +1118,7 @@
     </w:p>
     <w:p>
       <w:r>
-        <w:t>SB p. 57 associates soakedness with forcefulness, submersion with activeness, and surroundedness with regulation. PS p. 114 associates soakedness with energy-endowment, submersion with mutual recognition, and surroundedness with regulation. These overlap rather than establishing exclusive compartments. SB p. 248 grounds manifestness in force-endowment under saturation. PS p. 121 identifies the image as a basis of mutual recognition. See study §§1.1–1.3 and Editorial Notes.</w:t>
+        <w:t>SB p. 57 associates soakedness with forcefulness, submersion with activeness, and surroundedness with regulation. PS p. 114 associates soakedness with energy-endowment, submersion with mutual recognition, and surroundedness with regulation. These overlap rather than establishing exclusive compartments. AVD pp. 115–116 derives units’ force-endowment, activity and manifestness from satta permeating them; SB p. 248 independently grounds manifestness in force-endowment under saturation. PS pp. 80, 137 supply the connected jyoti/prakash vocabulary for the ground. PS p. 121 identifies the image as a basis of mutual recognition. See study §§1.1–1.3 and Editorial Notes.</w:t>
       </w:r>
     </w:p>
     <w:p>
@@ -1455,7 +1455,7 @@
     </w:p>
     <w:p>
       <w:r>
-        <w:t>The whole unit is manifest, or prakashman, with all four aspects. Imaging is central to prakash. This is a claim about how units are manifest to one another; completed human understanding also requires knowing their relations and fulfilment. An image alone does not deliver that understanding. Animal recognition of essential nature becomes evident in friendliness and opposition; human living brings the exchange of values and evaluation of dharma.</w:t>
+        <w:t>The whole unit is manifest, or prakashman, with all four aspects, grounded in its saturation in satta. In the context of mutuality, prakash names a unit’s imaging. This describes how units are manifest to one another within the wider account of light and manifestness; completed human understanding also requires knowing their relations and fulfilment. An image alone does not deliver that understanding. Animal recognition of essential nature becomes evident in friendliness and opposition; human living brings the exchange of values and evaluation of dharma.</w:t>
       </w:r>
     </w:p>
     <w:p>
@@ -1522,7 +1522,7 @@
     </w:p>
     <w:p>
       <w:r>
-        <w:t>Imaging and prakash: MVD p. 45. Bimb, pratibimb, and pratibimban: PS pp. 121, 135. Being manifest with all four aspects: PS p. 119. Imaging, influence, animal recognition, and human evaluation: SB pp. 248–252. Bearer/property distinction: SB pp. 256–257. SB p. 179 describes entities as manifest, communicated, and expressed according to state, motion, plane, and order. Slide 26 develops the human definitions. The study’s Editorial Notes retain the contextual heated-body definition of prakash in PS p. 119 alongside MVD’s broader imaging formulation.</w:t>
+        <w:t>Prakash in the imaging context: MVD p. 45. The ground’s light vocabulary and the grounding of unit manifestness are established on slides 5–6 from PS pp. 80, 137; AVD pp. 115–116; SB p. 248. Bimb, pratibimb, and pratibimban: PS pp. 121, 135. Being manifest with all four aspects: PS p. 119. Imaging, influence, animal recognition, and human evaluation: SB pp. 248–252. Bearer/property distinction: SB pp. 256–257. SB p. 179 describes entities as manifest, communicated, and expressed according to state, motion, plane, and order. Slide 26 develops the human definitions. The study’s Editorial Notes distinguish the ground’s jyoti/prakash vocabulary, MVD’s imaging formulation and PS p. 119’s heated-body definition. The imaging definition is one context of prakash, not an exhaustive account of the light vocabulary.</w:t>
       </w:r>
     </w:p>
     <w:p>
@@ -4317,7 +4317,7 @@
     </w:p>
     <w:p>
       <w:r>
-        <w:t>Presentation, communication and expression have a scope throughout nature. Every unit makes its characteristic contribution evident according to its state, activity and order. In human living, the same vocabulary also describes the purposeful expression of understanding.</w:t>
+        <w:t>Every unit is prakashman, manifest through its form, properties, essential nature and dharma. Presentation, communication and expression describe this participation throughout nature. In sentient jeevan, manifestness includes its active faculties and the capacities it expresses through the body. Humans already communicate and express their capacities during awakening progression. With awakening, these activities carry realised understanding into meaningful presentation, communication and conduct. The three definitions here describe that fuller human fulfilment.</w:t>
       </w:r>
     </w:p>
     <w:p>
@@ -4342,7 +4342,7 @@
     </w:p>
     <w:p>
       <w:r>
-        <w:t>These activities overlap and work together. In awakened human living they involve jeevan through the body, carrying understanding into conduct and the humane tradition.</w:t>
+        <w:t>These are connected, overlapping aspects of sentient manifestation. Their fulfilment in awakened human living carries realised understanding through the body into conduct and the humane tradition.</w:t>
       </w:r>
     </w:p>
     <w:p>
@@ -4355,7 +4355,7 @@
     </w:p>
     <w:p>
       <w:r>
-        <w:t>The general scope is unit expression according to state, motion, developmental plane, and order (SB p. 179), and all units’ expressions as activity saturated in Omnipresence (MVD p. 109). The human definitions are PS p. 119 for prakashan, p. 206 for sampreshana, and p. 22 for abhivyakti. The definition of abhivyakti itself includes prakashan and the participation of hope, thought, desire, resolve, experience, and bodily activity.</w:t>
+        <w:t>The general scope is unit expression according to state, motion, developmental plane, and order (SB p. 179), and all units’ expressions as activity saturated in Omnipresence (MVD p. 109). The sentient connection is explicit in SB pp. 52, 63, 66, 90–92: jeevan manifests through the body, its faculties are active and manifest, and communication/expression during awakening progression is itself a meaning of prakashmanata (p. 66). The fuller human definitions are PS p. 119 for prakashan, p. 206 for sampreshana, and p. 22 for abhivyakti. The definition of abhivyakti itself includes prakashan and the participation of hope, thought, desire, resolve, experience, and bodily activity.</w:t>
       </w:r>
     </w:p>
     <w:p>
@@ -4374,6 +4374,19 @@
       </w:pPr>
       <w:r>
         <w:t>Likely questions from the audience</w:t>
+      </w:r>
+    </w:p>
+    <w:p>
+      <w:r>
+        <w:rPr>
+          <w:b/>
+        </w:rPr>
+        <w:t>Q: Does sentient expression begin only after awakening?</w:t>
+      </w:r>
+    </w:p>
+    <w:p>
+      <w:r>
+        <w:t>SB p. 66 explicitly describes communication and expression during awakening progression as prakashmanata. Awakening brings their fulfilment as realised understanding and humane conduct. SB p. 179 also preserves the wider use of expression vocabulary across all four orders.</w:t>
       </w:r>
     </w:p>
     <w:p>

</xml_diff>

<commit_message>
Use Prakash for satta in ontology study and teaching material
</commit_message>
<xml_diff>
--- a/Studies/The-Ontology-of-Coexistence/Presenters-Companion-Ontology-of-Existence.docx
+++ b/Studies/The-Ontology-of-Coexistence/Presenters-Companion-Ontology-of-Existence.docx
@@ -808,7 +808,7 @@
     </w:p>
     <w:p>
       <w:r>
-        <w:t>First, the ground — Omnipresence. Formless, all-pervasive, transparent, permeating, non-transforming, immeasurable. Actionless energy: it acts not at all, yet every unit is energised and regulated in it. There is no place where it is absent. The same pervasive reality is also named jyoti, light; realisation in it is described as enduring prakash.</w:t>
+        <w:t>First, the ground — Omnipresence. Formless, all-pervasive, transparent, permeating, non-transforming, immeasurable. Actionless energy: it acts not at all, yet every unit is energised and regulated in it. There is no place where it is absent. The pervasive ground is prakash, light; realisation in it is described as enduring prakash.</w:t>
       </w:r>
     </w:p>
     <w:p>
@@ -879,7 +879,7 @@
     </w:p>
     <w:p>
       <w:r>
-        <w:t xml:space="preserve">Source-defined names and translation risks: MVD p. 35 and Editorial Notes in the study. PS p. 137 names Brahm as pervasive reality, uniform satta, knowledge and jyoti; p. 80 defines jyoti through realisation in the pervasive as enduring prakash. This is the source basis of the light vocabulary for the ground. These are connected passages, rather than a verbatim definition equating satta and prakash. Inter-unit distance held in </w:t>
+        <w:t xml:space="preserve">Source-defined names and translation risks: MVD p. 35 and Editorial Notes in the study. Prakash (Light) is the term used for the pervasive ground in this study. PS p. 137 includes jyoti among the names of Brahm, alongside pervasive reality, uniform satta and knowledge; p. 80 describes realisation in the pervasive as enduring prakash and gives it the name jyoti. Jyoti is retained here to identify the source's wording. These are connected passages, rather than a verbatim definition equating satta and prakash. Inter-unit distance held in </w:t>
       </w:r>
       <w:r>
         <w:rPr>
@@ -1051,7 +1051,7 @@
     </w:p>
     <w:p>
       <w:r>
-        <w:t>These are connected aspects of one saturation. Energy becomes evident in activity, recognition in mutuality, and regulation in definite conduct. The ground is named jyoti, light; each unit saturated in it is prakashman, manifest. The texts explicitly connect this manifestness with satta permeating the unit and its being endowed with force. Manifestness belongs to all units, including sentient jeevan.</w:t>
+        <w:t>These are connected aspects of one saturation. Energy becomes evident in activity, recognition in mutuality, and regulation in definite conduct. The ground is prakash, light; each unit saturated in it is prakashman, manifest. The texts explicitly connect this manifestness with satta permeating the unit and its being endowed with force. Manifestness belongs to all units, including sentient jeevan.</w:t>
       </w:r>
     </w:p>
     <w:p>
@@ -1118,7 +1118,7 @@
     </w:p>
     <w:p>
       <w:r>
-        <w:t>SB p. 57 associates soakedness with forcefulness, submersion with activeness, and surroundedness with regulation. PS p. 114 associates soakedness with energy-endowment, submersion with mutual recognition, and surroundedness with regulation. These overlap rather than establishing exclusive compartments. AVD pp. 115–116 derives units’ force-endowment, activity and manifestness from satta permeating them; SB p. 248 independently grounds manifestness in force-endowment under saturation. PS pp. 80, 137 supply the connected jyoti/prakash vocabulary for the ground. PS p. 121 identifies the image as a basis of mutual recognition. See study §§1.1–1.3 and Editorial Notes.</w:t>
+        <w:t>SB p. 57 associates soakedness with forcefulness, submersion with activeness, and surroundedness with regulation. PS p. 114 associates soakedness with energy-endowment, submersion with mutual recognition, and surroundedness with regulation. These overlap rather than establishing exclusive compartments. AVD pp. 115–116 derives units’ force-endowment, activity and manifestness from satta permeating them; SB p. 248 independently grounds manifestness in force-endowment under saturation. PS pp. 80, 137 supply the connected light vocabulary discussed in slide 5's background; the ground is termed prakash in the teaching account. PS p. 121 identifies the image as a basis of mutual recognition. See study §§1.1–1.3 and Editorial Notes.</w:t>
       </w:r>
     </w:p>
     <w:p>
@@ -1522,7 +1522,7 @@
     </w:p>
     <w:p>
       <w:r>
-        <w:t>Prakash in the imaging context: MVD p. 45. The ground’s light vocabulary and the grounding of unit manifestness are established on slides 5–6 from PS pp. 80, 137; AVD pp. 115–116; SB p. 248. Bimb, pratibimb, and pratibimban: PS pp. 121, 135. Being manifest with all four aspects: PS p. 119. Imaging, influence, animal recognition, and human evaluation: SB pp. 248–252. Bearer/property distinction: SB pp. 256–257. SB p. 179 describes entities as manifest, communicated, and expressed according to state, motion, plane, and order. Slide 26 develops the human definitions. The study’s Editorial Notes distinguish the ground’s jyoti/prakash vocabulary, MVD’s imaging formulation and PS p. 119’s heated-body definition. The imaging definition is one context of prakash, not an exhaustive account of the light vocabulary.</w:t>
+        <w:t>Prakash in the imaging context: MVD p. 45. The ground’s light vocabulary and the grounding of unit manifestness are established on slides 5–6 from PS pp. 80, 137; AVD pp. 115–116; SB p. 248. Bimb, pratibimb, and pratibimban: PS pp. 121, 135. Being manifest with all four aspects: PS p. 119. Imaging, influence, animal recognition, and human evaluation: SB pp. 248–252. Bearer/property distinction: SB pp. 256–257. SB p. 179 describes entities as manifest, communicated, and expressed according to state, motion, plane, and order. Slide 26 develops the human definitions. The study’s Editorial Notes distinguish prakash as Light in the ground-level account, MVD’s imaging formulation and PS p. 119’s heated-body definition. The imaging definition is one context of prakash, not an exhaustive account of the light vocabulary.</w:t>
       </w:r>
     </w:p>
     <w:p>

</xml_diff>